<commit_message>
Kafka-Appell: Rechtschreib-Check (WhatsApp-Fehlertext, Schnipsel) vorgeschaltet, Folien in 27 pt, Diktat entfernt
Co-Authored-By: Claude Opus 5.5 <noreply@anthropic.com>
Claude-Session: https://claude.ai/code/session_01Kzh1oWiqhC6W8oSNq8mKnj
</commit_message>
<xml_diff>
--- a/Deutsch_11/Kafka_Appell/Tafelscript_Kafkas_Appell.docx
+++ b/Deutsch_11/Kafka_Appell/Tafelscript_Kafkas_Appell.docx
@@ -749,7 +749,7 @@
           <w:sz w:val="17"/>
           <w:szCs w:val="17"/>
         </w:rPr>
-        <w:t xml:space="preserve">TAFELSCRIPT · ABLAUF DER STUNDE (45 MIN.)</w:t>
+        <w:t xml:space="preserve">TAFELSCRIPT · ABLAUF DER STUNDE (45 MIN.: 10 RECHTSCHREIBUNG + 35 KAFKA)</w:t>
       </w:r>
     </w:p>
     <w:p>
@@ -781,7 +781,7 @@
           <w:sz w:val="18"/>
           <w:szCs w:val="18"/>
         </w:rPr>
-        <w:t xml:space="preserve">Phasenfolge nach dem Muster der Mentorin: Auszug → Information → Vorarbeit → Analyse mit Visualisierung → Transfer → Reflexion. Jede Phase hat ein eigenes Produkt (rechts: was danach an der Tafel steht).</w:t>
+        <w:t xml:space="preserve">Teil 1 höchstens 10 Minuten – Tempo ist Ziel. Teil 2 nach dem Muster der Mentorin: Auszug → Information → Vorarbeit → Analyse mit Visualisierung → Transfer → Reflexion. Alle Folien in 27 pt.</w:t>
       </w:r>
     </w:p>
     <w:tbl>
@@ -798,9 +798,9 @@
       </w:tblPr>
       <w:tblGrid>
         <w:gridCol w:w="950"/>
-        <w:gridCol w:w="1900"/>
-        <w:gridCol w:w="7000"/>
-        <w:gridCol w:w="3088"/>
+        <w:gridCol w:w="2350"/>
+        <w:gridCol w:w="6650"/>
+        <w:gridCol w:w="2988"/>
         <w:gridCol w:w="2400"/>
       </w:tblGrid>
       <w:tr>
@@ -845,7 +845,7 @@
         </w:tc>
         <w:tc>
           <w:tcPr>
-            <w:tcW w:type="dxa" w:w="1900"/>
+            <w:tcW w:type="dxa" w:w="2350"/>
             <w:tcBorders>
               <w:top w:val="single" w:color="B9C6E8" w:sz="6"/>
               <w:left w:val="single" w:color="B9C6E8" w:sz="6"/>
@@ -880,7 +880,7 @@
         </w:tc>
         <w:tc>
           <w:tcPr>
-            <w:tcW w:type="dxa" w:w="7000"/>
+            <w:tcW w:type="dxa" w:w="6650"/>
             <w:tcBorders>
               <w:top w:val="single" w:color="B9C6E8" w:sz="6"/>
               <w:left w:val="single" w:color="B9C6E8" w:sz="6"/>
@@ -915,7 +915,7 @@
         </w:tc>
         <w:tc>
           <w:tcPr>
-            <w:tcW w:type="dxa" w:w="3088"/>
+            <w:tcW w:type="dxa" w:w="2988"/>
             <w:tcBorders>
               <w:top w:val="single" w:color="B9C6E8" w:sz="6"/>
               <w:left w:val="single" w:color="B9C6E8" w:sz="6"/>
@@ -1019,13 +1019,13 @@
                 <w:sz w:val="18"/>
                 <w:szCs w:val="18"/>
               </w:rPr>
-              <w:t xml:space="preserve">0–4'</w:t>
-            </w:r>
-          </w:p>
-        </w:tc>
-        <w:tc>
-          <w:tcPr>
-            <w:tcW w:type="dxa" w:w="1900"/>
+              <w:t xml:space="preserve">0–2'</w:t>
+            </w:r>
+          </w:p>
+        </w:tc>
+        <w:tc>
+          <w:tcPr>
+            <w:tcW w:type="dxa" w:w="2350"/>
             <w:tcBorders>
               <w:top w:val="single" w:color="B9C6E8" w:sz="6"/>
               <w:left w:val="single" w:color="B9C6E8" w:sz="6"/>
@@ -1054,71 +1054,71 @@
                 <w:sz w:val="18"/>
                 <w:szCs w:val="18"/>
               </w:rPr>
-              <w:t xml:space="preserve">Einstieg</w:t>
-            </w:r>
-          </w:p>
-        </w:tc>
-        <w:tc>
-          <w:tcPr>
-            <w:tcW w:type="dxa" w:w="7000"/>
-            <w:tcBorders>
-              <w:top w:val="single" w:color="B9C6E8" w:sz="6"/>
-              <w:left w:val="single" w:color="B9C6E8" w:sz="6"/>
-              <w:bottom w:val="single" w:color="B9C6E8" w:sz="6"/>
-              <w:right w:val="single" w:color="B9C6E8" w:sz="6"/>
-            </w:tcBorders>
-            <w:tcMar>
-              <w:top w:type="dxa" w:w="60"/>
-              <w:left w:type="dxa" w:w="120"/>
-              <w:bottom w:type="dxa" w:w="60"/>
-              <w:right w:type="dxa" w:w="120"/>
-            </w:tcMar>
-            <w:vAlign w:val="top"/>
-          </w:tcPr>
-          <w:p>
-            <w:pPr>
-              <w:spacing w:after="0" w:before="0"/>
-            </w:pPr>
-            <w:r>
-              <w:rPr>
-                <w:rFonts w:ascii="Calibri" w:cs="Calibri" w:eastAsia="Calibri" w:hAnsi="Calibri"/>
-                <w:color w:val="000000"/>
-                <w:sz w:val="18"/>
-                <w:szCs w:val="18"/>
-              </w:rPr>
-              <w:t xml:space="preserve">Kontext vom Arbeitsblatt vorlesen, dann den Auszug (Folie 1, Klasse liest mit). Impuls (Folie 2): „Worum bittet Kafka seinen Vater?“ Zwei, drei spontane Antworten – nicht bewerten.</w:t>
-            </w:r>
-          </w:p>
-        </w:tc>
-        <w:tc>
-          <w:tcPr>
-            <w:tcW w:type="dxa" w:w="3088"/>
-            <w:tcBorders>
-              <w:top w:val="single" w:color="B9C6E8" w:sz="6"/>
-              <w:left w:val="single" w:color="B9C6E8" w:sz="6"/>
-              <w:bottom w:val="single" w:color="B9C6E8" w:sz="6"/>
-              <w:right w:val="single" w:color="B9C6E8" w:sz="6"/>
-            </w:tcBorders>
-            <w:tcMar>
-              <w:top w:type="dxa" w:w="60"/>
-              <w:left w:type="dxa" w:w="120"/>
-              <w:bottom w:type="dxa" w:w="60"/>
-              <w:right w:type="dxa" w:w="120"/>
-            </w:tcMar>
-            <w:vAlign w:val="top"/>
-          </w:tcPr>
-          <w:p>
-            <w:pPr>
-              <w:spacing w:after="0" w:before="0"/>
-            </w:pPr>
-            <w:r>
-              <w:rPr>
-                <w:rFonts w:ascii="Calibri" w:cs="Calibri" w:eastAsia="Calibri" w:hAnsi="Calibri"/>
-                <w:color w:val="000000"/>
-                <w:sz w:val="18"/>
-                <w:szCs w:val="18"/>
-              </w:rPr>
-              <w:t xml:space="preserve">① Vermutungen</w:t>
+              <w:t xml:space="preserve">Rechtschreibung: Instruktion</w:t>
+            </w:r>
+          </w:p>
+        </w:tc>
+        <w:tc>
+          <w:tcPr>
+            <w:tcW w:type="dxa" w:w="6650"/>
+            <w:tcBorders>
+              <w:top w:val="single" w:color="B9C6E8" w:sz="6"/>
+              <w:left w:val="single" w:color="B9C6E8" w:sz="6"/>
+              <w:bottom w:val="single" w:color="B9C6E8" w:sz="6"/>
+              <w:right w:val="single" w:color="B9C6E8" w:sz="6"/>
+            </w:tcBorders>
+            <w:tcMar>
+              <w:top w:type="dxa" w:w="60"/>
+              <w:left w:type="dxa" w:w="120"/>
+              <w:bottom w:type="dxa" w:w="60"/>
+              <w:right w:type="dxa" w:w="120"/>
+            </w:tcMar>
+            <w:vAlign w:val="top"/>
+          </w:tcPr>
+          <w:p>
+            <w:pPr>
+              <w:spacing w:after="0" w:before="0"/>
+            </w:pPr>
+            <w:r>
+              <w:rPr>
+                <w:rFonts w:ascii="Calibri" w:cs="Calibri" w:eastAsia="Calibri" w:hAnsi="Calibri"/>
+                <w:color w:val="000000"/>
+                <w:sz w:val="18"/>
+                <w:szCs w:val="18"/>
+              </w:rPr>
+              <w:t xml:space="preserve">Schnipsel austeilen. „In euren Texten passieren immer dieselben zwei Fehler – nicht, weil ihr die Regel nicht kennt, sondern weil ihr nicht darauf achtet.“ Regel 1 und 2 zeigen (Folie 2–3), je ein Beispiel laut prüfen.</w:t>
+            </w:r>
+          </w:p>
+        </w:tc>
+        <w:tc>
+          <w:tcPr>
+            <w:tcW w:type="dxa" w:w="2988"/>
+            <w:tcBorders>
+              <w:top w:val="single" w:color="B9C6E8" w:sz="6"/>
+              <w:left w:val="single" w:color="B9C6E8" w:sz="6"/>
+              <w:bottom w:val="single" w:color="B9C6E8" w:sz="6"/>
+              <w:right w:val="single" w:color="B9C6E8" w:sz="6"/>
+            </w:tcBorders>
+            <w:tcMar>
+              <w:top w:type="dxa" w:w="60"/>
+              <w:left w:type="dxa" w:w="120"/>
+              <w:bottom w:type="dxa" w:w="60"/>
+              <w:right w:type="dxa" w:w="120"/>
+            </w:tcMar>
+            <w:vAlign w:val="top"/>
+          </w:tcPr>
+          <w:p>
+            <w:pPr>
+              <w:spacing w:after="0" w:before="0"/>
+            </w:pPr>
+            <w:r>
+              <w:rPr>
+                <w:rFonts w:ascii="Calibri" w:cs="Calibri" w:eastAsia="Calibri" w:hAnsi="Calibri"/>
+                <w:color w:val="000000"/>
+                <w:sz w:val="18"/>
+                <w:szCs w:val="18"/>
+              </w:rPr>
+              <w:t xml:space="preserve">–</w:t>
             </w:r>
           </w:p>
         </w:tc>
@@ -1150,7 +1150,7 @@
                 <w:sz w:val="17"/>
                 <w:szCs w:val="17"/>
               </w:rPr>
-              <w:t xml:space="preserve">AB, Folie 1–2</w:t>
+              <w:t xml:space="preserve">Schnipsel, Folie 1–3</w:t>
             </w:r>
           </w:p>
         </w:tc>
@@ -1190,13 +1190,13 @@
                 <w:sz w:val="18"/>
                 <w:szCs w:val="18"/>
               </w:rPr>
-              <w:t xml:space="preserve">4–9'</w:t>
-            </w:r>
-          </w:p>
-        </w:tc>
-        <w:tc>
-          <w:tcPr>
-            <w:tcW w:type="dxa" w:w="1900"/>
+              <w:t xml:space="preserve">2–4'</w:t>
+            </w:r>
+          </w:p>
+        </w:tc>
+        <w:tc>
+          <w:tcPr>
+            <w:tcW w:type="dxa" w:w="2350"/>
             <w:tcBorders>
               <w:top w:val="single" w:color="B9C6E8" w:sz="6"/>
               <w:left w:val="single" w:color="B9C6E8" w:sz="6"/>
@@ -1225,45 +1225,45 @@
                 <w:sz w:val="18"/>
                 <w:szCs w:val="18"/>
               </w:rPr>
-              <w:t xml:space="preserve">Information: Mini-Diktat</w:t>
-            </w:r>
-          </w:p>
-        </w:tc>
-        <w:tc>
-          <w:tcPr>
-            <w:tcW w:type="dxa" w:w="7000"/>
-            <w:tcBorders>
-              <w:top w:val="single" w:color="B9C6E8" w:sz="6"/>
-              <w:left w:val="single" w:color="B9C6E8" w:sz="6"/>
-              <w:bottom w:val="single" w:color="B9C6E8" w:sz="6"/>
-              <w:right w:val="single" w:color="B9C6E8" w:sz="6"/>
-            </w:tcBorders>
-            <w:tcMar>
-              <w:top w:type="dxa" w:w="60"/>
-              <w:left w:type="dxa" w:w="120"/>
-              <w:bottom w:type="dxa" w:w="60"/>
-              <w:right w:type="dxa" w:w="120"/>
-            </w:tcMar>
-            <w:vAlign w:val="top"/>
-          </w:tcPr>
-          <w:p>
-            <w:pPr>
-              <w:spacing w:after="0" w:before="0"/>
-            </w:pPr>
-            <w:r>
-              <w:rPr>
-                <w:rFonts w:ascii="Calibri" w:cs="Calibri" w:eastAsia="Calibri" w:hAnsi="Calibri"/>
-                <w:color w:val="000000"/>
-                <w:sz w:val="18"/>
-                <w:szCs w:val="18"/>
-              </w:rPr>
-              <w:t xml:space="preserve">Folie 3 steht. Ganz vorlesen, Satz für Satz diktieren (Pausen an ‖), noch einmal vorlesen. Selbstkontrolle mit Folie 4, Fehler zählen, Stolperstellen kurz zeigen.</w:t>
-            </w:r>
-          </w:p>
-        </w:tc>
-        <w:tc>
-          <w:tcPr>
-            <w:tcW w:type="dxa" w:w="3088"/>
+              <w:t xml:space="preserve">Vormachen</w:t>
+            </w:r>
+          </w:p>
+        </w:tc>
+        <w:tc>
+          <w:tcPr>
+            <w:tcW w:type="dxa" w:w="6650"/>
+            <w:tcBorders>
+              <w:top w:val="single" w:color="B9C6E8" w:sz="6"/>
+              <w:left w:val="single" w:color="B9C6E8" w:sz="6"/>
+              <w:bottom w:val="single" w:color="B9C6E8" w:sz="6"/>
+              <w:right w:val="single" w:color="B9C6E8" w:sz="6"/>
+            </w:tcBorders>
+            <w:tcMar>
+              <w:top w:type="dxa" w:w="60"/>
+              <w:left w:type="dxa" w:w="120"/>
+              <w:bottom w:type="dxa" w:w="60"/>
+              <w:right w:type="dxa" w:w="120"/>
+            </w:tcMar>
+            <w:vAlign w:val="top"/>
+          </w:tcPr>
+          <w:p>
+            <w:pPr>
+              <w:spacing w:after="0" w:before="0"/>
+            </w:pPr>
+            <w:r>
+              <w:rPr>
+                <w:rFonts w:ascii="Calibri" w:cs="Calibri" w:eastAsia="Calibri" w:hAnsi="Calibri"/>
+                <w:color w:val="000000"/>
+                <w:sz w:val="18"/>
+                <w:szCs w:val="18"/>
+              </w:rPr>
+              <w:t xml:space="preserve">Nachricht 1 laut denkend korrigieren (Folie 4, dann 5): Artikelprobe, Verb am Ende → Komma. Siehe nächste Seite.</w:t>
+            </w:r>
+          </w:p>
+        </w:tc>
+        <w:tc>
+          <w:tcPr>
+            <w:tcW w:type="dxa" w:w="2988"/>
             <w:tcBorders>
               <w:top w:val="single" w:color="B9C6E8" w:sz="6"/>
               <w:left w:val="single" w:color="B9C6E8" w:sz="6"/>
@@ -1321,7 +1321,7 @@
                 <w:sz w:val="17"/>
                 <w:szCs w:val="17"/>
               </w:rPr>
-              <w:t xml:space="preserve">Vorlesefassung, Folie 3–4</w:t>
+              <w:t xml:space="preserve">Folie 4–5</w:t>
             </w:r>
           </w:p>
         </w:tc>
@@ -1361,13 +1361,13 @@
                 <w:sz w:val="18"/>
                 <w:szCs w:val="18"/>
               </w:rPr>
-              <w:t xml:space="preserve">9–13'</w:t>
-            </w:r>
-          </w:p>
-        </w:tc>
-        <w:tc>
-          <w:tcPr>
-            <w:tcW w:type="dxa" w:w="1900"/>
+              <w:t xml:space="preserve">4–8'</w:t>
+            </w:r>
+          </w:p>
+        </w:tc>
+        <w:tc>
+          <w:tcPr>
+            <w:tcW w:type="dxa" w:w="2350"/>
             <w:tcBorders>
               <w:top w:val="single" w:color="B9C6E8" w:sz="6"/>
               <w:left w:val="single" w:color="B9C6E8" w:sz="6"/>
@@ -1396,71 +1396,71 @@
                 <w:sz w:val="18"/>
                 <w:szCs w:val="18"/>
               </w:rPr>
-              <w:t xml:space="preserve">Vorarbeit (allein)</w:t>
-            </w:r>
-          </w:p>
-        </w:tc>
-        <w:tc>
-          <w:tcPr>
-            <w:tcW w:type="dxa" w:w="7000"/>
-            <w:tcBorders>
-              <w:top w:val="single" w:color="B9C6E8" w:sz="6"/>
-              <w:left w:val="single" w:color="B9C6E8" w:sz="6"/>
-              <w:bottom w:val="single" w:color="B9C6E8" w:sz="6"/>
-              <w:right w:val="single" w:color="B9C6E8" w:sz="6"/>
-            </w:tcBorders>
-            <w:tcMar>
-              <w:top w:type="dxa" w:w="60"/>
-              <w:left w:type="dxa" w:w="120"/>
-              <w:bottom w:type="dxa" w:w="60"/>
-              <w:right w:type="dxa" w:w="120"/>
-            </w:tcMar>
-            <w:vAlign w:val="top"/>
-          </w:tcPr>
-          <w:p>
-            <w:pPr>
-              <w:spacing w:after="0" w:before="0"/>
-            </w:pPr>
-            <w:r>
-              <w:rPr>
-                <w:rFonts w:ascii="Calibri" w:cs="Calibri" w:eastAsia="Calibri" w:hAnsi="Calibri"/>
-                <w:color w:val="000000"/>
-                <w:sz w:val="18"/>
-                <w:szCs w:val="18"/>
-              </w:rPr>
-              <w:t xml:space="preserve">Auftrag 1 (Folie 5): Kernbotschaft in einem Satz, „Kafka bittet seinen Vater, …“. Zwei Sätze vorlesen lassen, den treffendsten anschreiben. Impuls: „Stimmt das mit unseren Vermutungen überein?“</w:t>
-            </w:r>
-          </w:p>
-        </w:tc>
-        <w:tc>
-          <w:tcPr>
-            <w:tcW w:type="dxa" w:w="3088"/>
-            <w:tcBorders>
-              <w:top w:val="single" w:color="B9C6E8" w:sz="6"/>
-              <w:left w:val="single" w:color="B9C6E8" w:sz="6"/>
-              <w:bottom w:val="single" w:color="B9C6E8" w:sz="6"/>
-              <w:right w:val="single" w:color="B9C6E8" w:sz="6"/>
-            </w:tcBorders>
-            <w:tcMar>
-              <w:top w:type="dxa" w:w="60"/>
-              <w:left w:type="dxa" w:w="120"/>
-              <w:bottom w:type="dxa" w:w="60"/>
-              <w:right w:type="dxa" w:w="120"/>
-            </w:tcMar>
-            <w:vAlign w:val="top"/>
-          </w:tcPr>
-          <w:p>
-            <w:pPr>
-              <w:spacing w:after="0" w:before="0"/>
-            </w:pPr>
-            <w:r>
-              <w:rPr>
-                <w:rFonts w:ascii="Calibri" w:cs="Calibri" w:eastAsia="Calibri" w:hAnsi="Calibri"/>
-                <w:color w:val="000000"/>
-                <w:sz w:val="18"/>
-                <w:szCs w:val="18"/>
-              </w:rPr>
-              <w:t xml:space="preserve">② Kernbotschaft</w:t>
+              <w:t xml:space="preserve">Korrigieren (allein)</w:t>
+            </w:r>
+          </w:p>
+        </w:tc>
+        <w:tc>
+          <w:tcPr>
+            <w:tcW w:type="dxa" w:w="6650"/>
+            <w:tcBorders>
+              <w:top w:val="single" w:color="B9C6E8" w:sz="6"/>
+              <w:left w:val="single" w:color="B9C6E8" w:sz="6"/>
+              <w:bottom w:val="single" w:color="B9C6E8" w:sz="6"/>
+              <w:right w:val="single" w:color="B9C6E8" w:sz="6"/>
+            </w:tcBorders>
+            <w:tcMar>
+              <w:top w:type="dxa" w:w="60"/>
+              <w:left w:type="dxa" w:w="120"/>
+              <w:bottom w:type="dxa" w:w="60"/>
+              <w:right w:type="dxa" w:w="120"/>
+            </w:tcMar>
+            <w:vAlign w:val="top"/>
+          </w:tcPr>
+          <w:p>
+            <w:pPr>
+              <w:spacing w:after="0" w:before="0"/>
+            </w:pPr>
+            <w:r>
+              <w:rPr>
+                <w:rFonts w:ascii="Calibri" w:cs="Calibri" w:eastAsia="Calibri" w:hAnsi="Calibri"/>
+                <w:color w:val="000000"/>
+                <w:sz w:val="18"/>
+                <w:szCs w:val="18"/>
+              </w:rPr>
+              <w:t xml:space="preserve">Nachrichten 2–6 auf dem Schnipsel korrigieren, Timer 4 Min. sichtbar. Nicht helfen – die Regeln stehen auf dem Schnipsel. Wer fertig ist, zählt seine Fehler.</w:t>
+            </w:r>
+          </w:p>
+        </w:tc>
+        <w:tc>
+          <w:tcPr>
+            <w:tcW w:type="dxa" w:w="2988"/>
+            <w:tcBorders>
+              <w:top w:val="single" w:color="B9C6E8" w:sz="6"/>
+              <w:left w:val="single" w:color="B9C6E8" w:sz="6"/>
+              <w:bottom w:val="single" w:color="B9C6E8" w:sz="6"/>
+              <w:right w:val="single" w:color="B9C6E8" w:sz="6"/>
+            </w:tcBorders>
+            <w:tcMar>
+              <w:top w:type="dxa" w:w="60"/>
+              <w:left w:type="dxa" w:w="120"/>
+              <w:bottom w:type="dxa" w:w="60"/>
+              <w:right w:type="dxa" w:w="120"/>
+            </w:tcMar>
+            <w:vAlign w:val="top"/>
+          </w:tcPr>
+          <w:p>
+            <w:pPr>
+              <w:spacing w:after="0" w:before="0"/>
+            </w:pPr>
+            <w:r>
+              <w:rPr>
+                <w:rFonts w:ascii="Calibri" w:cs="Calibri" w:eastAsia="Calibri" w:hAnsi="Calibri"/>
+                <w:color w:val="000000"/>
+                <w:sz w:val="18"/>
+                <w:szCs w:val="18"/>
+              </w:rPr>
+              <w:t xml:space="preserve">–</w:t>
             </w:r>
           </w:p>
         </w:tc>
@@ -1492,7 +1492,7 @@
                 <w:sz w:val="17"/>
                 <w:szCs w:val="17"/>
               </w:rPr>
-              <w:t xml:space="preserve">Folie 5, Hefter</w:t>
+              <w:t xml:space="preserve">Folie 6, Schnipsel</w:t>
             </w:r>
           </w:p>
         </w:tc>
@@ -1532,13 +1532,13 @@
                 <w:sz w:val="18"/>
                 <w:szCs w:val="18"/>
               </w:rPr>
-              <w:t xml:space="preserve">13–23'</w:t>
-            </w:r>
-          </w:p>
-        </w:tc>
-        <w:tc>
-          <w:tcPr>
-            <w:tcW w:type="dxa" w:w="1900"/>
+              <w:t xml:space="preserve">8–10'</w:t>
+            </w:r>
+          </w:p>
+        </w:tc>
+        <w:tc>
+          <w:tcPr>
+            <w:tcW w:type="dxa" w:w="2350"/>
             <w:tcBorders>
               <w:top w:val="single" w:color="B9C6E8" w:sz="6"/>
               <w:left w:val="single" w:color="B9C6E8" w:sz="6"/>
@@ -1567,71 +1567,71 @@
                 <w:sz w:val="18"/>
                 <w:szCs w:val="18"/>
               </w:rPr>
-              <w:t xml:space="preserve">Analyse (6' allein, 4' Gespräch)</w:t>
-            </w:r>
-          </w:p>
-        </w:tc>
-        <w:tc>
-          <w:tcPr>
-            <w:tcW w:type="dxa" w:w="7000"/>
-            <w:tcBorders>
-              <w:top w:val="single" w:color="B9C6E8" w:sz="6"/>
-              <w:left w:val="single" w:color="B9C6E8" w:sz="6"/>
-              <w:bottom w:val="single" w:color="B9C6E8" w:sz="6"/>
-              <w:right w:val="single" w:color="B9C6E8" w:sz="6"/>
-            </w:tcBorders>
-            <w:tcMar>
-              <w:top w:type="dxa" w:w="60"/>
-              <w:left w:type="dxa" w:w="120"/>
-              <w:bottom w:type="dxa" w:w="60"/>
-              <w:right w:type="dxa" w:w="120"/>
-            </w:tcMar>
-            <w:vAlign w:val="top"/>
-          </w:tcPr>
-          <w:p>
-            <w:pPr>
-              <w:spacing w:after="0" w:before="0"/>
-            </w:pPr>
-            <w:r>
-              <w:rPr>
-                <w:rFonts w:ascii="Calibri" w:cs="Calibri" w:eastAsia="Calibri" w:hAnsi="Calibri"/>
-                <w:color w:val="000000"/>
-                <w:sz w:val="18"/>
-                <w:szCs w:val="18"/>
-              </w:rPr>
-              <w:t xml:space="preserve">Auftrag 2 (Folie 6): drei Leitfragen, jeweils offen oder verdeckt? Danach Frage für Frage im Unterrichtsgespräch, Ergebnisse ins Quadrat. Impulse: „Welches Wort zeigt, dass Kafka etwas will?“ · „Was soll der Vater mit ‚freundliches Wort, Hand, Blick‘ anfangen?“ · „Warum betont Kafka, dass der Vater keine Schuld hat?“ → Furcht.</w:t>
-            </w:r>
-          </w:p>
-        </w:tc>
-        <w:tc>
-          <w:tcPr>
-            <w:tcW w:type="dxa" w:w="3088"/>
-            <w:tcBorders>
-              <w:top w:val="single" w:color="B9C6E8" w:sz="6"/>
-              <w:left w:val="single" w:color="B9C6E8" w:sz="6"/>
-              <w:bottom w:val="single" w:color="B9C6E8" w:sz="6"/>
-              <w:right w:val="single" w:color="B9C6E8" w:sz="6"/>
-            </w:tcBorders>
-            <w:tcMar>
-              <w:top w:type="dxa" w:w="60"/>
-              <w:left w:type="dxa" w:w="120"/>
-              <w:bottom w:type="dxa" w:w="60"/>
-              <w:right w:type="dxa" w:w="120"/>
-            </w:tcMar>
-            <w:vAlign w:val="top"/>
-          </w:tcPr>
-          <w:p>
-            <w:pPr>
-              <w:spacing w:after="0" w:before="0"/>
-            </w:pPr>
-            <w:r>
-              <w:rPr>
-                <w:rFonts w:ascii="Calibri" w:cs="Calibri" w:eastAsia="Calibri" w:hAnsi="Calibri"/>
-                <w:color w:val="000000"/>
-                <w:sz w:val="18"/>
-                <w:szCs w:val="18"/>
-              </w:rPr>
-              <w:t xml:space="preserve">③ Quadrat, Appell zuletzt und groß</w:t>
+              <w:t xml:space="preserve">Lösung im Gespräch</w:t>
+            </w:r>
+          </w:p>
+        </w:tc>
+        <w:tc>
+          <w:tcPr>
+            <w:tcW w:type="dxa" w:w="6650"/>
+            <w:tcBorders>
+              <w:top w:val="single" w:color="B9C6E8" w:sz="6"/>
+              <w:left w:val="single" w:color="B9C6E8" w:sz="6"/>
+              <w:bottom w:val="single" w:color="B9C6E8" w:sz="6"/>
+              <w:right w:val="single" w:color="B9C6E8" w:sz="6"/>
+            </w:tcBorders>
+            <w:tcMar>
+              <w:top w:type="dxa" w:w="60"/>
+              <w:left w:type="dxa" w:w="120"/>
+              <w:bottom w:type="dxa" w:w="60"/>
+              <w:right w:type="dxa" w:w="120"/>
+            </w:tcMar>
+            <w:vAlign w:val="top"/>
+          </w:tcPr>
+          <w:p>
+            <w:pPr>
+              <w:spacing w:after="0" w:before="0"/>
+            </w:pPr>
+            <w:r>
+              <w:rPr>
+                <w:rFonts w:ascii="Calibri" w:cs="Calibri" w:eastAsia="Calibri" w:hAnsi="Calibri"/>
+                <w:color w:val="000000"/>
+                <w:sz w:val="18"/>
+                <w:szCs w:val="18"/>
+              </w:rPr>
+              <w:t xml:space="preserve">Klasse nennt die Fehler je Nachricht und begründet (Artikelprobe / Verb am Ende), dann Folie zeigen. Abfrage: „Wer hat mindestens 11 von 14?“ Überleitung: „In Nachricht 2 ging es schon um Kafka.“</w:t>
+            </w:r>
+          </w:p>
+        </w:tc>
+        <w:tc>
+          <w:tcPr>
+            <w:tcW w:type="dxa" w:w="2988"/>
+            <w:tcBorders>
+              <w:top w:val="single" w:color="B9C6E8" w:sz="6"/>
+              <w:left w:val="single" w:color="B9C6E8" w:sz="6"/>
+              <w:bottom w:val="single" w:color="B9C6E8" w:sz="6"/>
+              <w:right w:val="single" w:color="B9C6E8" w:sz="6"/>
+            </w:tcBorders>
+            <w:tcMar>
+              <w:top w:type="dxa" w:w="60"/>
+              <w:left w:type="dxa" w:w="120"/>
+              <w:bottom w:type="dxa" w:w="60"/>
+              <w:right w:type="dxa" w:w="120"/>
+            </w:tcMar>
+            <w:vAlign w:val="top"/>
+          </w:tcPr>
+          <w:p>
+            <w:pPr>
+              <w:spacing w:after="0" w:before="0"/>
+            </w:pPr>
+            <w:r>
+              <w:rPr>
+                <w:rFonts w:ascii="Calibri" w:cs="Calibri" w:eastAsia="Calibri" w:hAnsi="Calibri"/>
+                <w:color w:val="000000"/>
+                <w:sz w:val="18"/>
+                <w:szCs w:val="18"/>
+              </w:rPr>
+              <w:t xml:space="preserve">–</w:t>
             </w:r>
           </w:p>
         </w:tc>
@@ -1663,7 +1663,7 @@
                 <w:sz w:val="17"/>
                 <w:szCs w:val="17"/>
               </w:rPr>
-              <w:t xml:space="preserve">Folie 6, Hefter</w:t>
+              <w:t xml:space="preserve">Folie 7–8</w:t>
             </w:r>
           </w:p>
         </w:tc>
@@ -1703,13 +1703,13 @@
                 <w:sz w:val="18"/>
                 <w:szCs w:val="18"/>
               </w:rPr>
-              <w:t xml:space="preserve">23–38'</w:t>
-            </w:r>
-          </w:p>
-        </w:tc>
-        <w:tc>
-          <w:tcPr>
-            <w:tcW w:type="dxa" w:w="1900"/>
+              <w:t xml:space="preserve">10–13'</w:t>
+            </w:r>
+          </w:p>
+        </w:tc>
+        <w:tc>
+          <w:tcPr>
+            <w:tcW w:type="dxa" w:w="2350"/>
             <w:tcBorders>
               <w:top w:val="single" w:color="B9C6E8" w:sz="6"/>
               <w:left w:val="single" w:color="B9C6E8" w:sz="6"/>
@@ -1738,71 +1738,71 @@
                 <w:sz w:val="18"/>
                 <w:szCs w:val="18"/>
               </w:rPr>
-              <w:t xml:space="preserve">Transfer (allein)</w:t>
-            </w:r>
-          </w:p>
-        </w:tc>
-        <w:tc>
-          <w:tcPr>
-            <w:tcW w:type="dxa" w:w="7000"/>
-            <w:tcBorders>
-              <w:top w:val="single" w:color="B9C6E8" w:sz="6"/>
-              <w:left w:val="single" w:color="B9C6E8" w:sz="6"/>
-              <w:bottom w:val="single" w:color="B9C6E8" w:sz="6"/>
-              <w:right w:val="single" w:color="B9C6E8" w:sz="6"/>
-            </w:tcBorders>
-            <w:tcMar>
-              <w:top w:type="dxa" w:w="60"/>
-              <w:left w:type="dxa" w:w="120"/>
-              <w:bottom w:type="dxa" w:w="60"/>
-              <w:right w:type="dxa" w:w="120"/>
-            </w:tcMar>
-            <w:vAlign w:val="top"/>
-          </w:tcPr>
-          <w:p>
-            <w:pPr>
-              <w:spacing w:after="0" w:before="0"/>
-            </w:pPr>
-            <w:r>
-              <w:rPr>
-                <w:rFonts w:ascii="Calibri" w:cs="Calibri" w:eastAsia="Calibri" w:hAnsi="Calibri"/>
-                <w:color w:val="000000"/>
-                <w:sz w:val="18"/>
-                <w:szCs w:val="18"/>
-              </w:rPr>
-              <w:t xml:space="preserve">Überleitung: „Max Brods Brief hat gewirkt – der Vater hört zu. Jetzt spricht Franz selbst, und zwar offen.“ Auftrag und Kriterien (Folie 7 bzw. Whiteboard-PDF). Kriterien an die Tafel. Timer 15 Min.; herumgehen, bei Bedarf auf die Ich-Botschaft hinweisen.</w:t>
-            </w:r>
-          </w:p>
-        </w:tc>
-        <w:tc>
-          <w:tcPr>
-            <w:tcW w:type="dxa" w:w="3088"/>
-            <w:tcBorders>
-              <w:top w:val="single" w:color="B9C6E8" w:sz="6"/>
-              <w:left w:val="single" w:color="B9C6E8" w:sz="6"/>
-              <w:bottom w:val="single" w:color="B9C6E8" w:sz="6"/>
-              <w:right w:val="single" w:color="B9C6E8" w:sz="6"/>
-            </w:tcBorders>
-            <w:tcMar>
-              <w:top w:type="dxa" w:w="60"/>
-              <w:left w:type="dxa" w:w="120"/>
-              <w:bottom w:type="dxa" w:w="60"/>
-              <w:right w:type="dxa" w:w="120"/>
-            </w:tcMar>
-            <w:vAlign w:val="top"/>
-          </w:tcPr>
-          <w:p>
-            <w:pPr>
-              <w:spacing w:after="0" w:before="0"/>
-            </w:pPr>
-            <w:r>
-              <w:rPr>
-                <w:rFonts w:ascii="Calibri" w:cs="Calibri" w:eastAsia="Calibri" w:hAnsi="Calibri"/>
-                <w:color w:val="000000"/>
-                <w:sz w:val="18"/>
-                <w:szCs w:val="18"/>
-              </w:rPr>
-              <w:t xml:space="preserve">④ Kriterien</w:t>
+              <w:t xml:space="preserve">Kafka: Einstieg</w:t>
+            </w:r>
+          </w:p>
+        </w:tc>
+        <w:tc>
+          <w:tcPr>
+            <w:tcW w:type="dxa" w:w="6650"/>
+            <w:tcBorders>
+              <w:top w:val="single" w:color="B9C6E8" w:sz="6"/>
+              <w:left w:val="single" w:color="B9C6E8" w:sz="6"/>
+              <w:bottom w:val="single" w:color="B9C6E8" w:sz="6"/>
+              <w:right w:val="single" w:color="B9C6E8" w:sz="6"/>
+            </w:tcBorders>
+            <w:tcMar>
+              <w:top w:type="dxa" w:w="60"/>
+              <w:left w:type="dxa" w:w="120"/>
+              <w:bottom w:type="dxa" w:w="60"/>
+              <w:right w:type="dxa" w:w="120"/>
+            </w:tcMar>
+            <w:vAlign w:val="top"/>
+          </w:tcPr>
+          <w:p>
+            <w:pPr>
+              <w:spacing w:after="0" w:before="0"/>
+            </w:pPr>
+            <w:r>
+              <w:rPr>
+                <w:rFonts w:ascii="Calibri" w:cs="Calibri" w:eastAsia="Calibri" w:hAnsi="Calibri"/>
+                <w:color w:val="000000"/>
+                <w:sz w:val="18"/>
+                <w:szCs w:val="18"/>
+              </w:rPr>
+              <w:t xml:space="preserve">Kontext vom Arbeitsblatt vorlesen, dann den Auszug (Folie 9, AB mit Zeilennummern). Impuls (Folie 10): „Worum bittet Kafka seinen Vater?“</w:t>
+            </w:r>
+          </w:p>
+        </w:tc>
+        <w:tc>
+          <w:tcPr>
+            <w:tcW w:type="dxa" w:w="2988"/>
+            <w:tcBorders>
+              <w:top w:val="single" w:color="B9C6E8" w:sz="6"/>
+              <w:left w:val="single" w:color="B9C6E8" w:sz="6"/>
+              <w:bottom w:val="single" w:color="B9C6E8" w:sz="6"/>
+              <w:right w:val="single" w:color="B9C6E8" w:sz="6"/>
+            </w:tcBorders>
+            <w:tcMar>
+              <w:top w:type="dxa" w:w="60"/>
+              <w:left w:type="dxa" w:w="120"/>
+              <w:bottom w:type="dxa" w:w="60"/>
+              <w:right w:type="dxa" w:w="120"/>
+            </w:tcMar>
+            <w:vAlign w:val="top"/>
+          </w:tcPr>
+          <w:p>
+            <w:pPr>
+              <w:spacing w:after="0" w:before="0"/>
+            </w:pPr>
+            <w:r>
+              <w:rPr>
+                <w:rFonts w:ascii="Calibri" w:cs="Calibri" w:eastAsia="Calibri" w:hAnsi="Calibri"/>
+                <w:color w:val="000000"/>
+                <w:sz w:val="18"/>
+                <w:szCs w:val="18"/>
+              </w:rPr>
+              <w:t xml:space="preserve">① Vermutungen</w:t>
             </w:r>
           </w:p>
         </w:tc>
@@ -1834,7 +1834,7 @@
                 <w:sz w:val="17"/>
                 <w:szCs w:val="17"/>
               </w:rPr>
-              <w:t xml:space="preserve">Folie 7 / Whiteboard, Hefter</w:t>
+              <w:t xml:space="preserve">AB, Folie 9–10</w:t>
             </w:r>
           </w:p>
         </w:tc>
@@ -1874,13 +1874,13 @@
                 <w:sz w:val="18"/>
                 <w:szCs w:val="18"/>
               </w:rPr>
-              <w:t xml:space="preserve">38–45'</w:t>
-            </w:r>
-          </w:p>
-        </w:tc>
-        <w:tc>
-          <w:tcPr>
-            <w:tcW w:type="dxa" w:w="1900"/>
+              <w:t xml:space="preserve">13–15'</w:t>
+            </w:r>
+          </w:p>
+        </w:tc>
+        <w:tc>
+          <w:tcPr>
+            <w:tcW w:type="dxa" w:w="2350"/>
             <w:tcBorders>
               <w:top w:val="single" w:color="B9C6E8" w:sz="6"/>
               <w:left w:val="single" w:color="B9C6E8" w:sz="6"/>
@@ -1909,71 +1909,71 @@
                 <w:sz w:val="18"/>
                 <w:szCs w:val="18"/>
               </w:rPr>
-              <w:t xml:space="preserve">Vortrag und Reflexion</w:t>
-            </w:r>
-          </w:p>
-        </w:tc>
-        <w:tc>
-          <w:tcPr>
-            <w:tcW w:type="dxa" w:w="7000"/>
-            <w:tcBorders>
-              <w:top w:val="single" w:color="B9C6E8" w:sz="6"/>
-              <w:left w:val="single" w:color="B9C6E8" w:sz="6"/>
-              <w:bottom w:val="single" w:color="B9C6E8" w:sz="6"/>
-              <w:right w:val="single" w:color="B9C6E8" w:sz="6"/>
-            </w:tcBorders>
-            <w:tcMar>
-              <w:top w:type="dxa" w:w="60"/>
-              <w:left w:type="dxa" w:w="120"/>
-              <w:bottom w:type="dxa" w:w="60"/>
-              <w:right w:type="dxa" w:w="120"/>
-            </w:tcMar>
-            <w:vAlign w:val="top"/>
-          </w:tcPr>
-          <w:p>
-            <w:pPr>
-              <w:spacing w:after="0" w:before="0"/>
-            </w:pPr>
-            <w:r>
-              <w:rPr>
-                <w:rFonts w:ascii="Calibri" w:cs="Calibri" w:eastAsia="Calibri" w:hAnsi="Calibri"/>
-                <w:color w:val="000000"/>
-                <w:sz w:val="18"/>
-                <w:szCs w:val="18"/>
-              </w:rPr>
-              <w:t xml:space="preserve">Zwei Reden ohne Unterbrechung (Folie 8: die anderen haken ab). Auswertung Kriterium für Kriterium. Reflexion (Folie 9): „Warum hat Kafka im Brief nicht so gesprochen? Welche Fassung hätte der Vater eher gehört?“ Merksatz anschreiben. Wer nicht fertig ist, schreibt nächste Stunde weiter – keine Hausaufgabe.</w:t>
-            </w:r>
-          </w:p>
-        </w:tc>
-        <w:tc>
-          <w:tcPr>
-            <w:tcW w:type="dxa" w:w="3088"/>
-            <w:tcBorders>
-              <w:top w:val="single" w:color="B9C6E8" w:sz="6"/>
-              <w:left w:val="single" w:color="B9C6E8" w:sz="6"/>
-              <w:bottom w:val="single" w:color="B9C6E8" w:sz="6"/>
-              <w:right w:val="single" w:color="B9C6E8" w:sz="6"/>
-            </w:tcBorders>
-            <w:tcMar>
-              <w:top w:type="dxa" w:w="60"/>
-              <w:left w:type="dxa" w:w="120"/>
-              <w:bottom w:type="dxa" w:w="60"/>
-              <w:right w:type="dxa" w:w="120"/>
-            </w:tcMar>
-            <w:vAlign w:val="top"/>
-          </w:tcPr>
-          <w:p>
-            <w:pPr>
-              <w:spacing w:after="0" w:before="0"/>
-            </w:pPr>
-            <w:r>
-              <w:rPr>
-                <w:rFonts w:ascii="Calibri" w:cs="Calibri" w:eastAsia="Calibri" w:hAnsi="Calibri"/>
-                <w:color w:val="000000"/>
-                <w:sz w:val="18"/>
-                <w:szCs w:val="18"/>
-              </w:rPr>
-              <w:t xml:space="preserve">⑤ Merksatz</w:t>
+              <w:t xml:space="preserve">Information</w:t>
+            </w:r>
+          </w:p>
+        </w:tc>
+        <w:tc>
+          <w:tcPr>
+            <w:tcW w:type="dxa" w:w="6650"/>
+            <w:tcBorders>
+              <w:top w:val="single" w:color="B9C6E8" w:sz="6"/>
+              <w:left w:val="single" w:color="B9C6E8" w:sz="6"/>
+              <w:bottom w:val="single" w:color="B9C6E8" w:sz="6"/>
+              <w:right w:val="single" w:color="B9C6E8" w:sz="6"/>
+            </w:tcBorders>
+            <w:tcMar>
+              <w:top w:type="dxa" w:w="60"/>
+              <w:left w:type="dxa" w:w="120"/>
+              <w:bottom w:type="dxa" w:w="60"/>
+              <w:right w:type="dxa" w:w="120"/>
+            </w:tcMar>
+            <w:vAlign w:val="top"/>
+          </w:tcPr>
+          <w:p>
+            <w:pPr>
+              <w:spacing w:after="0" w:before="0"/>
+            </w:pPr>
+            <w:r>
+              <w:rPr>
+                <w:rFonts w:ascii="Calibri" w:cs="Calibri" w:eastAsia="Calibri" w:hAnsi="Calibri"/>
+                <w:color w:val="000000"/>
+                <w:sz w:val="18"/>
+                <w:szCs w:val="18"/>
+              </w:rPr>
+              <w:t xml:space="preserve">Folie 11: Appell, offen, verdeckt. Rückfrage zum Chat: „‚Ich wünsche mir, dass mein Vater das Handy weglegt‘ – offen oder verdeckt?“</w:t>
+            </w:r>
+          </w:p>
+        </w:tc>
+        <w:tc>
+          <w:tcPr>
+            <w:tcW w:type="dxa" w:w="2988"/>
+            <w:tcBorders>
+              <w:top w:val="single" w:color="B9C6E8" w:sz="6"/>
+              <w:left w:val="single" w:color="B9C6E8" w:sz="6"/>
+              <w:bottom w:val="single" w:color="B9C6E8" w:sz="6"/>
+              <w:right w:val="single" w:color="B9C6E8" w:sz="6"/>
+            </w:tcBorders>
+            <w:tcMar>
+              <w:top w:type="dxa" w:w="60"/>
+              <w:left w:type="dxa" w:w="120"/>
+              <w:bottom w:type="dxa" w:w="60"/>
+              <w:right w:type="dxa" w:w="120"/>
+            </w:tcMar>
+            <w:vAlign w:val="top"/>
+          </w:tcPr>
+          <w:p>
+            <w:pPr>
+              <w:spacing w:after="0" w:before="0"/>
+            </w:pPr>
+            <w:r>
+              <w:rPr>
+                <w:rFonts w:ascii="Calibri" w:cs="Calibri" w:eastAsia="Calibri" w:hAnsi="Calibri"/>
+                <w:color w:val="000000"/>
+                <w:sz w:val="18"/>
+                <w:szCs w:val="18"/>
+              </w:rPr>
+              <w:t xml:space="preserve">–</w:t>
             </w:r>
           </w:p>
         </w:tc>
@@ -2005,12 +2005,3177 @@
                 <w:sz w:val="17"/>
                 <w:szCs w:val="17"/>
               </w:rPr>
-              <w:t xml:space="preserve">Folie 8–9</w:t>
+              <w:t xml:space="preserve">Folie 11</w:t>
+            </w:r>
+          </w:p>
+        </w:tc>
+      </w:tr>
+      <w:tr>
+        <w:trPr>
+          <w:cantSplit/>
+        </w:trPr>
+        <w:tc>
+          <w:tcPr>
+            <w:tcW w:type="dxa" w:w="950"/>
+            <w:tcBorders>
+              <w:top w:val="single" w:color="B9C6E8" w:sz="6"/>
+              <w:left w:val="single" w:color="B9C6E8" w:sz="6"/>
+              <w:bottom w:val="single" w:color="B9C6E8" w:sz="6"/>
+              <w:right w:val="single" w:color="B9C6E8" w:sz="6"/>
+            </w:tcBorders>
+            <w:shd w:fill="F4F7FD" w:color="auto" w:val="clear"/>
+            <w:tcMar>
+              <w:top w:type="dxa" w:w="60"/>
+              <w:left w:type="dxa" w:w="120"/>
+              <w:bottom w:type="dxa" w:w="60"/>
+              <w:right w:type="dxa" w:w="120"/>
+            </w:tcMar>
+            <w:vAlign w:val="top"/>
+          </w:tcPr>
+          <w:p>
+            <w:pPr>
+              <w:spacing w:after="0" w:before="0"/>
+            </w:pPr>
+            <w:r>
+              <w:rPr>
+                <w:rFonts w:ascii="Calibri" w:cs="Calibri" w:eastAsia="Calibri" w:hAnsi="Calibri"/>
+                <w:b/>
+                <w:bCs/>
+                <w:color w:val="1E2761"/>
+                <w:sz w:val="18"/>
+                <w:szCs w:val="18"/>
+              </w:rPr>
+              <w:t xml:space="preserve">15–18'</w:t>
+            </w:r>
+          </w:p>
+        </w:tc>
+        <w:tc>
+          <w:tcPr>
+            <w:tcW w:type="dxa" w:w="2350"/>
+            <w:tcBorders>
+              <w:top w:val="single" w:color="B9C6E8" w:sz="6"/>
+              <w:left w:val="single" w:color="B9C6E8" w:sz="6"/>
+              <w:bottom w:val="single" w:color="B9C6E8" w:sz="6"/>
+              <w:right w:val="single" w:color="B9C6E8" w:sz="6"/>
+            </w:tcBorders>
+            <w:shd w:fill="F4F7FD" w:color="auto" w:val="clear"/>
+            <w:tcMar>
+              <w:top w:type="dxa" w:w="60"/>
+              <w:left w:type="dxa" w:w="120"/>
+              <w:bottom w:type="dxa" w:w="60"/>
+              <w:right w:type="dxa" w:w="120"/>
+            </w:tcMar>
+            <w:vAlign w:val="top"/>
+          </w:tcPr>
+          <w:p>
+            <w:pPr>
+              <w:spacing w:after="0" w:before="0"/>
+            </w:pPr>
+            <w:r>
+              <w:rPr>
+                <w:rFonts w:ascii="Calibri" w:cs="Calibri" w:eastAsia="Calibri" w:hAnsi="Calibri"/>
+                <w:b/>
+                <w:bCs/>
+                <w:color w:val="1E2761"/>
+                <w:sz w:val="18"/>
+                <w:szCs w:val="18"/>
+              </w:rPr>
+              <w:t xml:space="preserve">Vorarbeit (allein)</w:t>
+            </w:r>
+          </w:p>
+        </w:tc>
+        <w:tc>
+          <w:tcPr>
+            <w:tcW w:type="dxa" w:w="6650"/>
+            <w:tcBorders>
+              <w:top w:val="single" w:color="B9C6E8" w:sz="6"/>
+              <w:left w:val="single" w:color="B9C6E8" w:sz="6"/>
+              <w:bottom w:val="single" w:color="B9C6E8" w:sz="6"/>
+              <w:right w:val="single" w:color="B9C6E8" w:sz="6"/>
+            </w:tcBorders>
+            <w:tcMar>
+              <w:top w:type="dxa" w:w="60"/>
+              <w:left w:type="dxa" w:w="120"/>
+              <w:bottom w:type="dxa" w:w="60"/>
+              <w:right w:type="dxa" w:w="120"/>
+            </w:tcMar>
+            <w:vAlign w:val="top"/>
+          </w:tcPr>
+          <w:p>
+            <w:pPr>
+              <w:spacing w:after="0" w:before="0"/>
+            </w:pPr>
+            <w:r>
+              <w:rPr>
+                <w:rFonts w:ascii="Calibri" w:cs="Calibri" w:eastAsia="Calibri" w:hAnsi="Calibri"/>
+                <w:color w:val="000000"/>
+                <w:sz w:val="18"/>
+                <w:szCs w:val="18"/>
+              </w:rPr>
+              <w:t xml:space="preserve">Auftrag 1 (Folie 12): Kernbotschaft in einem Satz. Zwei vorlesen, den treffendsten anschreiben.</w:t>
+            </w:r>
+          </w:p>
+        </w:tc>
+        <w:tc>
+          <w:tcPr>
+            <w:tcW w:type="dxa" w:w="2988"/>
+            <w:tcBorders>
+              <w:top w:val="single" w:color="B9C6E8" w:sz="6"/>
+              <w:left w:val="single" w:color="B9C6E8" w:sz="6"/>
+              <w:bottom w:val="single" w:color="B9C6E8" w:sz="6"/>
+              <w:right w:val="single" w:color="B9C6E8" w:sz="6"/>
+            </w:tcBorders>
+            <w:tcMar>
+              <w:top w:type="dxa" w:w="60"/>
+              <w:left w:type="dxa" w:w="120"/>
+              <w:bottom w:type="dxa" w:w="60"/>
+              <w:right w:type="dxa" w:w="120"/>
+            </w:tcMar>
+            <w:vAlign w:val="top"/>
+          </w:tcPr>
+          <w:p>
+            <w:pPr>
+              <w:spacing w:after="0" w:before="0"/>
+            </w:pPr>
+            <w:r>
+              <w:rPr>
+                <w:rFonts w:ascii="Calibri" w:cs="Calibri" w:eastAsia="Calibri" w:hAnsi="Calibri"/>
+                <w:color w:val="000000"/>
+                <w:sz w:val="18"/>
+                <w:szCs w:val="18"/>
+              </w:rPr>
+              <w:t xml:space="preserve">② Kernbotschaft</w:t>
+            </w:r>
+          </w:p>
+        </w:tc>
+        <w:tc>
+          <w:tcPr>
+            <w:tcW w:type="dxa" w:w="2400"/>
+            <w:tcBorders>
+              <w:top w:val="single" w:color="B9C6E8" w:sz="6"/>
+              <w:left w:val="single" w:color="B9C6E8" w:sz="6"/>
+              <w:bottom w:val="single" w:color="B9C6E8" w:sz="6"/>
+              <w:right w:val="single" w:color="B9C6E8" w:sz="6"/>
+            </w:tcBorders>
+            <w:tcMar>
+              <w:top w:type="dxa" w:w="60"/>
+              <w:left w:type="dxa" w:w="120"/>
+              <w:bottom w:type="dxa" w:w="60"/>
+              <w:right w:type="dxa" w:w="120"/>
+            </w:tcMar>
+            <w:vAlign w:val="top"/>
+          </w:tcPr>
+          <w:p>
+            <w:pPr>
+              <w:spacing w:after="0" w:before="0"/>
+            </w:pPr>
+            <w:r>
+              <w:rPr>
+                <w:rFonts w:ascii="Calibri" w:cs="Calibri" w:eastAsia="Calibri" w:hAnsi="Calibri"/>
+                <w:color w:val="5B6B8C"/>
+                <w:sz w:val="17"/>
+                <w:szCs w:val="17"/>
+              </w:rPr>
+              <w:t xml:space="preserve">Folie 12, Hefter</w:t>
+            </w:r>
+          </w:p>
+        </w:tc>
+      </w:tr>
+      <w:tr>
+        <w:trPr>
+          <w:cantSplit/>
+        </w:trPr>
+        <w:tc>
+          <w:tcPr>
+            <w:tcW w:type="dxa" w:w="950"/>
+            <w:tcBorders>
+              <w:top w:val="single" w:color="B9C6E8" w:sz="6"/>
+              <w:left w:val="single" w:color="B9C6E8" w:sz="6"/>
+              <w:bottom w:val="single" w:color="B9C6E8" w:sz="6"/>
+              <w:right w:val="single" w:color="B9C6E8" w:sz="6"/>
+            </w:tcBorders>
+            <w:shd w:fill="F4F7FD" w:color="auto" w:val="clear"/>
+            <w:tcMar>
+              <w:top w:type="dxa" w:w="60"/>
+              <w:left w:type="dxa" w:w="120"/>
+              <w:bottom w:type="dxa" w:w="60"/>
+              <w:right w:type="dxa" w:w="120"/>
+            </w:tcMar>
+            <w:vAlign w:val="top"/>
+          </w:tcPr>
+          <w:p>
+            <w:pPr>
+              <w:spacing w:after="0" w:before="0"/>
+            </w:pPr>
+            <w:r>
+              <w:rPr>
+                <w:rFonts w:ascii="Calibri" w:cs="Calibri" w:eastAsia="Calibri" w:hAnsi="Calibri"/>
+                <w:b/>
+                <w:bCs/>
+                <w:color w:val="1E2761"/>
+                <w:sz w:val="18"/>
+                <w:szCs w:val="18"/>
+              </w:rPr>
+              <w:t xml:space="preserve">18–26'</w:t>
+            </w:r>
+          </w:p>
+        </w:tc>
+        <w:tc>
+          <w:tcPr>
+            <w:tcW w:type="dxa" w:w="2350"/>
+            <w:tcBorders>
+              <w:top w:val="single" w:color="B9C6E8" w:sz="6"/>
+              <w:left w:val="single" w:color="B9C6E8" w:sz="6"/>
+              <w:bottom w:val="single" w:color="B9C6E8" w:sz="6"/>
+              <w:right w:val="single" w:color="B9C6E8" w:sz="6"/>
+            </w:tcBorders>
+            <w:shd w:fill="F4F7FD" w:color="auto" w:val="clear"/>
+            <w:tcMar>
+              <w:top w:type="dxa" w:w="60"/>
+              <w:left w:type="dxa" w:w="120"/>
+              <w:bottom w:type="dxa" w:w="60"/>
+              <w:right w:type="dxa" w:w="120"/>
+            </w:tcMar>
+            <w:vAlign w:val="top"/>
+          </w:tcPr>
+          <w:p>
+            <w:pPr>
+              <w:spacing w:after="0" w:before="0"/>
+            </w:pPr>
+            <w:r>
+              <w:rPr>
+                <w:rFonts w:ascii="Calibri" w:cs="Calibri" w:eastAsia="Calibri" w:hAnsi="Calibri"/>
+                <w:b/>
+                <w:bCs/>
+                <w:color w:val="1E2761"/>
+                <w:sz w:val="18"/>
+                <w:szCs w:val="18"/>
+              </w:rPr>
+              <w:t xml:space="preserve">Analyse (5' allein, 3' Gespräch)</w:t>
+            </w:r>
+          </w:p>
+        </w:tc>
+        <w:tc>
+          <w:tcPr>
+            <w:tcW w:type="dxa" w:w="6650"/>
+            <w:tcBorders>
+              <w:top w:val="single" w:color="B9C6E8" w:sz="6"/>
+              <w:left w:val="single" w:color="B9C6E8" w:sz="6"/>
+              <w:bottom w:val="single" w:color="B9C6E8" w:sz="6"/>
+              <w:right w:val="single" w:color="B9C6E8" w:sz="6"/>
+            </w:tcBorders>
+            <w:tcMar>
+              <w:top w:type="dxa" w:w="60"/>
+              <w:left w:type="dxa" w:w="120"/>
+              <w:bottom w:type="dxa" w:w="60"/>
+              <w:right w:type="dxa" w:w="120"/>
+            </w:tcMar>
+            <w:vAlign w:val="top"/>
+          </w:tcPr>
+          <w:p>
+            <w:pPr>
+              <w:spacing w:after="0" w:before="0"/>
+            </w:pPr>
+            <w:r>
+              <w:rPr>
+                <w:rFonts w:ascii="Calibri" w:cs="Calibri" w:eastAsia="Calibri" w:hAnsi="Calibri"/>
+                <w:color w:val="000000"/>
+                <w:sz w:val="18"/>
+                <w:szCs w:val="18"/>
+              </w:rPr>
+              <w:t xml:space="preserve">Auftrag 2 (Folie 13), Formulierungshilfen (Folie 14) bei Bedarf. Dann Frage für Frage ins Quadrat. Impulse: „Welches Wort zeigt, dass Kafka etwas will?“ · „Was soll der Vater mit Wort, Hand, Blick anfangen?“ · „Warum betont Kafka, dass der Vater keine Schuld hat?“ → Furcht.</w:t>
+            </w:r>
+          </w:p>
+        </w:tc>
+        <w:tc>
+          <w:tcPr>
+            <w:tcW w:type="dxa" w:w="2988"/>
+            <w:tcBorders>
+              <w:top w:val="single" w:color="B9C6E8" w:sz="6"/>
+              <w:left w:val="single" w:color="B9C6E8" w:sz="6"/>
+              <w:bottom w:val="single" w:color="B9C6E8" w:sz="6"/>
+              <w:right w:val="single" w:color="B9C6E8" w:sz="6"/>
+            </w:tcBorders>
+            <w:tcMar>
+              <w:top w:type="dxa" w:w="60"/>
+              <w:left w:type="dxa" w:w="120"/>
+              <w:bottom w:type="dxa" w:w="60"/>
+              <w:right w:type="dxa" w:w="120"/>
+            </w:tcMar>
+            <w:vAlign w:val="top"/>
+          </w:tcPr>
+          <w:p>
+            <w:pPr>
+              <w:spacing w:after="0" w:before="0"/>
+            </w:pPr>
+            <w:r>
+              <w:rPr>
+                <w:rFonts w:ascii="Calibri" w:cs="Calibri" w:eastAsia="Calibri" w:hAnsi="Calibri"/>
+                <w:color w:val="000000"/>
+                <w:sz w:val="18"/>
+                <w:szCs w:val="18"/>
+              </w:rPr>
+              <w:t xml:space="preserve">③ Quadrat, Appell zuletzt und groß</w:t>
+            </w:r>
+          </w:p>
+        </w:tc>
+        <w:tc>
+          <w:tcPr>
+            <w:tcW w:type="dxa" w:w="2400"/>
+            <w:tcBorders>
+              <w:top w:val="single" w:color="B9C6E8" w:sz="6"/>
+              <w:left w:val="single" w:color="B9C6E8" w:sz="6"/>
+              <w:bottom w:val="single" w:color="B9C6E8" w:sz="6"/>
+              <w:right w:val="single" w:color="B9C6E8" w:sz="6"/>
+            </w:tcBorders>
+            <w:tcMar>
+              <w:top w:type="dxa" w:w="60"/>
+              <w:left w:type="dxa" w:w="120"/>
+              <w:bottom w:type="dxa" w:w="60"/>
+              <w:right w:type="dxa" w:w="120"/>
+            </w:tcMar>
+            <w:vAlign w:val="top"/>
+          </w:tcPr>
+          <w:p>
+            <w:pPr>
+              <w:spacing w:after="0" w:before="0"/>
+            </w:pPr>
+            <w:r>
+              <w:rPr>
+                <w:rFonts w:ascii="Calibri" w:cs="Calibri" w:eastAsia="Calibri" w:hAnsi="Calibri"/>
+                <w:color w:val="5B6B8C"/>
+                <w:sz w:val="17"/>
+                <w:szCs w:val="17"/>
+              </w:rPr>
+              <w:t xml:space="preserve">Folie 13–14, Hefter</w:t>
+            </w:r>
+          </w:p>
+        </w:tc>
+      </w:tr>
+      <w:tr>
+        <w:trPr>
+          <w:cantSplit/>
+        </w:trPr>
+        <w:tc>
+          <w:tcPr>
+            <w:tcW w:type="dxa" w:w="950"/>
+            <w:tcBorders>
+              <w:top w:val="single" w:color="B9C6E8" w:sz="6"/>
+              <w:left w:val="single" w:color="B9C6E8" w:sz="6"/>
+              <w:bottom w:val="single" w:color="B9C6E8" w:sz="6"/>
+              <w:right w:val="single" w:color="B9C6E8" w:sz="6"/>
+            </w:tcBorders>
+            <w:shd w:fill="F4F7FD" w:color="auto" w:val="clear"/>
+            <w:tcMar>
+              <w:top w:type="dxa" w:w="60"/>
+              <w:left w:type="dxa" w:w="120"/>
+              <w:bottom w:type="dxa" w:w="60"/>
+              <w:right w:type="dxa" w:w="120"/>
+            </w:tcMar>
+            <w:vAlign w:val="top"/>
+          </w:tcPr>
+          <w:p>
+            <w:pPr>
+              <w:spacing w:after="0" w:before="0"/>
+            </w:pPr>
+            <w:r>
+              <w:rPr>
+                <w:rFonts w:ascii="Calibri" w:cs="Calibri" w:eastAsia="Calibri" w:hAnsi="Calibri"/>
+                <w:b/>
+                <w:bCs/>
+                <w:color w:val="1E2761"/>
+                <w:sz w:val="18"/>
+                <w:szCs w:val="18"/>
+              </w:rPr>
+              <w:t xml:space="preserve">26–38'</w:t>
+            </w:r>
+          </w:p>
+        </w:tc>
+        <w:tc>
+          <w:tcPr>
+            <w:tcW w:type="dxa" w:w="2350"/>
+            <w:tcBorders>
+              <w:top w:val="single" w:color="B9C6E8" w:sz="6"/>
+              <w:left w:val="single" w:color="B9C6E8" w:sz="6"/>
+              <w:bottom w:val="single" w:color="B9C6E8" w:sz="6"/>
+              <w:right w:val="single" w:color="B9C6E8" w:sz="6"/>
+            </w:tcBorders>
+            <w:shd w:fill="F4F7FD" w:color="auto" w:val="clear"/>
+            <w:tcMar>
+              <w:top w:type="dxa" w:w="60"/>
+              <w:left w:type="dxa" w:w="120"/>
+              <w:bottom w:type="dxa" w:w="60"/>
+              <w:right w:type="dxa" w:w="120"/>
+            </w:tcMar>
+            <w:vAlign w:val="top"/>
+          </w:tcPr>
+          <w:p>
+            <w:pPr>
+              <w:spacing w:after="0" w:before="0"/>
+            </w:pPr>
+            <w:r>
+              <w:rPr>
+                <w:rFonts w:ascii="Calibri" w:cs="Calibri" w:eastAsia="Calibri" w:hAnsi="Calibri"/>
+                <w:b/>
+                <w:bCs/>
+                <w:color w:val="1E2761"/>
+                <w:sz w:val="18"/>
+                <w:szCs w:val="18"/>
+              </w:rPr>
+              <w:t xml:space="preserve">Transfer (allein)</w:t>
+            </w:r>
+          </w:p>
+        </w:tc>
+        <w:tc>
+          <w:tcPr>
+            <w:tcW w:type="dxa" w:w="6650"/>
+            <w:tcBorders>
+              <w:top w:val="single" w:color="B9C6E8" w:sz="6"/>
+              <w:left w:val="single" w:color="B9C6E8" w:sz="6"/>
+              <w:bottom w:val="single" w:color="B9C6E8" w:sz="6"/>
+              <w:right w:val="single" w:color="B9C6E8" w:sz="6"/>
+            </w:tcBorders>
+            <w:tcMar>
+              <w:top w:type="dxa" w:w="60"/>
+              <w:left w:type="dxa" w:w="120"/>
+              <w:bottom w:type="dxa" w:w="60"/>
+              <w:right w:type="dxa" w:w="120"/>
+            </w:tcMar>
+            <w:vAlign w:val="top"/>
+          </w:tcPr>
+          <w:p>
+            <w:pPr>
+              <w:spacing w:after="0" w:before="0"/>
+            </w:pPr>
+            <w:r>
+              <w:rPr>
+                <w:rFonts w:ascii="Calibri" w:cs="Calibri" w:eastAsia="Calibri" w:hAnsi="Calibri"/>
+                <w:color w:val="000000"/>
+                <w:sz w:val="18"/>
+                <w:szCs w:val="18"/>
+              </w:rPr>
+              <w:t xml:space="preserve">Überleitung: „Max Brods Brief hat gewirkt – der Vater hört zu. Jetzt spricht Franz selbst, und zwar offen.“ Folie 15 bzw. Whiteboard-PDF. Timer 12 Min. Hinweis: Großschreibung und Kommas wie im Chat!</w:t>
+            </w:r>
+          </w:p>
+        </w:tc>
+        <w:tc>
+          <w:tcPr>
+            <w:tcW w:type="dxa" w:w="2988"/>
+            <w:tcBorders>
+              <w:top w:val="single" w:color="B9C6E8" w:sz="6"/>
+              <w:left w:val="single" w:color="B9C6E8" w:sz="6"/>
+              <w:bottom w:val="single" w:color="B9C6E8" w:sz="6"/>
+              <w:right w:val="single" w:color="B9C6E8" w:sz="6"/>
+            </w:tcBorders>
+            <w:tcMar>
+              <w:top w:type="dxa" w:w="60"/>
+              <w:left w:type="dxa" w:w="120"/>
+              <w:bottom w:type="dxa" w:w="60"/>
+              <w:right w:type="dxa" w:w="120"/>
+            </w:tcMar>
+            <w:vAlign w:val="top"/>
+          </w:tcPr>
+          <w:p>
+            <w:pPr>
+              <w:spacing w:after="0" w:before="0"/>
+            </w:pPr>
+            <w:r>
+              <w:rPr>
+                <w:rFonts w:ascii="Calibri" w:cs="Calibri" w:eastAsia="Calibri" w:hAnsi="Calibri"/>
+                <w:color w:val="000000"/>
+                <w:sz w:val="18"/>
+                <w:szCs w:val="18"/>
+              </w:rPr>
+              <w:t xml:space="preserve">④ Kriterien</w:t>
+            </w:r>
+          </w:p>
+        </w:tc>
+        <w:tc>
+          <w:tcPr>
+            <w:tcW w:type="dxa" w:w="2400"/>
+            <w:tcBorders>
+              <w:top w:val="single" w:color="B9C6E8" w:sz="6"/>
+              <w:left w:val="single" w:color="B9C6E8" w:sz="6"/>
+              <w:bottom w:val="single" w:color="B9C6E8" w:sz="6"/>
+              <w:right w:val="single" w:color="B9C6E8" w:sz="6"/>
+            </w:tcBorders>
+            <w:tcMar>
+              <w:top w:type="dxa" w:w="60"/>
+              <w:left w:type="dxa" w:w="120"/>
+              <w:bottom w:type="dxa" w:w="60"/>
+              <w:right w:type="dxa" w:w="120"/>
+            </w:tcMar>
+            <w:vAlign w:val="top"/>
+          </w:tcPr>
+          <w:p>
+            <w:pPr>
+              <w:spacing w:after="0" w:before="0"/>
+            </w:pPr>
+            <w:r>
+              <w:rPr>
+                <w:rFonts w:ascii="Calibri" w:cs="Calibri" w:eastAsia="Calibri" w:hAnsi="Calibri"/>
+                <w:color w:val="5B6B8C"/>
+                <w:sz w:val="17"/>
+                <w:szCs w:val="17"/>
+              </w:rPr>
+              <w:t xml:space="preserve">Folie 15 / Whiteboard, Hefter</w:t>
+            </w:r>
+          </w:p>
+        </w:tc>
+      </w:tr>
+      <w:tr>
+        <w:trPr>
+          <w:cantSplit/>
+        </w:trPr>
+        <w:tc>
+          <w:tcPr>
+            <w:tcW w:type="dxa" w:w="950"/>
+            <w:tcBorders>
+              <w:top w:val="single" w:color="B9C6E8" w:sz="6"/>
+              <w:left w:val="single" w:color="B9C6E8" w:sz="6"/>
+              <w:bottom w:val="single" w:color="B9C6E8" w:sz="6"/>
+              <w:right w:val="single" w:color="B9C6E8" w:sz="6"/>
+            </w:tcBorders>
+            <w:shd w:fill="F4F7FD" w:color="auto" w:val="clear"/>
+            <w:tcMar>
+              <w:top w:type="dxa" w:w="60"/>
+              <w:left w:type="dxa" w:w="120"/>
+              <w:bottom w:type="dxa" w:w="60"/>
+              <w:right w:type="dxa" w:w="120"/>
+            </w:tcMar>
+            <w:vAlign w:val="top"/>
+          </w:tcPr>
+          <w:p>
+            <w:pPr>
+              <w:spacing w:after="0" w:before="0"/>
+            </w:pPr>
+            <w:r>
+              <w:rPr>
+                <w:rFonts w:ascii="Calibri" w:cs="Calibri" w:eastAsia="Calibri" w:hAnsi="Calibri"/>
+                <w:b/>
+                <w:bCs/>
+                <w:color w:val="1E2761"/>
+                <w:sz w:val="18"/>
+                <w:szCs w:val="18"/>
+              </w:rPr>
+              <w:t xml:space="preserve">38–45'</w:t>
+            </w:r>
+          </w:p>
+        </w:tc>
+        <w:tc>
+          <w:tcPr>
+            <w:tcW w:type="dxa" w:w="2350"/>
+            <w:tcBorders>
+              <w:top w:val="single" w:color="B9C6E8" w:sz="6"/>
+              <w:left w:val="single" w:color="B9C6E8" w:sz="6"/>
+              <w:bottom w:val="single" w:color="B9C6E8" w:sz="6"/>
+              <w:right w:val="single" w:color="B9C6E8" w:sz="6"/>
+            </w:tcBorders>
+            <w:shd w:fill="F4F7FD" w:color="auto" w:val="clear"/>
+            <w:tcMar>
+              <w:top w:type="dxa" w:w="60"/>
+              <w:left w:type="dxa" w:w="120"/>
+              <w:bottom w:type="dxa" w:w="60"/>
+              <w:right w:type="dxa" w:w="120"/>
+            </w:tcMar>
+            <w:vAlign w:val="top"/>
+          </w:tcPr>
+          <w:p>
+            <w:pPr>
+              <w:spacing w:after="0" w:before="0"/>
+            </w:pPr>
+            <w:r>
+              <w:rPr>
+                <w:rFonts w:ascii="Calibri" w:cs="Calibri" w:eastAsia="Calibri" w:hAnsi="Calibri"/>
+                <w:b/>
+                <w:bCs/>
+                <w:color w:val="1E2761"/>
+                <w:sz w:val="18"/>
+                <w:szCs w:val="18"/>
+              </w:rPr>
+              <w:t xml:space="preserve">Vortrag und Reflexion</w:t>
+            </w:r>
+          </w:p>
+        </w:tc>
+        <w:tc>
+          <w:tcPr>
+            <w:tcW w:type="dxa" w:w="6650"/>
+            <w:tcBorders>
+              <w:top w:val="single" w:color="B9C6E8" w:sz="6"/>
+              <w:left w:val="single" w:color="B9C6E8" w:sz="6"/>
+              <w:bottom w:val="single" w:color="B9C6E8" w:sz="6"/>
+              <w:right w:val="single" w:color="B9C6E8" w:sz="6"/>
+            </w:tcBorders>
+            <w:tcMar>
+              <w:top w:type="dxa" w:w="60"/>
+              <w:left w:type="dxa" w:w="120"/>
+              <w:bottom w:type="dxa" w:w="60"/>
+              <w:right w:type="dxa" w:w="120"/>
+            </w:tcMar>
+            <w:vAlign w:val="top"/>
+          </w:tcPr>
+          <w:p>
+            <w:pPr>
+              <w:spacing w:after="0" w:before="0"/>
+            </w:pPr>
+            <w:r>
+              <w:rPr>
+                <w:rFonts w:ascii="Calibri" w:cs="Calibri" w:eastAsia="Calibri" w:hAnsi="Calibri"/>
+                <w:color w:val="000000"/>
+                <w:sz w:val="18"/>
+                <w:szCs w:val="18"/>
+              </w:rPr>
+              <w:t xml:space="preserve">Eine bis zwei Reden ohne Unterbrechung (Folie 16, die anderen haken ab), Auswertung nach Kriterien. Reflexion (Folie 17). Merksatz anschreiben. Rest nächste Stunde – keine Hausaufgabe.</w:t>
+            </w:r>
+          </w:p>
+        </w:tc>
+        <w:tc>
+          <w:tcPr>
+            <w:tcW w:type="dxa" w:w="2988"/>
+            <w:tcBorders>
+              <w:top w:val="single" w:color="B9C6E8" w:sz="6"/>
+              <w:left w:val="single" w:color="B9C6E8" w:sz="6"/>
+              <w:bottom w:val="single" w:color="B9C6E8" w:sz="6"/>
+              <w:right w:val="single" w:color="B9C6E8" w:sz="6"/>
+            </w:tcBorders>
+            <w:tcMar>
+              <w:top w:type="dxa" w:w="60"/>
+              <w:left w:type="dxa" w:w="120"/>
+              <w:bottom w:type="dxa" w:w="60"/>
+              <w:right w:type="dxa" w:w="120"/>
+            </w:tcMar>
+            <w:vAlign w:val="top"/>
+          </w:tcPr>
+          <w:p>
+            <w:pPr>
+              <w:spacing w:after="0" w:before="0"/>
+            </w:pPr>
+            <w:r>
+              <w:rPr>
+                <w:rFonts w:ascii="Calibri" w:cs="Calibri" w:eastAsia="Calibri" w:hAnsi="Calibri"/>
+                <w:color w:val="000000"/>
+                <w:sz w:val="18"/>
+                <w:szCs w:val="18"/>
+              </w:rPr>
+              <w:t xml:space="preserve">⑤ Merksatz</w:t>
+            </w:r>
+          </w:p>
+        </w:tc>
+        <w:tc>
+          <w:tcPr>
+            <w:tcW w:type="dxa" w:w="2400"/>
+            <w:tcBorders>
+              <w:top w:val="single" w:color="B9C6E8" w:sz="6"/>
+              <w:left w:val="single" w:color="B9C6E8" w:sz="6"/>
+              <w:bottom w:val="single" w:color="B9C6E8" w:sz="6"/>
+              <w:right w:val="single" w:color="B9C6E8" w:sz="6"/>
+            </w:tcBorders>
+            <w:tcMar>
+              <w:top w:type="dxa" w:w="60"/>
+              <w:left w:type="dxa" w:w="120"/>
+              <w:bottom w:type="dxa" w:w="60"/>
+              <w:right w:type="dxa" w:w="120"/>
+            </w:tcMar>
+            <w:vAlign w:val="top"/>
+          </w:tcPr>
+          <w:p>
+            <w:pPr>
+              <w:spacing w:after="0" w:before="0"/>
+            </w:pPr>
+            <w:r>
+              <w:rPr>
+                <w:rFonts w:ascii="Calibri" w:cs="Calibri" w:eastAsia="Calibri" w:hAnsi="Calibri"/>
+                <w:color w:val="5B6B8C"/>
+                <w:sz w:val="17"/>
+                <w:szCs w:val="17"/>
+              </w:rPr>
+              <w:t xml:space="preserve">Folie 16–17</w:t>
             </w:r>
           </w:p>
         </w:tc>
       </w:tr>
     </w:tbl>
+    <w:p>
+      <w:pPr>
+        <w:pageBreakBefore/>
+        <w:spacing w:after="20" w:before="0"/>
+      </w:pPr>
+      <w:r>
+        <w:rPr>
+          <w:rFonts w:ascii="Calibri" w:cs="Calibri" w:eastAsia="Calibri" w:hAnsi="Calibri"/>
+          <w:b/>
+          <w:bCs/>
+          <w:color w:val="5B6B8C"/>
+          <w:sz w:val="17"/>
+          <w:szCs w:val="17"/>
+        </w:rPr>
+        <w:t xml:space="preserve">TAFELSCRIPT · TEIL 1: RECHTSCHREIB-CHECK</w:t>
+      </w:r>
+    </w:p>
+    <w:p>
+      <w:pPr>
+        <w:spacing w:after="80" w:before="0"/>
+      </w:pPr>
+      <w:r>
+        <w:rPr>
+          <w:rFonts w:ascii="Cambria" w:cs="Cambria" w:eastAsia="Cambria" w:hAnsi="Cambria"/>
+          <w:b/>
+          <w:bCs/>
+          <w:color w:val="1E2761"/>
+          <w:sz w:val="32"/>
+          <w:szCs w:val="32"/>
+        </w:rPr>
+        <w:t xml:space="preserve">Vormachen und Lösung</w:t>
+      </w:r>
+    </w:p>
+    <w:tbl>
+      <w:tblPr>
+        <w:tblW w:type="dxa" w:w="15338"/>
+        <w:tblBorders>
+          <w:top w:val="single" w:color="auto" w:sz="4"/>
+          <w:left w:val="single" w:color="auto" w:sz="4"/>
+          <w:bottom w:val="single" w:color="auto" w:sz="4"/>
+          <w:right w:val="single" w:color="auto" w:sz="4"/>
+          <w:insideH w:val="single" w:color="auto" w:sz="4"/>
+          <w:insideV w:val="single" w:color="auto" w:sz="4"/>
+        </w:tblBorders>
+      </w:tblPr>
+      <w:tblGrid>
+        <w:gridCol w:w="15338"/>
+      </w:tblGrid>
+      <w:tr>
+        <w:trPr>
+          <w:cantSplit/>
+        </w:trPr>
+        <w:tc>
+          <w:tcPr>
+            <w:tcW w:type="dxa" w:w="15338"/>
+            <w:tcBorders>
+              <w:top w:val="none" w:color="FFFFFF" w:sz="0"/>
+              <w:left w:val="none" w:color="FFFFFF" w:sz="0"/>
+              <w:bottom w:val="none" w:color="FFFFFF" w:sz="0"/>
+              <w:right w:val="none" w:color="FFFFFF" w:sz="0"/>
+            </w:tcBorders>
+            <w:shd w:fill="EAF0FA" w:color="auto" w:val="clear"/>
+            <w:tcMar>
+              <w:top w:type="dxa" w:w="60"/>
+              <w:left w:type="dxa" w:w="120"/>
+              <w:bottom w:type="dxa" w:w="60"/>
+              <w:right w:type="dxa" w:w="120"/>
+            </w:tcMar>
+            <w:vAlign w:val="top"/>
+          </w:tcPr>
+          <w:p>
+            <w:pPr>
+              <w:spacing w:after="40" w:before="0"/>
+            </w:pPr>
+            <w:r>
+              <w:rPr>
+                <w:rFonts w:ascii="Calibri" w:cs="Calibri" w:eastAsia="Calibri" w:hAnsi="Calibri"/>
+                <w:b/>
+                <w:bCs/>
+                <w:color w:val="1E2761"/>
+                <w:sz w:val="19"/>
+                <w:szCs w:val="19"/>
+              </w:rPr>
+              <w:t xml:space="preserve">So denken Sie bei Nachricht 1 laut (Folie 4):</w:t>
+            </w:r>
+          </w:p>
+          <w:p>
+            <w:pPr>
+              <w:spacing w:after="0" w:before="0"/>
+            </w:pPr>
+            <w:r>
+              <w:rPr>
+                <w:rFonts w:ascii="Calibri" w:cs="Calibri" w:eastAsia="Calibri" w:hAnsi="Calibri"/>
+                <w:i/>
+                <w:iCs/>
+                <w:color w:val="000000"/>
+                <w:sz w:val="19"/>
+                <w:szCs w:val="19"/>
+              </w:rPr>
+              <w:t xml:space="preserve">„Ich glaube dass … – ‚dass‘: Wo steht das Verb? ‚hatte‘, ganz am Ende. Also Nebensatz, also Komma vor dass. – ‚vater‘: Passt ‚der‘ davor? Der Vater – ja, also groß. – ‚geduld‘: die Geduld – groß.“ Dann Folie 5 mit der Korrektur zeigen.</w:t>
+            </w:r>
+          </w:p>
+        </w:tc>
+      </w:tr>
+    </w:tbl>
+    <w:p>
+      <w:pPr>
+        <w:spacing w:after="60" w:before="0"/>
+      </w:pPr>
+      <w:r>
+        <w:rPr>
+          <w:rFonts w:ascii="Calibri" w:cs="Calibri" w:eastAsia="Calibri" w:hAnsi="Calibri"/>
+          <w:color w:val="000000"/>
+          <w:sz w:val="20"/>
+          <w:szCs w:val="20"/>
+        </w:rPr>
+        <w:t xml:space="preserve"/>
+      </w:r>
+    </w:p>
+    <w:tbl>
+      <w:tblPr>
+        <w:tblW w:type="dxa" w:w="15338"/>
+        <w:tblBorders>
+          <w:top w:val="single" w:color="auto" w:sz="4"/>
+          <w:left w:val="single" w:color="auto" w:sz="4"/>
+          <w:bottom w:val="single" w:color="auto" w:sz="4"/>
+          <w:right w:val="single" w:color="auto" w:sz="4"/>
+          <w:insideH w:val="single" w:color="auto" w:sz="4"/>
+          <w:insideV w:val="single" w:color="auto" w:sz="4"/>
+        </w:tblBorders>
+      </w:tblPr>
+      <w:tblGrid>
+        <w:gridCol w:w="700"/>
+        <w:gridCol w:w="7300"/>
+        <w:gridCol w:w="7338"/>
+      </w:tblGrid>
+      <w:tr>
+        <w:trPr>
+          <w:cantSplit/>
+        </w:trPr>
+        <w:tc>
+          <w:tcPr>
+            <w:tcW w:type="dxa" w:w="700"/>
+            <w:tcBorders>
+              <w:top w:val="single" w:color="B9C6E8" w:sz="6"/>
+              <w:left w:val="single" w:color="B9C6E8" w:sz="6"/>
+              <w:bottom w:val="single" w:color="B9C6E8" w:sz="6"/>
+              <w:right w:val="single" w:color="B9C6E8" w:sz="6"/>
+            </w:tcBorders>
+            <w:shd w:fill="1E2761" w:color="auto" w:val="clear"/>
+            <w:tcMar>
+              <w:top w:type="dxa" w:w="60"/>
+              <w:left w:type="dxa" w:w="120"/>
+              <w:bottom w:type="dxa" w:w="60"/>
+              <w:right w:type="dxa" w:w="120"/>
+            </w:tcMar>
+            <w:vAlign w:val="top"/>
+          </w:tcPr>
+          <w:p>
+            <w:pPr>
+              <w:spacing w:after="0" w:before="0"/>
+            </w:pPr>
+            <w:r>
+              <w:rPr>
+                <w:rFonts w:ascii="Calibri" w:cs="Calibri" w:eastAsia="Calibri" w:hAnsi="Calibri"/>
+                <w:b/>
+                <w:bCs/>
+                <w:color w:val="FFFFFF"/>
+                <w:sz w:val="18"/>
+                <w:szCs w:val="18"/>
+              </w:rPr>
+              <w:t xml:space="preserve">Nr.</w:t>
+            </w:r>
+          </w:p>
+        </w:tc>
+        <w:tc>
+          <w:tcPr>
+            <w:tcW w:type="dxa" w:w="7300"/>
+            <w:tcBorders>
+              <w:top w:val="single" w:color="B9C6E8" w:sz="6"/>
+              <w:left w:val="single" w:color="B9C6E8" w:sz="6"/>
+              <w:bottom w:val="single" w:color="B9C6E8" w:sz="6"/>
+              <w:right w:val="single" w:color="B9C6E8" w:sz="6"/>
+            </w:tcBorders>
+            <w:shd w:fill="1E2761" w:color="auto" w:val="clear"/>
+            <w:tcMar>
+              <w:top w:type="dxa" w:w="60"/>
+              <w:left w:type="dxa" w:w="120"/>
+              <w:bottom w:type="dxa" w:w="60"/>
+              <w:right w:type="dxa" w:w="120"/>
+            </w:tcMar>
+            <w:vAlign w:val="top"/>
+          </w:tcPr>
+          <w:p>
+            <w:pPr>
+              <w:spacing w:after="0" w:before="0"/>
+            </w:pPr>
+            <w:r>
+              <w:rPr>
+                <w:rFonts w:ascii="Calibri" w:cs="Calibri" w:eastAsia="Calibri" w:hAnsi="Calibri"/>
+                <w:b/>
+                <w:bCs/>
+                <w:color w:val="FFFFFF"/>
+                <w:sz w:val="18"/>
+                <w:szCs w:val="18"/>
+              </w:rPr>
+              <w:t xml:space="preserve">Korrigierte Nachricht (Fehler rot)</w:t>
+            </w:r>
+          </w:p>
+        </w:tc>
+        <w:tc>
+          <w:tcPr>
+            <w:tcW w:type="dxa" w:w="7338"/>
+            <w:tcBorders>
+              <w:top w:val="single" w:color="B9C6E8" w:sz="6"/>
+              <w:left w:val="single" w:color="B9C6E8" w:sz="6"/>
+              <w:bottom w:val="single" w:color="B9C6E8" w:sz="6"/>
+              <w:right w:val="single" w:color="B9C6E8" w:sz="6"/>
+            </w:tcBorders>
+            <w:shd w:fill="1E2761" w:color="auto" w:val="clear"/>
+            <w:tcMar>
+              <w:top w:type="dxa" w:w="60"/>
+              <w:left w:type="dxa" w:w="120"/>
+              <w:bottom w:type="dxa" w:w="60"/>
+              <w:right w:type="dxa" w:w="120"/>
+            </w:tcMar>
+            <w:vAlign w:val="top"/>
+          </w:tcPr>
+          <w:p>
+            <w:pPr>
+              <w:spacing w:after="0" w:before="0"/>
+            </w:pPr>
+            <w:r>
+              <w:rPr>
+                <w:rFonts w:ascii="Calibri" w:cs="Calibri" w:eastAsia="Calibri" w:hAnsi="Calibri"/>
+                <w:b/>
+                <w:bCs/>
+                <w:color w:val="FFFFFF"/>
+                <w:sz w:val="18"/>
+                <w:szCs w:val="18"/>
+              </w:rPr>
+              <w:t xml:space="preserve">Begründung</w:t>
+            </w:r>
+          </w:p>
+        </w:tc>
+      </w:tr>
+      <w:tr>
+        <w:trPr>
+          <w:cantSplit/>
+        </w:trPr>
+        <w:tc>
+          <w:tcPr>
+            <w:tcW w:type="dxa" w:w="700"/>
+            <w:tcBorders>
+              <w:top w:val="single" w:color="B9C6E8" w:sz="6"/>
+              <w:left w:val="single" w:color="B9C6E8" w:sz="6"/>
+              <w:bottom w:val="single" w:color="B9C6E8" w:sz="6"/>
+              <w:right w:val="single" w:color="B9C6E8" w:sz="6"/>
+            </w:tcBorders>
+            <w:shd w:fill="F4F7FD" w:color="auto" w:val="clear"/>
+            <w:tcMar>
+              <w:top w:type="dxa" w:w="60"/>
+              <w:left w:type="dxa" w:w="120"/>
+              <w:bottom w:type="dxa" w:w="60"/>
+              <w:right w:type="dxa" w:w="120"/>
+            </w:tcMar>
+            <w:vAlign w:val="top"/>
+          </w:tcPr>
+          <w:p>
+            <w:pPr>
+              <w:spacing w:after="0" w:before="0"/>
+            </w:pPr>
+            <w:r>
+              <w:rPr>
+                <w:rFonts w:ascii="Calibri" w:cs="Calibri" w:eastAsia="Calibri" w:hAnsi="Calibri"/>
+                <w:b/>
+                <w:bCs/>
+                <w:color w:val="1E2761"/>
+                <w:sz w:val="18"/>
+                <w:szCs w:val="18"/>
+              </w:rPr>
+              <w:t xml:space="preserve">1 *</w:t>
+            </w:r>
+          </w:p>
+        </w:tc>
+        <w:tc>
+          <w:tcPr>
+            <w:tcW w:type="dxa" w:w="7300"/>
+            <w:tcBorders>
+              <w:top w:val="single" w:color="B9C6E8" w:sz="6"/>
+              <w:left w:val="single" w:color="B9C6E8" w:sz="6"/>
+              <w:bottom w:val="single" w:color="B9C6E8" w:sz="6"/>
+              <w:right w:val="single" w:color="B9C6E8" w:sz="6"/>
+            </w:tcBorders>
+            <w:tcMar>
+              <w:top w:type="dxa" w:w="60"/>
+              <w:left w:type="dxa" w:w="120"/>
+              <w:bottom w:type="dxa" w:w="60"/>
+              <w:right w:type="dxa" w:w="120"/>
+            </w:tcMar>
+            <w:vAlign w:val="top"/>
+          </w:tcPr>
+          <w:p>
+            <w:pPr>
+              <w:spacing w:after="0" w:before="0"/>
+            </w:pPr>
+            <w:r>
+              <w:rPr>
+                <w:rFonts w:ascii="Calibri" w:cs="Calibri" w:eastAsia="Calibri" w:hAnsi="Calibri"/>
+                <w:b/>
+                <w:bCs/>
+                <w:color w:val="5B6B8C"/>
+                <w:sz w:val="18"/>
+                <w:szCs w:val="18"/>
+              </w:rPr>
+              <w:t xml:space="preserve">Mia: </w:t>
+            </w:r>
+            <w:r>
+              <w:rPr>
+                <w:rFonts w:ascii="Calibri" w:cs="Calibri" w:eastAsia="Calibri" w:hAnsi="Calibri"/>
+                <w:color w:val="000000"/>
+                <w:sz w:val="19"/>
+                <w:szCs w:val="19"/>
+              </w:rPr>
+              <w:t xml:space="preserve">Ich</w:t>
+            </w:r>
+            <w:r>
+              <w:rPr>
+                <w:rFonts w:ascii="Calibri" w:cs="Calibri" w:eastAsia="Calibri" w:hAnsi="Calibri"/>
+                <w:color w:val="000000"/>
+                <w:sz w:val="19"/>
+                <w:szCs w:val="19"/>
+              </w:rPr>
+              <w:t xml:space="preserve"> </w:t>
+            </w:r>
+            <w:r>
+              <w:rPr>
+                <w:rFonts w:ascii="Calibri" w:cs="Calibri" w:eastAsia="Calibri" w:hAnsi="Calibri"/>
+                <w:color w:val="000000"/>
+                <w:sz w:val="19"/>
+                <w:szCs w:val="19"/>
+              </w:rPr>
+              <w:t xml:space="preserve">glaube</w:t>
+            </w:r>
+            <w:r>
+              <w:rPr>
+                <w:rFonts w:ascii="Calibri" w:cs="Calibri" w:eastAsia="Calibri" w:hAnsi="Calibri"/>
+                <w:b/>
+                <w:bCs/>
+                <w:color w:val="D9534F"/>
+                <w:sz w:val="19"/>
+                <w:szCs w:val="19"/>
+              </w:rPr>
+              <w:t xml:space="preserve">,</w:t>
+            </w:r>
+            <w:r>
+              <w:rPr>
+                <w:rFonts w:ascii="Calibri" w:cs="Calibri" w:eastAsia="Calibri" w:hAnsi="Calibri"/>
+                <w:color w:val="000000"/>
+                <w:sz w:val="19"/>
+                <w:szCs w:val="19"/>
+              </w:rPr>
+              <w:t xml:space="preserve"> </w:t>
+            </w:r>
+            <w:r>
+              <w:rPr>
+                <w:rFonts w:ascii="Calibri" w:cs="Calibri" w:eastAsia="Calibri" w:hAnsi="Calibri"/>
+                <w:color w:val="000000"/>
+                <w:sz w:val="19"/>
+                <w:szCs w:val="19"/>
+              </w:rPr>
+              <w:t xml:space="preserve">dass</w:t>
+            </w:r>
+            <w:r>
+              <w:rPr>
+                <w:rFonts w:ascii="Calibri" w:cs="Calibri" w:eastAsia="Calibri" w:hAnsi="Calibri"/>
+                <w:color w:val="000000"/>
+                <w:sz w:val="19"/>
+                <w:szCs w:val="19"/>
+              </w:rPr>
+              <w:t xml:space="preserve"> </w:t>
+            </w:r>
+            <w:r>
+              <w:rPr>
+                <w:rFonts w:ascii="Calibri" w:cs="Calibri" w:eastAsia="Calibri" w:hAnsi="Calibri"/>
+                <w:color w:val="000000"/>
+                <w:sz w:val="19"/>
+                <w:szCs w:val="19"/>
+              </w:rPr>
+              <w:t xml:space="preserve">der</w:t>
+            </w:r>
+            <w:r>
+              <w:rPr>
+                <w:rFonts w:ascii="Calibri" w:cs="Calibri" w:eastAsia="Calibri" w:hAnsi="Calibri"/>
+                <w:color w:val="000000"/>
+                <w:sz w:val="19"/>
+                <w:szCs w:val="19"/>
+              </w:rPr>
+              <w:t xml:space="preserve"> </w:t>
+            </w:r>
+            <w:r>
+              <w:rPr>
+                <w:rFonts w:ascii="Calibri" w:cs="Calibri" w:eastAsia="Calibri" w:hAnsi="Calibri"/>
+                <w:b/>
+                <w:bCs/>
+                <w:color w:val="D9534F"/>
+                <w:sz w:val="19"/>
+                <w:szCs w:val="19"/>
+              </w:rPr>
+              <w:t xml:space="preserve">Vater</w:t>
+            </w:r>
+            <w:r>
+              <w:rPr>
+                <w:rFonts w:ascii="Calibri" w:cs="Calibri" w:eastAsia="Calibri" w:hAnsi="Calibri"/>
+                <w:color w:val="000000"/>
+                <w:sz w:val="19"/>
+                <w:szCs w:val="19"/>
+              </w:rPr>
+              <w:t xml:space="preserve"> </w:t>
+            </w:r>
+            <w:r>
+              <w:rPr>
+                <w:rFonts w:ascii="Calibri" w:cs="Calibri" w:eastAsia="Calibri" w:hAnsi="Calibri"/>
+                <w:color w:val="000000"/>
+                <w:sz w:val="19"/>
+                <w:szCs w:val="19"/>
+              </w:rPr>
+              <w:t xml:space="preserve">von</w:t>
+            </w:r>
+            <w:r>
+              <w:rPr>
+                <w:rFonts w:ascii="Calibri" w:cs="Calibri" w:eastAsia="Calibri" w:hAnsi="Calibri"/>
+                <w:color w:val="000000"/>
+                <w:sz w:val="19"/>
+                <w:szCs w:val="19"/>
+              </w:rPr>
+              <w:t xml:space="preserve"> </w:t>
+            </w:r>
+            <w:r>
+              <w:rPr>
+                <w:rFonts w:ascii="Calibri" w:cs="Calibri" w:eastAsia="Calibri" w:hAnsi="Calibri"/>
+                <w:color w:val="000000"/>
+                <w:sz w:val="19"/>
+                <w:szCs w:val="19"/>
+              </w:rPr>
+              <w:t xml:space="preserve">Kafka</w:t>
+            </w:r>
+            <w:r>
+              <w:rPr>
+                <w:rFonts w:ascii="Calibri" w:cs="Calibri" w:eastAsia="Calibri" w:hAnsi="Calibri"/>
+                <w:color w:val="000000"/>
+                <w:sz w:val="19"/>
+                <w:szCs w:val="19"/>
+              </w:rPr>
+              <w:t xml:space="preserve"> </w:t>
+            </w:r>
+            <w:r>
+              <w:rPr>
+                <w:rFonts w:ascii="Calibri" w:cs="Calibri" w:eastAsia="Calibri" w:hAnsi="Calibri"/>
+                <w:color w:val="000000"/>
+                <w:sz w:val="19"/>
+                <w:szCs w:val="19"/>
+              </w:rPr>
+              <w:t xml:space="preserve">einfach</w:t>
+            </w:r>
+            <w:r>
+              <w:rPr>
+                <w:rFonts w:ascii="Calibri" w:cs="Calibri" w:eastAsia="Calibri" w:hAnsi="Calibri"/>
+                <w:color w:val="000000"/>
+                <w:sz w:val="19"/>
+                <w:szCs w:val="19"/>
+              </w:rPr>
+              <w:t xml:space="preserve"> </w:t>
+            </w:r>
+            <w:r>
+              <w:rPr>
+                <w:rFonts w:ascii="Calibri" w:cs="Calibri" w:eastAsia="Calibri" w:hAnsi="Calibri"/>
+                <w:color w:val="000000"/>
+                <w:sz w:val="19"/>
+                <w:szCs w:val="19"/>
+              </w:rPr>
+              <w:t xml:space="preserve">keine</w:t>
+            </w:r>
+            <w:r>
+              <w:rPr>
+                <w:rFonts w:ascii="Calibri" w:cs="Calibri" w:eastAsia="Calibri" w:hAnsi="Calibri"/>
+                <w:color w:val="000000"/>
+                <w:sz w:val="19"/>
+                <w:szCs w:val="19"/>
+              </w:rPr>
+              <w:t xml:space="preserve"> </w:t>
+            </w:r>
+            <w:r>
+              <w:rPr>
+                <w:rFonts w:ascii="Calibri" w:cs="Calibri" w:eastAsia="Calibri" w:hAnsi="Calibri"/>
+                <w:b/>
+                <w:bCs/>
+                <w:color w:val="D9534F"/>
+                <w:sz w:val="19"/>
+                <w:szCs w:val="19"/>
+              </w:rPr>
+              <w:t xml:space="preserve">Geduld</w:t>
+            </w:r>
+            <w:r>
+              <w:rPr>
+                <w:rFonts w:ascii="Calibri" w:cs="Calibri" w:eastAsia="Calibri" w:hAnsi="Calibri"/>
+                <w:color w:val="000000"/>
+                <w:sz w:val="19"/>
+                <w:szCs w:val="19"/>
+              </w:rPr>
+              <w:t xml:space="preserve"> </w:t>
+            </w:r>
+            <w:r>
+              <w:rPr>
+                <w:rFonts w:ascii="Calibri" w:cs="Calibri" w:eastAsia="Calibri" w:hAnsi="Calibri"/>
+                <w:color w:val="000000"/>
+                <w:sz w:val="19"/>
+                <w:szCs w:val="19"/>
+              </w:rPr>
+              <w:t xml:space="preserve">hatte</w:t>
+            </w:r>
+            <w:r>
+              <w:rPr>
+                <w:rFonts w:ascii="Calibri" w:cs="Calibri" w:eastAsia="Calibri" w:hAnsi="Calibri"/>
+                <w:color w:val="000000"/>
+                <w:sz w:val="19"/>
+                <w:szCs w:val="19"/>
+              </w:rPr>
+              <w:t xml:space="preserve">.</w:t>
+            </w:r>
+            <w:r>
+              <w:rPr>
+                <w:rFonts w:ascii="Calibri" w:cs="Calibri" w:eastAsia="Calibri" w:hAnsi="Calibri"/>
+                <w:color w:val="000000"/>
+                <w:sz w:val="19"/>
+                <w:szCs w:val="19"/>
+              </w:rPr>
+              <w:t xml:space="preserve"/>
+            </w:r>
+          </w:p>
+        </w:tc>
+        <w:tc>
+          <w:tcPr>
+            <w:tcW w:type="dxa" w:w="7338"/>
+            <w:tcBorders>
+              <w:top w:val="single" w:color="B9C6E8" w:sz="6"/>
+              <w:left w:val="single" w:color="B9C6E8" w:sz="6"/>
+              <w:bottom w:val="single" w:color="B9C6E8" w:sz="6"/>
+              <w:right w:val="single" w:color="B9C6E8" w:sz="6"/>
+            </w:tcBorders>
+            <w:tcMar>
+              <w:top w:type="dxa" w:w="60"/>
+              <w:left w:type="dxa" w:w="120"/>
+              <w:bottom w:type="dxa" w:w="60"/>
+              <w:right w:type="dxa" w:w="120"/>
+            </w:tcMar>
+            <w:vAlign w:val="top"/>
+          </w:tcPr>
+          <w:p>
+            <w:pPr>
+              <w:spacing w:after="0" w:before="0"/>
+            </w:pPr>
+            <w:r>
+              <w:rPr>
+                <w:rFonts w:ascii="Calibri" w:cs="Calibri" w:eastAsia="Calibri" w:hAnsi="Calibri"/>
+                <w:color w:val="000000"/>
+                <w:sz w:val="17"/>
+                <w:szCs w:val="17"/>
+              </w:rPr>
+              <w:t xml:space="preserve">groß: Vater, Geduld (Artikelprobe) · Komma vor dem Nebensatz (Verb am Ende)</w:t>
+            </w:r>
+          </w:p>
+        </w:tc>
+      </w:tr>
+      <w:tr>
+        <w:trPr>
+          <w:cantSplit/>
+        </w:trPr>
+        <w:tc>
+          <w:tcPr>
+            <w:tcW w:type="dxa" w:w="700"/>
+            <w:tcBorders>
+              <w:top w:val="single" w:color="B9C6E8" w:sz="6"/>
+              <w:left w:val="single" w:color="B9C6E8" w:sz="6"/>
+              <w:bottom w:val="single" w:color="B9C6E8" w:sz="6"/>
+              <w:right w:val="single" w:color="B9C6E8" w:sz="6"/>
+            </w:tcBorders>
+            <w:shd w:fill="F4F7FD" w:color="auto" w:val="clear"/>
+            <w:tcMar>
+              <w:top w:type="dxa" w:w="60"/>
+              <w:left w:type="dxa" w:w="120"/>
+              <w:bottom w:type="dxa" w:w="60"/>
+              <w:right w:type="dxa" w:w="120"/>
+            </w:tcMar>
+            <w:vAlign w:val="top"/>
+          </w:tcPr>
+          <w:p>
+            <w:pPr>
+              <w:spacing w:after="0" w:before="0"/>
+            </w:pPr>
+            <w:r>
+              <w:rPr>
+                <w:rFonts w:ascii="Calibri" w:cs="Calibri" w:eastAsia="Calibri" w:hAnsi="Calibri"/>
+                <w:b/>
+                <w:bCs/>
+                <w:color w:val="1E2761"/>
+                <w:sz w:val="18"/>
+                <w:szCs w:val="18"/>
+              </w:rPr>
+              <w:t xml:space="preserve">2</w:t>
+            </w:r>
+          </w:p>
+        </w:tc>
+        <w:tc>
+          <w:tcPr>
+            <w:tcW w:type="dxa" w:w="7300"/>
+            <w:tcBorders>
+              <w:top w:val="single" w:color="B9C6E8" w:sz="6"/>
+              <w:left w:val="single" w:color="B9C6E8" w:sz="6"/>
+              <w:bottom w:val="single" w:color="B9C6E8" w:sz="6"/>
+              <w:right w:val="single" w:color="B9C6E8" w:sz="6"/>
+            </w:tcBorders>
+            <w:tcMar>
+              <w:top w:type="dxa" w:w="60"/>
+              <w:left w:type="dxa" w:w="120"/>
+              <w:bottom w:type="dxa" w:w="60"/>
+              <w:right w:type="dxa" w:w="120"/>
+            </w:tcMar>
+            <w:vAlign w:val="top"/>
+          </w:tcPr>
+          <w:p>
+            <w:pPr>
+              <w:spacing w:after="0" w:before="0"/>
+            </w:pPr>
+            <w:r>
+              <w:rPr>
+                <w:rFonts w:ascii="Calibri" w:cs="Calibri" w:eastAsia="Calibri" w:hAnsi="Calibri"/>
+                <w:b/>
+                <w:bCs/>
+                <w:color w:val="5B6B8C"/>
+                <w:sz w:val="18"/>
+                <w:szCs w:val="18"/>
+              </w:rPr>
+              <w:t xml:space="preserve">Jonas: </w:t>
+            </w:r>
+            <w:r>
+              <w:rPr>
+                <w:rFonts w:ascii="Calibri" w:cs="Calibri" w:eastAsia="Calibri" w:hAnsi="Calibri"/>
+                <w:color w:val="000000"/>
+                <w:sz w:val="19"/>
+                <w:szCs w:val="19"/>
+              </w:rPr>
+              <w:t xml:space="preserve">Ja,</w:t>
+            </w:r>
+            <w:r>
+              <w:rPr>
+                <w:rFonts w:ascii="Calibri" w:cs="Calibri" w:eastAsia="Calibri" w:hAnsi="Calibri"/>
+                <w:color w:val="000000"/>
+                <w:sz w:val="19"/>
+                <w:szCs w:val="19"/>
+              </w:rPr>
+              <w:t xml:space="preserve"> </w:t>
+            </w:r>
+            <w:r>
+              <w:rPr>
+                <w:rFonts w:ascii="Calibri" w:cs="Calibri" w:eastAsia="Calibri" w:hAnsi="Calibri"/>
+                <w:color w:val="000000"/>
+                <w:sz w:val="19"/>
+                <w:szCs w:val="19"/>
+              </w:rPr>
+              <w:t xml:space="preserve">aber</w:t>
+            </w:r>
+            <w:r>
+              <w:rPr>
+                <w:rFonts w:ascii="Calibri" w:cs="Calibri" w:eastAsia="Calibri" w:hAnsi="Calibri"/>
+                <w:color w:val="000000"/>
+                <w:sz w:val="19"/>
+                <w:szCs w:val="19"/>
+              </w:rPr>
+              <w:t xml:space="preserve"> </w:t>
+            </w:r>
+            <w:r>
+              <w:rPr>
+                <w:rFonts w:ascii="Calibri" w:cs="Calibri" w:eastAsia="Calibri" w:hAnsi="Calibri"/>
+                <w:color w:val="000000"/>
+                <w:sz w:val="19"/>
+                <w:szCs w:val="19"/>
+              </w:rPr>
+              <w:t xml:space="preserve">Kafka</w:t>
+            </w:r>
+            <w:r>
+              <w:rPr>
+                <w:rFonts w:ascii="Calibri" w:cs="Calibri" w:eastAsia="Calibri" w:hAnsi="Calibri"/>
+                <w:color w:val="000000"/>
+                <w:sz w:val="19"/>
+                <w:szCs w:val="19"/>
+              </w:rPr>
+              <w:t xml:space="preserve"> </w:t>
+            </w:r>
+            <w:r>
+              <w:rPr>
+                <w:rFonts w:ascii="Calibri" w:cs="Calibri" w:eastAsia="Calibri" w:hAnsi="Calibri"/>
+                <w:color w:val="000000"/>
+                <w:sz w:val="19"/>
+                <w:szCs w:val="19"/>
+              </w:rPr>
+              <w:t xml:space="preserve">hatte</w:t>
+            </w:r>
+            <w:r>
+              <w:rPr>
+                <w:rFonts w:ascii="Calibri" w:cs="Calibri" w:eastAsia="Calibri" w:hAnsi="Calibri"/>
+                <w:color w:val="000000"/>
+                <w:sz w:val="19"/>
+                <w:szCs w:val="19"/>
+              </w:rPr>
+              <w:t xml:space="preserve"> </w:t>
+            </w:r>
+            <w:r>
+              <w:rPr>
+                <w:rFonts w:ascii="Calibri" w:cs="Calibri" w:eastAsia="Calibri" w:hAnsi="Calibri"/>
+                <w:color w:val="000000"/>
+                <w:sz w:val="19"/>
+                <w:szCs w:val="19"/>
+              </w:rPr>
+              <w:t xml:space="preserve">auch</w:t>
+            </w:r>
+            <w:r>
+              <w:rPr>
+                <w:rFonts w:ascii="Calibri" w:cs="Calibri" w:eastAsia="Calibri" w:hAnsi="Calibri"/>
+                <w:color w:val="000000"/>
+                <w:sz w:val="19"/>
+                <w:szCs w:val="19"/>
+              </w:rPr>
+              <w:t xml:space="preserve"> </w:t>
+            </w:r>
+            <w:r>
+              <w:rPr>
+                <w:rFonts w:ascii="Calibri" w:cs="Calibri" w:eastAsia="Calibri" w:hAnsi="Calibri"/>
+                <w:b/>
+                <w:bCs/>
+                <w:color w:val="D9534F"/>
+                <w:sz w:val="19"/>
+                <w:szCs w:val="19"/>
+              </w:rPr>
+              <w:t xml:space="preserve">Angst</w:t>
+            </w:r>
+            <w:r>
+              <w:rPr>
+                <w:rFonts w:ascii="Calibri" w:cs="Calibri" w:eastAsia="Calibri" w:hAnsi="Calibri"/>
+                <w:color w:val="000000"/>
+                <w:sz w:val="19"/>
+                <w:szCs w:val="19"/>
+              </w:rPr>
+              <w:t xml:space="preserve">.</w:t>
+            </w:r>
+            <w:r>
+              <w:rPr>
+                <w:rFonts w:ascii="Calibri" w:cs="Calibri" w:eastAsia="Calibri" w:hAnsi="Calibri"/>
+                <w:color w:val="000000"/>
+                <w:sz w:val="19"/>
+                <w:szCs w:val="19"/>
+              </w:rPr>
+              <w:t xml:space="preserve"> </w:t>
+            </w:r>
+            <w:r>
+              <w:rPr>
+                <w:rFonts w:ascii="Calibri" w:cs="Calibri" w:eastAsia="Calibri" w:hAnsi="Calibri"/>
+                <w:color w:val="000000"/>
+                <w:sz w:val="19"/>
+                <w:szCs w:val="19"/>
+              </w:rPr>
+              <w:t xml:space="preserve">Er</w:t>
+            </w:r>
+            <w:r>
+              <w:rPr>
+                <w:rFonts w:ascii="Calibri" w:cs="Calibri" w:eastAsia="Calibri" w:hAnsi="Calibri"/>
+                <w:color w:val="000000"/>
+                <w:sz w:val="19"/>
+                <w:szCs w:val="19"/>
+              </w:rPr>
+              <w:t xml:space="preserve"> </w:t>
+            </w:r>
+            <w:r>
+              <w:rPr>
+                <w:rFonts w:ascii="Calibri" w:cs="Calibri" w:eastAsia="Calibri" w:hAnsi="Calibri"/>
+                <w:color w:val="000000"/>
+                <w:sz w:val="19"/>
+                <w:szCs w:val="19"/>
+              </w:rPr>
+              <w:t xml:space="preserve">schreibt</w:t>
+            </w:r>
+            <w:r>
+              <w:rPr>
+                <w:rFonts w:ascii="Calibri" w:cs="Calibri" w:eastAsia="Calibri" w:hAnsi="Calibri"/>
+                <w:b/>
+                <w:bCs/>
+                <w:color w:val="D9534F"/>
+                <w:sz w:val="19"/>
+                <w:szCs w:val="19"/>
+              </w:rPr>
+              <w:t xml:space="preserve">,</w:t>
+            </w:r>
+            <w:r>
+              <w:rPr>
+                <w:rFonts w:ascii="Calibri" w:cs="Calibri" w:eastAsia="Calibri" w:hAnsi="Calibri"/>
+                <w:color w:val="000000"/>
+                <w:sz w:val="19"/>
+                <w:szCs w:val="19"/>
+              </w:rPr>
+              <w:t xml:space="preserve"> </w:t>
+            </w:r>
+            <w:r>
+              <w:rPr>
+                <w:rFonts w:ascii="Calibri" w:cs="Calibri" w:eastAsia="Calibri" w:hAnsi="Calibri"/>
+                <w:color w:val="000000"/>
+                <w:sz w:val="19"/>
+                <w:szCs w:val="19"/>
+              </w:rPr>
+              <w:t xml:space="preserve">dass</w:t>
+            </w:r>
+            <w:r>
+              <w:rPr>
+                <w:rFonts w:ascii="Calibri" w:cs="Calibri" w:eastAsia="Calibri" w:hAnsi="Calibri"/>
+                <w:color w:val="000000"/>
+                <w:sz w:val="19"/>
+                <w:szCs w:val="19"/>
+              </w:rPr>
+              <w:t xml:space="preserve"> </w:t>
+            </w:r>
+            <w:r>
+              <w:rPr>
+                <w:rFonts w:ascii="Calibri" w:cs="Calibri" w:eastAsia="Calibri" w:hAnsi="Calibri"/>
+                <w:color w:val="000000"/>
+                <w:sz w:val="19"/>
+                <w:szCs w:val="19"/>
+              </w:rPr>
+              <w:t xml:space="preserve">er</w:t>
+            </w:r>
+            <w:r>
+              <w:rPr>
+                <w:rFonts w:ascii="Calibri" w:cs="Calibri" w:eastAsia="Calibri" w:hAnsi="Calibri"/>
+                <w:color w:val="000000"/>
+                <w:sz w:val="19"/>
+                <w:szCs w:val="19"/>
+              </w:rPr>
+              <w:t xml:space="preserve"> </w:t>
+            </w:r>
+            <w:r>
+              <w:rPr>
+                <w:rFonts w:ascii="Calibri" w:cs="Calibri" w:eastAsia="Calibri" w:hAnsi="Calibri"/>
+                <w:color w:val="000000"/>
+                <w:sz w:val="19"/>
+                <w:szCs w:val="19"/>
+              </w:rPr>
+              <w:t xml:space="preserve">als</w:t>
+            </w:r>
+            <w:r>
+              <w:rPr>
+                <w:rFonts w:ascii="Calibri" w:cs="Calibri" w:eastAsia="Calibri" w:hAnsi="Calibri"/>
+                <w:color w:val="000000"/>
+                <w:sz w:val="19"/>
+                <w:szCs w:val="19"/>
+              </w:rPr>
+              <w:t xml:space="preserve"> </w:t>
+            </w:r>
+            <w:r>
+              <w:rPr>
+                <w:rFonts w:ascii="Calibri" w:cs="Calibri" w:eastAsia="Calibri" w:hAnsi="Calibri"/>
+                <w:b/>
+                <w:bCs/>
+                <w:color w:val="D9534F"/>
+                <w:sz w:val="19"/>
+                <w:szCs w:val="19"/>
+              </w:rPr>
+              <w:t xml:space="preserve">Kind</w:t>
+            </w:r>
+            <w:r>
+              <w:rPr>
+                <w:rFonts w:ascii="Calibri" w:cs="Calibri" w:eastAsia="Calibri" w:hAnsi="Calibri"/>
+                <w:color w:val="000000"/>
+                <w:sz w:val="19"/>
+                <w:szCs w:val="19"/>
+              </w:rPr>
+              <w:t xml:space="preserve"> </w:t>
+            </w:r>
+            <w:r>
+              <w:rPr>
+                <w:rFonts w:ascii="Calibri" w:cs="Calibri" w:eastAsia="Calibri" w:hAnsi="Calibri"/>
+                <w:color w:val="000000"/>
+                <w:sz w:val="19"/>
+                <w:szCs w:val="19"/>
+              </w:rPr>
+              <w:t xml:space="preserve">nur</w:t>
+            </w:r>
+            <w:r>
+              <w:rPr>
+                <w:rFonts w:ascii="Calibri" w:cs="Calibri" w:eastAsia="Calibri" w:hAnsi="Calibri"/>
+                <w:color w:val="000000"/>
+                <w:sz w:val="19"/>
+                <w:szCs w:val="19"/>
+              </w:rPr>
+              <w:t xml:space="preserve"> </w:t>
+            </w:r>
+            <w:r>
+              <w:rPr>
+                <w:rFonts w:ascii="Calibri" w:cs="Calibri" w:eastAsia="Calibri" w:hAnsi="Calibri"/>
+                <w:color w:val="000000"/>
+                <w:sz w:val="19"/>
+                <w:szCs w:val="19"/>
+              </w:rPr>
+              <w:t xml:space="preserve">ein</w:t>
+            </w:r>
+            <w:r>
+              <w:rPr>
+                <w:rFonts w:ascii="Calibri" w:cs="Calibri" w:eastAsia="Calibri" w:hAnsi="Calibri"/>
+                <w:color w:val="000000"/>
+                <w:sz w:val="19"/>
+                <w:szCs w:val="19"/>
+              </w:rPr>
+              <w:t xml:space="preserve"> </w:t>
+            </w:r>
+            <w:r>
+              <w:rPr>
+                <w:rFonts w:ascii="Calibri" w:cs="Calibri" w:eastAsia="Calibri" w:hAnsi="Calibri"/>
+                <w:color w:val="000000"/>
+                <w:sz w:val="19"/>
+                <w:szCs w:val="19"/>
+              </w:rPr>
+              <w:t xml:space="preserve">freundliches</w:t>
+            </w:r>
+            <w:r>
+              <w:rPr>
+                <w:rFonts w:ascii="Calibri" w:cs="Calibri" w:eastAsia="Calibri" w:hAnsi="Calibri"/>
+                <w:color w:val="000000"/>
+                <w:sz w:val="19"/>
+                <w:szCs w:val="19"/>
+              </w:rPr>
+              <w:t xml:space="preserve"> </w:t>
+            </w:r>
+            <w:r>
+              <w:rPr>
+                <w:rFonts w:ascii="Calibri" w:cs="Calibri" w:eastAsia="Calibri" w:hAnsi="Calibri"/>
+                <w:b/>
+                <w:bCs/>
+                <w:color w:val="D9534F"/>
+                <w:sz w:val="19"/>
+                <w:szCs w:val="19"/>
+              </w:rPr>
+              <w:t xml:space="preserve">Wort</w:t>
+            </w:r>
+            <w:r>
+              <w:rPr>
+                <w:rFonts w:ascii="Calibri" w:cs="Calibri" w:eastAsia="Calibri" w:hAnsi="Calibri"/>
+                <w:color w:val="000000"/>
+                <w:sz w:val="19"/>
+                <w:szCs w:val="19"/>
+              </w:rPr>
+              <w:t xml:space="preserve"> </w:t>
+            </w:r>
+            <w:r>
+              <w:rPr>
+                <w:rFonts w:ascii="Calibri" w:cs="Calibri" w:eastAsia="Calibri" w:hAnsi="Calibri"/>
+                <w:color w:val="000000"/>
+                <w:sz w:val="19"/>
+                <w:szCs w:val="19"/>
+              </w:rPr>
+              <w:t xml:space="preserve">gebraucht</w:t>
+            </w:r>
+            <w:r>
+              <w:rPr>
+                <w:rFonts w:ascii="Calibri" w:cs="Calibri" w:eastAsia="Calibri" w:hAnsi="Calibri"/>
+                <w:color w:val="000000"/>
+                <w:sz w:val="19"/>
+                <w:szCs w:val="19"/>
+              </w:rPr>
+              <w:t xml:space="preserve"> </w:t>
+            </w:r>
+            <w:r>
+              <w:rPr>
+                <w:rFonts w:ascii="Calibri" w:cs="Calibri" w:eastAsia="Calibri" w:hAnsi="Calibri"/>
+                <w:color w:val="000000"/>
+                <w:sz w:val="19"/>
+                <w:szCs w:val="19"/>
+              </w:rPr>
+              <w:t xml:space="preserve">hätte</w:t>
+            </w:r>
+            <w:r>
+              <w:rPr>
+                <w:rFonts w:ascii="Calibri" w:cs="Calibri" w:eastAsia="Calibri" w:hAnsi="Calibri"/>
+                <w:color w:val="000000"/>
+                <w:sz w:val="19"/>
+                <w:szCs w:val="19"/>
+              </w:rPr>
+              <w:t xml:space="preserve">.</w:t>
+            </w:r>
+            <w:r>
+              <w:rPr>
+                <w:rFonts w:ascii="Calibri" w:cs="Calibri" w:eastAsia="Calibri" w:hAnsi="Calibri"/>
+                <w:color w:val="000000"/>
+                <w:sz w:val="19"/>
+                <w:szCs w:val="19"/>
+              </w:rPr>
+              <w:t xml:space="preserve"/>
+            </w:r>
+          </w:p>
+        </w:tc>
+        <w:tc>
+          <w:tcPr>
+            <w:tcW w:type="dxa" w:w="7338"/>
+            <w:tcBorders>
+              <w:top w:val="single" w:color="B9C6E8" w:sz="6"/>
+              <w:left w:val="single" w:color="B9C6E8" w:sz="6"/>
+              <w:bottom w:val="single" w:color="B9C6E8" w:sz="6"/>
+              <w:right w:val="single" w:color="B9C6E8" w:sz="6"/>
+            </w:tcBorders>
+            <w:tcMar>
+              <w:top w:type="dxa" w:w="60"/>
+              <w:left w:type="dxa" w:w="120"/>
+              <w:bottom w:type="dxa" w:w="60"/>
+              <w:right w:type="dxa" w:w="120"/>
+            </w:tcMar>
+            <w:vAlign w:val="top"/>
+          </w:tcPr>
+          <w:p>
+            <w:pPr>
+              <w:spacing w:after="0" w:before="0"/>
+            </w:pPr>
+            <w:r>
+              <w:rPr>
+                <w:rFonts w:ascii="Calibri" w:cs="Calibri" w:eastAsia="Calibri" w:hAnsi="Calibri"/>
+                <w:color w:val="000000"/>
+                <w:sz w:val="17"/>
+                <w:szCs w:val="17"/>
+              </w:rPr>
+              <w:t xml:space="preserve">groß: Angst, Kind, Wort (Artikelprobe) · Komma vor dem Nebensatz (Verb am Ende)</w:t>
+            </w:r>
+          </w:p>
+        </w:tc>
+      </w:tr>
+      <w:tr>
+        <w:trPr>
+          <w:cantSplit/>
+        </w:trPr>
+        <w:tc>
+          <w:tcPr>
+            <w:tcW w:type="dxa" w:w="700"/>
+            <w:tcBorders>
+              <w:top w:val="single" w:color="B9C6E8" w:sz="6"/>
+              <w:left w:val="single" w:color="B9C6E8" w:sz="6"/>
+              <w:bottom w:val="single" w:color="B9C6E8" w:sz="6"/>
+              <w:right w:val="single" w:color="B9C6E8" w:sz="6"/>
+            </w:tcBorders>
+            <w:shd w:fill="F4F7FD" w:color="auto" w:val="clear"/>
+            <w:tcMar>
+              <w:top w:type="dxa" w:w="60"/>
+              <w:left w:type="dxa" w:w="120"/>
+              <w:bottom w:type="dxa" w:w="60"/>
+              <w:right w:type="dxa" w:w="120"/>
+            </w:tcMar>
+            <w:vAlign w:val="top"/>
+          </w:tcPr>
+          <w:p>
+            <w:pPr>
+              <w:spacing w:after="0" w:before="0"/>
+            </w:pPr>
+            <w:r>
+              <w:rPr>
+                <w:rFonts w:ascii="Calibri" w:cs="Calibri" w:eastAsia="Calibri" w:hAnsi="Calibri"/>
+                <w:b/>
+                <w:bCs/>
+                <w:color w:val="1E2761"/>
+                <w:sz w:val="18"/>
+                <w:szCs w:val="18"/>
+              </w:rPr>
+              <w:t xml:space="preserve">3</w:t>
+            </w:r>
+          </w:p>
+        </w:tc>
+        <w:tc>
+          <w:tcPr>
+            <w:tcW w:type="dxa" w:w="7300"/>
+            <w:tcBorders>
+              <w:top w:val="single" w:color="B9C6E8" w:sz="6"/>
+              <w:left w:val="single" w:color="B9C6E8" w:sz="6"/>
+              <w:bottom w:val="single" w:color="B9C6E8" w:sz="6"/>
+              <w:right w:val="single" w:color="B9C6E8" w:sz="6"/>
+            </w:tcBorders>
+            <w:tcMar>
+              <w:top w:type="dxa" w:w="60"/>
+              <w:left w:type="dxa" w:w="120"/>
+              <w:bottom w:type="dxa" w:w="60"/>
+              <w:right w:type="dxa" w:w="120"/>
+            </w:tcMar>
+            <w:vAlign w:val="top"/>
+          </w:tcPr>
+          <w:p>
+            <w:pPr>
+              <w:spacing w:after="0" w:before="0"/>
+            </w:pPr>
+            <w:r>
+              <w:rPr>
+                <w:rFonts w:ascii="Calibri" w:cs="Calibri" w:eastAsia="Calibri" w:hAnsi="Calibri"/>
+                <w:b/>
+                <w:bCs/>
+                <w:color w:val="5B6B8C"/>
+                <w:sz w:val="18"/>
+                <w:szCs w:val="18"/>
+              </w:rPr>
+              <w:t xml:space="preserve">Mia: </w:t>
+            </w:r>
+            <w:r>
+              <w:rPr>
+                <w:rFonts w:ascii="Calibri" w:cs="Calibri" w:eastAsia="Calibri" w:hAnsi="Calibri"/>
+                <w:color w:val="000000"/>
+                <w:sz w:val="19"/>
+                <w:szCs w:val="19"/>
+              </w:rPr>
+              <w:t xml:space="preserve">Das</w:t>
+            </w:r>
+            <w:r>
+              <w:rPr>
+                <w:rFonts w:ascii="Calibri" w:cs="Calibri" w:eastAsia="Calibri" w:hAnsi="Calibri"/>
+                <w:color w:val="000000"/>
+                <w:sz w:val="19"/>
+                <w:szCs w:val="19"/>
+              </w:rPr>
+              <w:t xml:space="preserve"> </w:t>
+            </w:r>
+            <w:r>
+              <w:rPr>
+                <w:rFonts w:ascii="Calibri" w:cs="Calibri" w:eastAsia="Calibri" w:hAnsi="Calibri"/>
+                <w:color w:val="000000"/>
+                <w:sz w:val="19"/>
+                <w:szCs w:val="19"/>
+              </w:rPr>
+              <w:t xml:space="preserve">finde</w:t>
+            </w:r>
+            <w:r>
+              <w:rPr>
+                <w:rFonts w:ascii="Calibri" w:cs="Calibri" w:eastAsia="Calibri" w:hAnsi="Calibri"/>
+                <w:color w:val="000000"/>
+                <w:sz w:val="19"/>
+                <w:szCs w:val="19"/>
+              </w:rPr>
+              <w:t xml:space="preserve"> </w:t>
+            </w:r>
+            <w:r>
+              <w:rPr>
+                <w:rFonts w:ascii="Calibri" w:cs="Calibri" w:eastAsia="Calibri" w:hAnsi="Calibri"/>
+                <w:color w:val="000000"/>
+                <w:sz w:val="19"/>
+                <w:szCs w:val="19"/>
+              </w:rPr>
+              <w:t xml:space="preserve">ich</w:t>
+            </w:r>
+            <w:r>
+              <w:rPr>
+                <w:rFonts w:ascii="Calibri" w:cs="Calibri" w:eastAsia="Calibri" w:hAnsi="Calibri"/>
+                <w:color w:val="000000"/>
+                <w:sz w:val="19"/>
+                <w:szCs w:val="19"/>
+              </w:rPr>
+              <w:t xml:space="preserve"> </w:t>
+            </w:r>
+            <w:r>
+              <w:rPr>
+                <w:rFonts w:ascii="Calibri" w:cs="Calibri" w:eastAsia="Calibri" w:hAnsi="Calibri"/>
+                <w:color w:val="000000"/>
+                <w:sz w:val="19"/>
+                <w:szCs w:val="19"/>
+              </w:rPr>
+              <w:t xml:space="preserve">traurig</w:t>
+            </w:r>
+            <w:r>
+              <w:rPr>
+                <w:rFonts w:ascii="Calibri" w:cs="Calibri" w:eastAsia="Calibri" w:hAnsi="Calibri"/>
+                <w:color w:val="000000"/>
+                <w:sz w:val="19"/>
+                <w:szCs w:val="19"/>
+              </w:rPr>
+              <w:t xml:space="preserve">.</w:t>
+            </w:r>
+            <w:r>
+              <w:rPr>
+                <w:rFonts w:ascii="Calibri" w:cs="Calibri" w:eastAsia="Calibri" w:hAnsi="Calibri"/>
+                <w:color w:val="000000"/>
+                <w:sz w:val="19"/>
+                <w:szCs w:val="19"/>
+              </w:rPr>
+              <w:t xml:space="preserve"> </w:t>
+            </w:r>
+            <w:r>
+              <w:rPr>
+                <w:rFonts w:ascii="Calibri" w:cs="Calibri" w:eastAsia="Calibri" w:hAnsi="Calibri"/>
+                <w:color w:val="000000"/>
+                <w:sz w:val="19"/>
+                <w:szCs w:val="19"/>
+              </w:rPr>
+              <w:t xml:space="preserve">Ich</w:t>
+            </w:r>
+            <w:r>
+              <w:rPr>
+                <w:rFonts w:ascii="Calibri" w:cs="Calibri" w:eastAsia="Calibri" w:hAnsi="Calibri"/>
+                <w:color w:val="000000"/>
+                <w:sz w:val="19"/>
+                <w:szCs w:val="19"/>
+              </w:rPr>
+              <w:t xml:space="preserve"> </w:t>
+            </w:r>
+            <w:r>
+              <w:rPr>
+                <w:rFonts w:ascii="Calibri" w:cs="Calibri" w:eastAsia="Calibri" w:hAnsi="Calibri"/>
+                <w:color w:val="000000"/>
+                <w:sz w:val="19"/>
+                <w:szCs w:val="19"/>
+              </w:rPr>
+              <w:t xml:space="preserve">wünsche</w:t>
+            </w:r>
+            <w:r>
+              <w:rPr>
+                <w:rFonts w:ascii="Calibri" w:cs="Calibri" w:eastAsia="Calibri" w:hAnsi="Calibri"/>
+                <w:color w:val="000000"/>
+                <w:sz w:val="19"/>
+                <w:szCs w:val="19"/>
+              </w:rPr>
+              <w:t xml:space="preserve"> </w:t>
+            </w:r>
+            <w:r>
+              <w:rPr>
+                <w:rFonts w:ascii="Calibri" w:cs="Calibri" w:eastAsia="Calibri" w:hAnsi="Calibri"/>
+                <w:color w:val="000000"/>
+                <w:sz w:val="19"/>
+                <w:szCs w:val="19"/>
+              </w:rPr>
+              <w:t xml:space="preserve">mir</w:t>
+            </w:r>
+            <w:r>
+              <w:rPr>
+                <w:rFonts w:ascii="Calibri" w:cs="Calibri" w:eastAsia="Calibri" w:hAnsi="Calibri"/>
+                <w:b/>
+                <w:bCs/>
+                <w:color w:val="D9534F"/>
+                <w:sz w:val="19"/>
+                <w:szCs w:val="19"/>
+              </w:rPr>
+              <w:t xml:space="preserve">,</w:t>
+            </w:r>
+            <w:r>
+              <w:rPr>
+                <w:rFonts w:ascii="Calibri" w:cs="Calibri" w:eastAsia="Calibri" w:hAnsi="Calibri"/>
+                <w:color w:val="000000"/>
+                <w:sz w:val="19"/>
+                <w:szCs w:val="19"/>
+              </w:rPr>
+              <w:t xml:space="preserve"> </w:t>
+            </w:r>
+            <w:r>
+              <w:rPr>
+                <w:rFonts w:ascii="Calibri" w:cs="Calibri" w:eastAsia="Calibri" w:hAnsi="Calibri"/>
+                <w:color w:val="000000"/>
+                <w:sz w:val="19"/>
+                <w:szCs w:val="19"/>
+              </w:rPr>
+              <w:t xml:space="preserve">dass</w:t>
+            </w:r>
+            <w:r>
+              <w:rPr>
+                <w:rFonts w:ascii="Calibri" w:cs="Calibri" w:eastAsia="Calibri" w:hAnsi="Calibri"/>
+                <w:color w:val="000000"/>
+                <w:sz w:val="19"/>
+                <w:szCs w:val="19"/>
+              </w:rPr>
+              <w:t xml:space="preserve"> </w:t>
+            </w:r>
+            <w:r>
+              <w:rPr>
+                <w:rFonts w:ascii="Calibri" w:cs="Calibri" w:eastAsia="Calibri" w:hAnsi="Calibri"/>
+                <w:color w:val="000000"/>
+                <w:sz w:val="19"/>
+                <w:szCs w:val="19"/>
+              </w:rPr>
+              <w:t xml:space="preserve">mein</w:t>
+            </w:r>
+            <w:r>
+              <w:rPr>
+                <w:rFonts w:ascii="Calibri" w:cs="Calibri" w:eastAsia="Calibri" w:hAnsi="Calibri"/>
+                <w:color w:val="000000"/>
+                <w:sz w:val="19"/>
+                <w:szCs w:val="19"/>
+              </w:rPr>
+              <w:t xml:space="preserve"> </w:t>
+            </w:r>
+            <w:r>
+              <w:rPr>
+                <w:rFonts w:ascii="Calibri" w:cs="Calibri" w:eastAsia="Calibri" w:hAnsi="Calibri"/>
+                <w:b/>
+                <w:bCs/>
+                <w:color w:val="D9534F"/>
+                <w:sz w:val="19"/>
+                <w:szCs w:val="19"/>
+              </w:rPr>
+              <w:t xml:space="preserve">Vater</w:t>
+            </w:r>
+            <w:r>
+              <w:rPr>
+                <w:rFonts w:ascii="Calibri" w:cs="Calibri" w:eastAsia="Calibri" w:hAnsi="Calibri"/>
+                <w:color w:val="000000"/>
+                <w:sz w:val="19"/>
+                <w:szCs w:val="19"/>
+              </w:rPr>
+              <w:t xml:space="preserve"> </w:t>
+            </w:r>
+            <w:r>
+              <w:rPr>
+                <w:rFonts w:ascii="Calibri" w:cs="Calibri" w:eastAsia="Calibri" w:hAnsi="Calibri"/>
+                <w:color w:val="000000"/>
+                <w:sz w:val="19"/>
+                <w:szCs w:val="19"/>
+              </w:rPr>
+              <w:t xml:space="preserve">beim</w:t>
+            </w:r>
+            <w:r>
+              <w:rPr>
+                <w:rFonts w:ascii="Calibri" w:cs="Calibri" w:eastAsia="Calibri" w:hAnsi="Calibri"/>
+                <w:color w:val="000000"/>
+                <w:sz w:val="19"/>
+                <w:szCs w:val="19"/>
+              </w:rPr>
+              <w:t xml:space="preserve"> </w:t>
+            </w:r>
+            <w:r>
+              <w:rPr>
+                <w:rFonts w:ascii="Calibri" w:cs="Calibri" w:eastAsia="Calibri" w:hAnsi="Calibri"/>
+                <w:b/>
+                <w:bCs/>
+                <w:color w:val="D9534F"/>
+                <w:sz w:val="19"/>
+                <w:szCs w:val="19"/>
+              </w:rPr>
+              <w:t xml:space="preserve">Zuhören</w:t>
+            </w:r>
+            <w:r>
+              <w:rPr>
+                <w:rFonts w:ascii="Calibri" w:cs="Calibri" w:eastAsia="Calibri" w:hAnsi="Calibri"/>
+                <w:color w:val="000000"/>
+                <w:sz w:val="19"/>
+                <w:szCs w:val="19"/>
+              </w:rPr>
+              <w:t xml:space="preserve"> </w:t>
+            </w:r>
+            <w:r>
+              <w:rPr>
+                <w:rFonts w:ascii="Calibri" w:cs="Calibri" w:eastAsia="Calibri" w:hAnsi="Calibri"/>
+                <w:color w:val="000000"/>
+                <w:sz w:val="19"/>
+                <w:szCs w:val="19"/>
+              </w:rPr>
+              <w:t xml:space="preserve">auch</w:t>
+            </w:r>
+            <w:r>
+              <w:rPr>
+                <w:rFonts w:ascii="Calibri" w:cs="Calibri" w:eastAsia="Calibri" w:hAnsi="Calibri"/>
+                <w:color w:val="000000"/>
+                <w:sz w:val="19"/>
+                <w:szCs w:val="19"/>
+              </w:rPr>
+              <w:t xml:space="preserve"> </w:t>
+            </w:r>
+            <w:r>
+              <w:rPr>
+                <w:rFonts w:ascii="Calibri" w:cs="Calibri" w:eastAsia="Calibri" w:hAnsi="Calibri"/>
+                <w:color w:val="000000"/>
+                <w:sz w:val="19"/>
+                <w:szCs w:val="19"/>
+              </w:rPr>
+              <w:t xml:space="preserve">mal</w:t>
+            </w:r>
+            <w:r>
+              <w:rPr>
+                <w:rFonts w:ascii="Calibri" w:cs="Calibri" w:eastAsia="Calibri" w:hAnsi="Calibri"/>
+                <w:color w:val="000000"/>
+                <w:sz w:val="19"/>
+                <w:szCs w:val="19"/>
+              </w:rPr>
+              <w:t xml:space="preserve"> </w:t>
+            </w:r>
+            <w:r>
+              <w:rPr>
+                <w:rFonts w:ascii="Calibri" w:cs="Calibri" w:eastAsia="Calibri" w:hAnsi="Calibri"/>
+                <w:color w:val="000000"/>
+                <w:sz w:val="19"/>
+                <w:szCs w:val="19"/>
+              </w:rPr>
+              <w:t xml:space="preserve">das</w:t>
+            </w:r>
+            <w:r>
+              <w:rPr>
+                <w:rFonts w:ascii="Calibri" w:cs="Calibri" w:eastAsia="Calibri" w:hAnsi="Calibri"/>
+                <w:color w:val="000000"/>
+                <w:sz w:val="19"/>
+                <w:szCs w:val="19"/>
+              </w:rPr>
+              <w:t xml:space="preserve"> </w:t>
+            </w:r>
+            <w:r>
+              <w:rPr>
+                <w:rFonts w:ascii="Calibri" w:cs="Calibri" w:eastAsia="Calibri" w:hAnsi="Calibri"/>
+                <w:b/>
+                <w:bCs/>
+                <w:color w:val="D9534F"/>
+                <w:sz w:val="19"/>
+                <w:szCs w:val="19"/>
+              </w:rPr>
+              <w:t xml:space="preserve">Handy</w:t>
+            </w:r>
+            <w:r>
+              <w:rPr>
+                <w:rFonts w:ascii="Calibri" w:cs="Calibri" w:eastAsia="Calibri" w:hAnsi="Calibri"/>
+                <w:color w:val="000000"/>
+                <w:sz w:val="19"/>
+                <w:szCs w:val="19"/>
+              </w:rPr>
+              <w:t xml:space="preserve"> </w:t>
+            </w:r>
+            <w:r>
+              <w:rPr>
+                <w:rFonts w:ascii="Calibri" w:cs="Calibri" w:eastAsia="Calibri" w:hAnsi="Calibri"/>
+                <w:color w:val="000000"/>
+                <w:sz w:val="19"/>
+                <w:szCs w:val="19"/>
+              </w:rPr>
+              <w:t xml:space="preserve">weglegt</w:t>
+            </w:r>
+            <w:r>
+              <w:rPr>
+                <w:rFonts w:ascii="Calibri" w:cs="Calibri" w:eastAsia="Calibri" w:hAnsi="Calibri"/>
+                <w:color w:val="000000"/>
+                <w:sz w:val="19"/>
+                <w:szCs w:val="19"/>
+              </w:rPr>
+              <w:t xml:space="preserve">.</w:t>
+            </w:r>
+            <w:r>
+              <w:rPr>
+                <w:rFonts w:ascii="Calibri" w:cs="Calibri" w:eastAsia="Calibri" w:hAnsi="Calibri"/>
+                <w:color w:val="000000"/>
+                <w:sz w:val="19"/>
+                <w:szCs w:val="19"/>
+              </w:rPr>
+              <w:t xml:space="preserve"/>
+            </w:r>
+          </w:p>
+        </w:tc>
+        <w:tc>
+          <w:tcPr>
+            <w:tcW w:type="dxa" w:w="7338"/>
+            <w:tcBorders>
+              <w:top w:val="single" w:color="B9C6E8" w:sz="6"/>
+              <w:left w:val="single" w:color="B9C6E8" w:sz="6"/>
+              <w:bottom w:val="single" w:color="B9C6E8" w:sz="6"/>
+              <w:right w:val="single" w:color="B9C6E8" w:sz="6"/>
+            </w:tcBorders>
+            <w:tcMar>
+              <w:top w:type="dxa" w:w="60"/>
+              <w:left w:type="dxa" w:w="120"/>
+              <w:bottom w:type="dxa" w:w="60"/>
+              <w:right w:type="dxa" w:w="120"/>
+            </w:tcMar>
+            <w:vAlign w:val="top"/>
+          </w:tcPr>
+          <w:p>
+            <w:pPr>
+              <w:spacing w:after="0" w:before="0"/>
+            </w:pPr>
+            <w:r>
+              <w:rPr>
+                <w:rFonts w:ascii="Calibri" w:cs="Calibri" w:eastAsia="Calibri" w:hAnsi="Calibri"/>
+                <w:color w:val="000000"/>
+                <w:sz w:val="17"/>
+                <w:szCs w:val="17"/>
+              </w:rPr>
+              <w:t xml:space="preserve">groß: Vater, Zuhören, Handy (Artikelprobe; beim Zuhören: Signalwort) · Komma vor dem Nebensatz (Verb am Ende)</w:t>
+            </w:r>
+          </w:p>
+        </w:tc>
+      </w:tr>
+      <w:tr>
+        <w:trPr>
+          <w:cantSplit/>
+        </w:trPr>
+        <w:tc>
+          <w:tcPr>
+            <w:tcW w:type="dxa" w:w="700"/>
+            <w:tcBorders>
+              <w:top w:val="single" w:color="B9C6E8" w:sz="6"/>
+              <w:left w:val="single" w:color="B9C6E8" w:sz="6"/>
+              <w:bottom w:val="single" w:color="B9C6E8" w:sz="6"/>
+              <w:right w:val="single" w:color="B9C6E8" w:sz="6"/>
+            </w:tcBorders>
+            <w:shd w:fill="F4F7FD" w:color="auto" w:val="clear"/>
+            <w:tcMar>
+              <w:top w:type="dxa" w:w="60"/>
+              <w:left w:type="dxa" w:w="120"/>
+              <w:bottom w:type="dxa" w:w="60"/>
+              <w:right w:type="dxa" w:w="120"/>
+            </w:tcMar>
+            <w:vAlign w:val="top"/>
+          </w:tcPr>
+          <w:p>
+            <w:pPr>
+              <w:spacing w:after="0" w:before="0"/>
+            </w:pPr>
+            <w:r>
+              <w:rPr>
+                <w:rFonts w:ascii="Calibri" w:cs="Calibri" w:eastAsia="Calibri" w:hAnsi="Calibri"/>
+                <w:b/>
+                <w:bCs/>
+                <w:color w:val="1E2761"/>
+                <w:sz w:val="18"/>
+                <w:szCs w:val="18"/>
+              </w:rPr>
+              <w:t xml:space="preserve">4</w:t>
+            </w:r>
+          </w:p>
+        </w:tc>
+        <w:tc>
+          <w:tcPr>
+            <w:tcW w:type="dxa" w:w="7300"/>
+            <w:tcBorders>
+              <w:top w:val="single" w:color="B9C6E8" w:sz="6"/>
+              <w:left w:val="single" w:color="B9C6E8" w:sz="6"/>
+              <w:bottom w:val="single" w:color="B9C6E8" w:sz="6"/>
+              <w:right w:val="single" w:color="B9C6E8" w:sz="6"/>
+            </w:tcBorders>
+            <w:tcMar>
+              <w:top w:type="dxa" w:w="60"/>
+              <w:left w:type="dxa" w:w="120"/>
+              <w:bottom w:type="dxa" w:w="60"/>
+              <w:right w:type="dxa" w:w="120"/>
+            </w:tcMar>
+            <w:vAlign w:val="top"/>
+          </w:tcPr>
+          <w:p>
+            <w:pPr>
+              <w:spacing w:after="0" w:before="0"/>
+            </w:pPr>
+            <w:r>
+              <w:rPr>
+                <w:rFonts w:ascii="Calibri" w:cs="Calibri" w:eastAsia="Calibri" w:hAnsi="Calibri"/>
+                <w:b/>
+                <w:bCs/>
+                <w:color w:val="5B6B8C"/>
+                <w:sz w:val="18"/>
+                <w:szCs w:val="18"/>
+              </w:rPr>
+              <w:t xml:space="preserve">Jonas: </w:t>
+            </w:r>
+            <w:r>
+              <w:rPr>
+                <w:rFonts w:ascii="Calibri" w:cs="Calibri" w:eastAsia="Calibri" w:hAnsi="Calibri"/>
+                <w:color w:val="000000"/>
+                <w:sz w:val="19"/>
+                <w:szCs w:val="19"/>
+              </w:rPr>
+              <w:t xml:space="preserve">Haha,</w:t>
+            </w:r>
+            <w:r>
+              <w:rPr>
+                <w:rFonts w:ascii="Calibri" w:cs="Calibri" w:eastAsia="Calibri" w:hAnsi="Calibri"/>
+                <w:color w:val="000000"/>
+                <w:sz w:val="19"/>
+                <w:szCs w:val="19"/>
+              </w:rPr>
+              <w:t xml:space="preserve"> </w:t>
+            </w:r>
+            <w:r>
+              <w:rPr>
+                <w:rFonts w:ascii="Calibri" w:cs="Calibri" w:eastAsia="Calibri" w:hAnsi="Calibri"/>
+                <w:color w:val="000000"/>
+                <w:sz w:val="19"/>
+                <w:szCs w:val="19"/>
+              </w:rPr>
+              <w:t xml:space="preserve">same</w:t>
+            </w:r>
+            <w:r>
+              <w:rPr>
+                <w:rFonts w:ascii="Calibri" w:cs="Calibri" w:eastAsia="Calibri" w:hAnsi="Calibri"/>
+                <w:color w:val="000000"/>
+                <w:sz w:val="19"/>
+                <w:szCs w:val="19"/>
+              </w:rPr>
+              <w:t xml:space="preserve">.</w:t>
+            </w:r>
+            <w:r>
+              <w:rPr>
+                <w:rFonts w:ascii="Calibri" w:cs="Calibri" w:eastAsia="Calibri" w:hAnsi="Calibri"/>
+                <w:color w:val="000000"/>
+                <w:sz w:val="19"/>
+                <w:szCs w:val="19"/>
+              </w:rPr>
+              <w:t xml:space="preserve"> </w:t>
+            </w:r>
+            <w:r>
+              <w:rPr>
+                <w:rFonts w:ascii="Calibri" w:cs="Calibri" w:eastAsia="Calibri" w:hAnsi="Calibri"/>
+                <w:color w:val="000000"/>
+                <w:sz w:val="19"/>
+                <w:szCs w:val="19"/>
+              </w:rPr>
+              <w:t xml:space="preserve">Wenn</w:t>
+            </w:r>
+            <w:r>
+              <w:rPr>
+                <w:rFonts w:ascii="Calibri" w:cs="Calibri" w:eastAsia="Calibri" w:hAnsi="Calibri"/>
+                <w:color w:val="000000"/>
+                <w:sz w:val="19"/>
+                <w:szCs w:val="19"/>
+              </w:rPr>
+              <w:t xml:space="preserve"> </w:t>
+            </w:r>
+            <w:r>
+              <w:rPr>
+                <w:rFonts w:ascii="Calibri" w:cs="Calibri" w:eastAsia="Calibri" w:hAnsi="Calibri"/>
+                <w:color w:val="000000"/>
+                <w:sz w:val="19"/>
+                <w:szCs w:val="19"/>
+              </w:rPr>
+              <w:t xml:space="preserve">ich</w:t>
+            </w:r>
+            <w:r>
+              <w:rPr>
+                <w:rFonts w:ascii="Calibri" w:cs="Calibri" w:eastAsia="Calibri" w:hAnsi="Calibri"/>
+                <w:color w:val="000000"/>
+                <w:sz w:val="19"/>
+                <w:szCs w:val="19"/>
+              </w:rPr>
+              <w:t xml:space="preserve"> </w:t>
+            </w:r>
+            <w:r>
+              <w:rPr>
+                <w:rFonts w:ascii="Calibri" w:cs="Calibri" w:eastAsia="Calibri" w:hAnsi="Calibri"/>
+                <w:color w:val="000000"/>
+                <w:sz w:val="19"/>
+                <w:szCs w:val="19"/>
+              </w:rPr>
+              <w:t xml:space="preserve">was</w:t>
+            </w:r>
+            <w:r>
+              <w:rPr>
+                <w:rFonts w:ascii="Calibri" w:cs="Calibri" w:eastAsia="Calibri" w:hAnsi="Calibri"/>
+                <w:color w:val="000000"/>
+                <w:sz w:val="19"/>
+                <w:szCs w:val="19"/>
+              </w:rPr>
+              <w:t xml:space="preserve"> </w:t>
+            </w:r>
+            <w:r>
+              <w:rPr>
+                <w:rFonts w:ascii="Calibri" w:cs="Calibri" w:eastAsia="Calibri" w:hAnsi="Calibri"/>
+                <w:color w:val="000000"/>
+                <w:sz w:val="19"/>
+                <w:szCs w:val="19"/>
+              </w:rPr>
+              <w:t xml:space="preserve">erzähle</w:t>
+            </w:r>
+            <w:r>
+              <w:rPr>
+                <w:rFonts w:ascii="Calibri" w:cs="Calibri" w:eastAsia="Calibri" w:hAnsi="Calibri"/>
+                <w:b/>
+                <w:bCs/>
+                <w:color w:val="D9534F"/>
+                <w:sz w:val="19"/>
+                <w:szCs w:val="19"/>
+              </w:rPr>
+              <w:t xml:space="preserve">,</w:t>
+            </w:r>
+            <w:r>
+              <w:rPr>
+                <w:rFonts w:ascii="Calibri" w:cs="Calibri" w:eastAsia="Calibri" w:hAnsi="Calibri"/>
+                <w:color w:val="000000"/>
+                <w:sz w:val="19"/>
+                <w:szCs w:val="19"/>
+              </w:rPr>
+              <w:t xml:space="preserve"> </w:t>
+            </w:r>
+            <w:r>
+              <w:rPr>
+                <w:rFonts w:ascii="Calibri" w:cs="Calibri" w:eastAsia="Calibri" w:hAnsi="Calibri"/>
+                <w:color w:val="000000"/>
+                <w:sz w:val="19"/>
+                <w:szCs w:val="19"/>
+              </w:rPr>
+              <w:t xml:space="preserve">schaut</w:t>
+            </w:r>
+            <w:r>
+              <w:rPr>
+                <w:rFonts w:ascii="Calibri" w:cs="Calibri" w:eastAsia="Calibri" w:hAnsi="Calibri"/>
+                <w:color w:val="000000"/>
+                <w:sz w:val="19"/>
+                <w:szCs w:val="19"/>
+              </w:rPr>
+              <w:t xml:space="preserve"> </w:t>
+            </w:r>
+            <w:r>
+              <w:rPr>
+                <w:rFonts w:ascii="Calibri" w:cs="Calibri" w:eastAsia="Calibri" w:hAnsi="Calibri"/>
+                <w:color w:val="000000"/>
+                <w:sz w:val="19"/>
+                <w:szCs w:val="19"/>
+              </w:rPr>
+              <w:t xml:space="preserve">meiner</w:t>
+            </w:r>
+            <w:r>
+              <w:rPr>
+                <w:rFonts w:ascii="Calibri" w:cs="Calibri" w:eastAsia="Calibri" w:hAnsi="Calibri"/>
+                <w:color w:val="000000"/>
+                <w:sz w:val="19"/>
+                <w:szCs w:val="19"/>
+              </w:rPr>
+              <w:t xml:space="preserve"> </w:t>
+            </w:r>
+            <w:r>
+              <w:rPr>
+                <w:rFonts w:ascii="Calibri" w:cs="Calibri" w:eastAsia="Calibri" w:hAnsi="Calibri"/>
+                <w:color w:val="000000"/>
+                <w:sz w:val="19"/>
+                <w:szCs w:val="19"/>
+              </w:rPr>
+              <w:t xml:space="preserve">nur</w:t>
+            </w:r>
+            <w:r>
+              <w:rPr>
+                <w:rFonts w:ascii="Calibri" w:cs="Calibri" w:eastAsia="Calibri" w:hAnsi="Calibri"/>
+                <w:color w:val="000000"/>
+                <w:sz w:val="19"/>
+                <w:szCs w:val="19"/>
+              </w:rPr>
+              <w:t xml:space="preserve"> </w:t>
+            </w:r>
+            <w:r>
+              <w:rPr>
+                <w:rFonts w:ascii="Calibri" w:cs="Calibri" w:eastAsia="Calibri" w:hAnsi="Calibri"/>
+                <w:color w:val="000000"/>
+                <w:sz w:val="19"/>
+                <w:szCs w:val="19"/>
+              </w:rPr>
+              <w:t xml:space="preserve">auf</w:t>
+            </w:r>
+            <w:r>
+              <w:rPr>
+                <w:rFonts w:ascii="Calibri" w:cs="Calibri" w:eastAsia="Calibri" w:hAnsi="Calibri"/>
+                <w:color w:val="000000"/>
+                <w:sz w:val="19"/>
+                <w:szCs w:val="19"/>
+              </w:rPr>
+              <w:t xml:space="preserve"> </w:t>
+            </w:r>
+            <w:r>
+              <w:rPr>
+                <w:rFonts w:ascii="Calibri" w:cs="Calibri" w:eastAsia="Calibri" w:hAnsi="Calibri"/>
+                <w:color w:val="000000"/>
+                <w:sz w:val="19"/>
+                <w:szCs w:val="19"/>
+              </w:rPr>
+              <w:t xml:space="preserve">den</w:t>
+            </w:r>
+            <w:r>
+              <w:rPr>
+                <w:rFonts w:ascii="Calibri" w:cs="Calibri" w:eastAsia="Calibri" w:hAnsi="Calibri"/>
+                <w:color w:val="000000"/>
+                <w:sz w:val="19"/>
+                <w:szCs w:val="19"/>
+              </w:rPr>
+              <w:t xml:space="preserve"> </w:t>
+            </w:r>
+            <w:r>
+              <w:rPr>
+                <w:rFonts w:ascii="Calibri" w:cs="Calibri" w:eastAsia="Calibri" w:hAnsi="Calibri"/>
+                <w:b/>
+                <w:bCs/>
+                <w:color w:val="D9534F"/>
+                <w:sz w:val="19"/>
+                <w:szCs w:val="19"/>
+              </w:rPr>
+              <w:t xml:space="preserve">Fernseher</w:t>
+            </w:r>
+            <w:r>
+              <w:rPr>
+                <w:rFonts w:ascii="Calibri" w:cs="Calibri" w:eastAsia="Calibri" w:hAnsi="Calibri"/>
+                <w:color w:val="000000"/>
+                <w:sz w:val="19"/>
+                <w:szCs w:val="19"/>
+              </w:rPr>
+              <w:t xml:space="preserve">.</w:t>
+            </w:r>
+            <w:r>
+              <w:rPr>
+                <w:rFonts w:ascii="Calibri" w:cs="Calibri" w:eastAsia="Calibri" w:hAnsi="Calibri"/>
+                <w:color w:val="000000"/>
+                <w:sz w:val="19"/>
+                <w:szCs w:val="19"/>
+              </w:rPr>
+              <w:t xml:space="preserve"/>
+            </w:r>
+          </w:p>
+        </w:tc>
+        <w:tc>
+          <w:tcPr>
+            <w:tcW w:type="dxa" w:w="7338"/>
+            <w:tcBorders>
+              <w:top w:val="single" w:color="B9C6E8" w:sz="6"/>
+              <w:left w:val="single" w:color="B9C6E8" w:sz="6"/>
+              <w:bottom w:val="single" w:color="B9C6E8" w:sz="6"/>
+              <w:right w:val="single" w:color="B9C6E8" w:sz="6"/>
+            </w:tcBorders>
+            <w:tcMar>
+              <w:top w:type="dxa" w:w="60"/>
+              <w:left w:type="dxa" w:w="120"/>
+              <w:bottom w:type="dxa" w:w="60"/>
+              <w:right w:type="dxa" w:w="120"/>
+            </w:tcMar>
+            <w:vAlign w:val="top"/>
+          </w:tcPr>
+          <w:p>
+            <w:pPr>
+              <w:spacing w:after="0" w:before="0"/>
+            </w:pPr>
+            <w:r>
+              <w:rPr>
+                <w:rFonts w:ascii="Calibri" w:cs="Calibri" w:eastAsia="Calibri" w:hAnsi="Calibri"/>
+                <w:color w:val="000000"/>
+                <w:sz w:val="17"/>
+                <w:szCs w:val="17"/>
+              </w:rPr>
+              <w:t xml:space="preserve">groß: Fernseher (Artikelprobe) · Komma vor dem Nebensatz (Verb am Ende)</w:t>
+            </w:r>
+          </w:p>
+        </w:tc>
+      </w:tr>
+      <w:tr>
+        <w:trPr>
+          <w:cantSplit/>
+        </w:trPr>
+        <w:tc>
+          <w:tcPr>
+            <w:tcW w:type="dxa" w:w="700"/>
+            <w:tcBorders>
+              <w:top w:val="single" w:color="B9C6E8" w:sz="6"/>
+              <w:left w:val="single" w:color="B9C6E8" w:sz="6"/>
+              <w:bottom w:val="single" w:color="B9C6E8" w:sz="6"/>
+              <w:right w:val="single" w:color="B9C6E8" w:sz="6"/>
+            </w:tcBorders>
+            <w:shd w:fill="F4F7FD" w:color="auto" w:val="clear"/>
+            <w:tcMar>
+              <w:top w:type="dxa" w:w="60"/>
+              <w:left w:type="dxa" w:w="120"/>
+              <w:bottom w:type="dxa" w:w="60"/>
+              <w:right w:type="dxa" w:w="120"/>
+            </w:tcMar>
+            <w:vAlign w:val="top"/>
+          </w:tcPr>
+          <w:p>
+            <w:pPr>
+              <w:spacing w:after="0" w:before="0"/>
+            </w:pPr>
+            <w:r>
+              <w:rPr>
+                <w:rFonts w:ascii="Calibri" w:cs="Calibri" w:eastAsia="Calibri" w:hAnsi="Calibri"/>
+                <w:b/>
+                <w:bCs/>
+                <w:color w:val="1E2761"/>
+                <w:sz w:val="18"/>
+                <w:szCs w:val="18"/>
+              </w:rPr>
+              <w:t xml:space="preserve">5</w:t>
+            </w:r>
+          </w:p>
+        </w:tc>
+        <w:tc>
+          <w:tcPr>
+            <w:tcW w:type="dxa" w:w="7300"/>
+            <w:tcBorders>
+              <w:top w:val="single" w:color="B9C6E8" w:sz="6"/>
+              <w:left w:val="single" w:color="B9C6E8" w:sz="6"/>
+              <w:bottom w:val="single" w:color="B9C6E8" w:sz="6"/>
+              <w:right w:val="single" w:color="B9C6E8" w:sz="6"/>
+            </w:tcBorders>
+            <w:tcMar>
+              <w:top w:type="dxa" w:w="60"/>
+              <w:left w:type="dxa" w:w="120"/>
+              <w:bottom w:type="dxa" w:w="60"/>
+              <w:right w:type="dxa" w:w="120"/>
+            </w:tcMar>
+            <w:vAlign w:val="top"/>
+          </w:tcPr>
+          <w:p>
+            <w:pPr>
+              <w:spacing w:after="0" w:before="0"/>
+            </w:pPr>
+            <w:r>
+              <w:rPr>
+                <w:rFonts w:ascii="Calibri" w:cs="Calibri" w:eastAsia="Calibri" w:hAnsi="Calibri"/>
+                <w:b/>
+                <w:bCs/>
+                <w:color w:val="5B6B8C"/>
+                <w:sz w:val="18"/>
+                <w:szCs w:val="18"/>
+              </w:rPr>
+              <w:t xml:space="preserve">Mia: </w:t>
+            </w:r>
+            <w:r>
+              <w:rPr>
+                <w:rFonts w:ascii="Calibri" w:cs="Calibri" w:eastAsia="Calibri" w:hAnsi="Calibri"/>
+                <w:color w:val="000000"/>
+                <w:sz w:val="19"/>
+                <w:szCs w:val="19"/>
+              </w:rPr>
+              <w:t xml:space="preserve">Weißt</w:t>
+            </w:r>
+            <w:r>
+              <w:rPr>
+                <w:rFonts w:ascii="Calibri" w:cs="Calibri" w:eastAsia="Calibri" w:hAnsi="Calibri"/>
+                <w:color w:val="000000"/>
+                <w:sz w:val="19"/>
+                <w:szCs w:val="19"/>
+              </w:rPr>
+              <w:t xml:space="preserve"> </w:t>
+            </w:r>
+            <w:r>
+              <w:rPr>
+                <w:rFonts w:ascii="Calibri" w:cs="Calibri" w:eastAsia="Calibri" w:hAnsi="Calibri"/>
+                <w:color w:val="000000"/>
+                <w:sz w:val="19"/>
+                <w:szCs w:val="19"/>
+              </w:rPr>
+              <w:t xml:space="preserve">du</w:t>
+            </w:r>
+            <w:r>
+              <w:rPr>
+                <w:rFonts w:ascii="Calibri" w:cs="Calibri" w:eastAsia="Calibri" w:hAnsi="Calibri"/>
+                <w:b/>
+                <w:bCs/>
+                <w:color w:val="D9534F"/>
+                <w:sz w:val="19"/>
+                <w:szCs w:val="19"/>
+              </w:rPr>
+              <w:t xml:space="preserve">,</w:t>
+            </w:r>
+            <w:r>
+              <w:rPr>
+                <w:rFonts w:ascii="Calibri" w:cs="Calibri" w:eastAsia="Calibri" w:hAnsi="Calibri"/>
+                <w:color w:val="000000"/>
+                <w:sz w:val="19"/>
+                <w:szCs w:val="19"/>
+              </w:rPr>
+              <w:t xml:space="preserve"> </w:t>
+            </w:r>
+            <w:r>
+              <w:rPr>
+                <w:rFonts w:ascii="Calibri" w:cs="Calibri" w:eastAsia="Calibri" w:hAnsi="Calibri"/>
+                <w:color w:val="000000"/>
+                <w:sz w:val="19"/>
+                <w:szCs w:val="19"/>
+              </w:rPr>
+              <w:t xml:space="preserve">ob</w:t>
+            </w:r>
+            <w:r>
+              <w:rPr>
+                <w:rFonts w:ascii="Calibri" w:cs="Calibri" w:eastAsia="Calibri" w:hAnsi="Calibri"/>
+                <w:color w:val="000000"/>
+                <w:sz w:val="19"/>
+                <w:szCs w:val="19"/>
+              </w:rPr>
+              <w:t xml:space="preserve"> </w:t>
+            </w:r>
+            <w:r>
+              <w:rPr>
+                <w:rFonts w:ascii="Calibri" w:cs="Calibri" w:eastAsia="Calibri" w:hAnsi="Calibri"/>
+                <w:color w:val="000000"/>
+                <w:sz w:val="19"/>
+                <w:szCs w:val="19"/>
+              </w:rPr>
+              <w:t xml:space="preserve">wir</w:t>
+            </w:r>
+            <w:r>
+              <w:rPr>
+                <w:rFonts w:ascii="Calibri" w:cs="Calibri" w:eastAsia="Calibri" w:hAnsi="Calibri"/>
+                <w:color w:val="000000"/>
+                <w:sz w:val="19"/>
+                <w:szCs w:val="19"/>
+              </w:rPr>
+              <w:t xml:space="preserve"> </w:t>
+            </w:r>
+            <w:r>
+              <w:rPr>
+                <w:rFonts w:ascii="Calibri" w:cs="Calibri" w:eastAsia="Calibri" w:hAnsi="Calibri"/>
+                <w:color w:val="000000"/>
+                <w:sz w:val="19"/>
+                <w:szCs w:val="19"/>
+              </w:rPr>
+              <w:t xml:space="preserve">morgen</w:t>
+            </w:r>
+            <w:r>
+              <w:rPr>
+                <w:rFonts w:ascii="Calibri" w:cs="Calibri" w:eastAsia="Calibri" w:hAnsi="Calibri"/>
+                <w:color w:val="000000"/>
+                <w:sz w:val="19"/>
+                <w:szCs w:val="19"/>
+              </w:rPr>
+              <w:t xml:space="preserve"> </w:t>
+            </w:r>
+            <w:r>
+              <w:rPr>
+                <w:rFonts w:ascii="Calibri" w:cs="Calibri" w:eastAsia="Calibri" w:hAnsi="Calibri"/>
+                <w:color w:val="000000"/>
+                <w:sz w:val="19"/>
+                <w:szCs w:val="19"/>
+              </w:rPr>
+              <w:t xml:space="preserve">die</w:t>
+            </w:r>
+            <w:r>
+              <w:rPr>
+                <w:rFonts w:ascii="Calibri" w:cs="Calibri" w:eastAsia="Calibri" w:hAnsi="Calibri"/>
+                <w:color w:val="000000"/>
+                <w:sz w:val="19"/>
+                <w:szCs w:val="19"/>
+              </w:rPr>
+              <w:t xml:space="preserve"> </w:t>
+            </w:r>
+            <w:r>
+              <w:rPr>
+                <w:rFonts w:ascii="Calibri" w:cs="Calibri" w:eastAsia="Calibri" w:hAnsi="Calibri"/>
+                <w:b/>
+                <w:bCs/>
+                <w:color w:val="D9534F"/>
+                <w:sz w:val="19"/>
+                <w:szCs w:val="19"/>
+              </w:rPr>
+              <w:t xml:space="preserve">Rede</w:t>
+            </w:r>
+            <w:r>
+              <w:rPr>
+                <w:rFonts w:ascii="Calibri" w:cs="Calibri" w:eastAsia="Calibri" w:hAnsi="Calibri"/>
+                <w:color w:val="000000"/>
+                <w:sz w:val="19"/>
+                <w:szCs w:val="19"/>
+              </w:rPr>
+              <w:t xml:space="preserve"> </w:t>
+            </w:r>
+            <w:r>
+              <w:rPr>
+                <w:rFonts w:ascii="Calibri" w:cs="Calibri" w:eastAsia="Calibri" w:hAnsi="Calibri"/>
+                <w:color w:val="000000"/>
+                <w:sz w:val="19"/>
+                <w:szCs w:val="19"/>
+              </w:rPr>
+              <w:t xml:space="preserve">halten</w:t>
+            </w:r>
+            <w:r>
+              <w:rPr>
+                <w:rFonts w:ascii="Calibri" w:cs="Calibri" w:eastAsia="Calibri" w:hAnsi="Calibri"/>
+                <w:color w:val="000000"/>
+                <w:sz w:val="19"/>
+                <w:szCs w:val="19"/>
+              </w:rPr>
+              <w:t xml:space="preserve"> </w:t>
+            </w:r>
+            <w:r>
+              <w:rPr>
+                <w:rFonts w:ascii="Calibri" w:cs="Calibri" w:eastAsia="Calibri" w:hAnsi="Calibri"/>
+                <w:color w:val="000000"/>
+                <w:sz w:val="19"/>
+                <w:szCs w:val="19"/>
+              </w:rPr>
+              <w:t xml:space="preserve">müssen</w:t>
+            </w:r>
+            <w:r>
+              <w:rPr>
+                <w:rFonts w:ascii="Calibri" w:cs="Calibri" w:eastAsia="Calibri" w:hAnsi="Calibri"/>
+                <w:color w:val="000000"/>
+                <w:sz w:val="19"/>
+                <w:szCs w:val="19"/>
+              </w:rPr>
+              <w:t xml:space="preserve">?</w:t>
+            </w:r>
+            <w:r>
+              <w:rPr>
+                <w:rFonts w:ascii="Calibri" w:cs="Calibri" w:eastAsia="Calibri" w:hAnsi="Calibri"/>
+                <w:color w:val="000000"/>
+                <w:sz w:val="19"/>
+                <w:szCs w:val="19"/>
+              </w:rPr>
+              <w:t xml:space="preserve"/>
+            </w:r>
+          </w:p>
+        </w:tc>
+        <w:tc>
+          <w:tcPr>
+            <w:tcW w:type="dxa" w:w="7338"/>
+            <w:tcBorders>
+              <w:top w:val="single" w:color="B9C6E8" w:sz="6"/>
+              <w:left w:val="single" w:color="B9C6E8" w:sz="6"/>
+              <w:bottom w:val="single" w:color="B9C6E8" w:sz="6"/>
+              <w:right w:val="single" w:color="B9C6E8" w:sz="6"/>
+            </w:tcBorders>
+            <w:tcMar>
+              <w:top w:type="dxa" w:w="60"/>
+              <w:left w:type="dxa" w:w="120"/>
+              <w:bottom w:type="dxa" w:w="60"/>
+              <w:right w:type="dxa" w:w="120"/>
+            </w:tcMar>
+            <w:vAlign w:val="top"/>
+          </w:tcPr>
+          <w:p>
+            <w:pPr>
+              <w:spacing w:after="0" w:before="0"/>
+            </w:pPr>
+            <w:r>
+              <w:rPr>
+                <w:rFonts w:ascii="Calibri" w:cs="Calibri" w:eastAsia="Calibri" w:hAnsi="Calibri"/>
+                <w:color w:val="000000"/>
+                <w:sz w:val="17"/>
+                <w:szCs w:val="17"/>
+              </w:rPr>
+              <w:t xml:space="preserve">groß: Rede (Artikelprobe) · Komma vor dem Nebensatz (Verb am Ende)</w:t>
+            </w:r>
+          </w:p>
+        </w:tc>
+      </w:tr>
+      <w:tr>
+        <w:trPr>
+          <w:cantSplit/>
+        </w:trPr>
+        <w:tc>
+          <w:tcPr>
+            <w:tcW w:type="dxa" w:w="700"/>
+            <w:tcBorders>
+              <w:top w:val="single" w:color="B9C6E8" w:sz="6"/>
+              <w:left w:val="single" w:color="B9C6E8" w:sz="6"/>
+              <w:bottom w:val="single" w:color="B9C6E8" w:sz="6"/>
+              <w:right w:val="single" w:color="B9C6E8" w:sz="6"/>
+            </w:tcBorders>
+            <w:shd w:fill="F4F7FD" w:color="auto" w:val="clear"/>
+            <w:tcMar>
+              <w:top w:type="dxa" w:w="60"/>
+              <w:left w:type="dxa" w:w="120"/>
+              <w:bottom w:type="dxa" w:w="60"/>
+              <w:right w:type="dxa" w:w="120"/>
+            </w:tcMar>
+            <w:vAlign w:val="top"/>
+          </w:tcPr>
+          <w:p>
+            <w:pPr>
+              <w:spacing w:after="0" w:before="0"/>
+            </w:pPr>
+            <w:r>
+              <w:rPr>
+                <w:rFonts w:ascii="Calibri" w:cs="Calibri" w:eastAsia="Calibri" w:hAnsi="Calibri"/>
+                <w:b/>
+                <w:bCs/>
+                <w:color w:val="1E2761"/>
+                <w:sz w:val="18"/>
+                <w:szCs w:val="18"/>
+              </w:rPr>
+              <w:t xml:space="preserve">6</w:t>
+            </w:r>
+          </w:p>
+        </w:tc>
+        <w:tc>
+          <w:tcPr>
+            <w:tcW w:type="dxa" w:w="7300"/>
+            <w:tcBorders>
+              <w:top w:val="single" w:color="B9C6E8" w:sz="6"/>
+              <w:left w:val="single" w:color="B9C6E8" w:sz="6"/>
+              <w:bottom w:val="single" w:color="B9C6E8" w:sz="6"/>
+              <w:right w:val="single" w:color="B9C6E8" w:sz="6"/>
+            </w:tcBorders>
+            <w:tcMar>
+              <w:top w:type="dxa" w:w="60"/>
+              <w:left w:type="dxa" w:w="120"/>
+              <w:bottom w:type="dxa" w:w="60"/>
+              <w:right w:type="dxa" w:w="120"/>
+            </w:tcMar>
+            <w:vAlign w:val="top"/>
+          </w:tcPr>
+          <w:p>
+            <w:pPr>
+              <w:spacing w:after="0" w:before="0"/>
+            </w:pPr>
+            <w:r>
+              <w:rPr>
+                <w:rFonts w:ascii="Calibri" w:cs="Calibri" w:eastAsia="Calibri" w:hAnsi="Calibri"/>
+                <w:b/>
+                <w:bCs/>
+                <w:color w:val="5B6B8C"/>
+                <w:sz w:val="18"/>
+                <w:szCs w:val="18"/>
+              </w:rPr>
+              <w:t xml:space="preserve">Jonas: </w:t>
+            </w:r>
+            <w:r>
+              <w:rPr>
+                <w:rFonts w:ascii="Calibri" w:cs="Calibri" w:eastAsia="Calibri" w:hAnsi="Calibri"/>
+                <w:color w:val="000000"/>
+                <w:sz w:val="19"/>
+                <w:szCs w:val="19"/>
+              </w:rPr>
+              <w:t xml:space="preserve">Keine</w:t>
+            </w:r>
+            <w:r>
+              <w:rPr>
+                <w:rFonts w:ascii="Calibri" w:cs="Calibri" w:eastAsia="Calibri" w:hAnsi="Calibri"/>
+                <w:color w:val="000000"/>
+                <w:sz w:val="19"/>
+                <w:szCs w:val="19"/>
+              </w:rPr>
+              <w:t xml:space="preserve"> </w:t>
+            </w:r>
+            <w:r>
+              <w:rPr>
+                <w:rFonts w:ascii="Calibri" w:cs="Calibri" w:eastAsia="Calibri" w:hAnsi="Calibri"/>
+                <w:b/>
+                <w:bCs/>
+                <w:color w:val="D9534F"/>
+                <w:sz w:val="19"/>
+                <w:szCs w:val="19"/>
+              </w:rPr>
+              <w:t xml:space="preserve">Ahnung</w:t>
+            </w:r>
+            <w:r>
+              <w:rPr>
+                <w:rFonts w:ascii="Calibri" w:cs="Calibri" w:eastAsia="Calibri" w:hAnsi="Calibri"/>
+                <w:color w:val="000000"/>
+                <w:sz w:val="19"/>
+                <w:szCs w:val="19"/>
+              </w:rPr>
+              <w:t xml:space="preserve">.</w:t>
+            </w:r>
+            <w:r>
+              <w:rPr>
+                <w:rFonts w:ascii="Calibri" w:cs="Calibri" w:eastAsia="Calibri" w:hAnsi="Calibri"/>
+                <w:color w:val="000000"/>
+                <w:sz w:val="19"/>
+                <w:szCs w:val="19"/>
+              </w:rPr>
+              <w:t xml:space="preserve"> </w:t>
+            </w:r>
+            <w:r>
+              <w:rPr>
+                <w:rFonts w:ascii="Calibri" w:cs="Calibri" w:eastAsia="Calibri" w:hAnsi="Calibri"/>
+                <w:color w:val="000000"/>
+                <w:sz w:val="19"/>
+                <w:szCs w:val="19"/>
+              </w:rPr>
+              <w:t xml:space="preserve">Ich</w:t>
+            </w:r>
+            <w:r>
+              <w:rPr>
+                <w:rFonts w:ascii="Calibri" w:cs="Calibri" w:eastAsia="Calibri" w:hAnsi="Calibri"/>
+                <w:color w:val="000000"/>
+                <w:sz w:val="19"/>
+                <w:szCs w:val="19"/>
+              </w:rPr>
+              <w:t xml:space="preserve"> </w:t>
+            </w:r>
+            <w:r>
+              <w:rPr>
+                <w:rFonts w:ascii="Calibri" w:cs="Calibri" w:eastAsia="Calibri" w:hAnsi="Calibri"/>
+                <w:color w:val="000000"/>
+                <w:sz w:val="19"/>
+                <w:szCs w:val="19"/>
+              </w:rPr>
+              <w:t xml:space="preserve">hoffe</w:t>
+            </w:r>
+            <w:r>
+              <w:rPr>
+                <w:rFonts w:ascii="Calibri" w:cs="Calibri" w:eastAsia="Calibri" w:hAnsi="Calibri"/>
+                <w:color w:val="000000"/>
+                <w:sz w:val="19"/>
+                <w:szCs w:val="19"/>
+              </w:rPr>
+              <w:t xml:space="preserve"> </w:t>
+            </w:r>
+            <w:r>
+              <w:rPr>
+                <w:rFonts w:ascii="Calibri" w:cs="Calibri" w:eastAsia="Calibri" w:hAnsi="Calibri"/>
+                <w:color w:val="000000"/>
+                <w:sz w:val="19"/>
+                <w:szCs w:val="19"/>
+              </w:rPr>
+              <w:t xml:space="preserve">nur</w:t>
+            </w:r>
+            <w:r>
+              <w:rPr>
+                <w:rFonts w:ascii="Calibri" w:cs="Calibri" w:eastAsia="Calibri" w:hAnsi="Calibri"/>
+                <w:b/>
+                <w:bCs/>
+                <w:color w:val="D9534F"/>
+                <w:sz w:val="19"/>
+                <w:szCs w:val="19"/>
+              </w:rPr>
+              <w:t xml:space="preserve">,</w:t>
+            </w:r>
+            <w:r>
+              <w:rPr>
+                <w:rFonts w:ascii="Calibri" w:cs="Calibri" w:eastAsia="Calibri" w:hAnsi="Calibri"/>
+                <w:color w:val="000000"/>
+                <w:sz w:val="19"/>
+                <w:szCs w:val="19"/>
+              </w:rPr>
+              <w:t xml:space="preserve"> </w:t>
+            </w:r>
+            <w:r>
+              <w:rPr>
+                <w:rFonts w:ascii="Calibri" w:cs="Calibri" w:eastAsia="Calibri" w:hAnsi="Calibri"/>
+                <w:color w:val="000000"/>
+                <w:sz w:val="19"/>
+                <w:szCs w:val="19"/>
+              </w:rPr>
+              <w:t xml:space="preserve">dass</w:t>
+            </w:r>
+            <w:r>
+              <w:rPr>
+                <w:rFonts w:ascii="Calibri" w:cs="Calibri" w:eastAsia="Calibri" w:hAnsi="Calibri"/>
+                <w:color w:val="000000"/>
+                <w:sz w:val="19"/>
+                <w:szCs w:val="19"/>
+              </w:rPr>
+              <w:t xml:space="preserve"> </w:t>
+            </w:r>
+            <w:r>
+              <w:rPr>
+                <w:rFonts w:ascii="Calibri" w:cs="Calibri" w:eastAsia="Calibri" w:hAnsi="Calibri"/>
+                <w:color w:val="000000"/>
+                <w:sz w:val="19"/>
+                <w:szCs w:val="19"/>
+              </w:rPr>
+              <w:t xml:space="preserve">ich</w:t>
+            </w:r>
+            <w:r>
+              <w:rPr>
+                <w:rFonts w:ascii="Calibri" w:cs="Calibri" w:eastAsia="Calibri" w:hAnsi="Calibri"/>
+                <w:color w:val="000000"/>
+                <w:sz w:val="19"/>
+                <w:szCs w:val="19"/>
+              </w:rPr>
+              <w:t xml:space="preserve"> </w:t>
+            </w:r>
+            <w:r>
+              <w:rPr>
+                <w:rFonts w:ascii="Calibri" w:cs="Calibri" w:eastAsia="Calibri" w:hAnsi="Calibri"/>
+                <w:color w:val="000000"/>
+                <w:sz w:val="19"/>
+                <w:szCs w:val="19"/>
+              </w:rPr>
+              <w:t xml:space="preserve">nicht</w:t>
+            </w:r>
+            <w:r>
+              <w:rPr>
+                <w:rFonts w:ascii="Calibri" w:cs="Calibri" w:eastAsia="Calibri" w:hAnsi="Calibri"/>
+                <w:color w:val="000000"/>
+                <w:sz w:val="19"/>
+                <w:szCs w:val="19"/>
+              </w:rPr>
+              <w:t xml:space="preserve"> </w:t>
+            </w:r>
+            <w:r>
+              <w:rPr>
+                <w:rFonts w:ascii="Calibri" w:cs="Calibri" w:eastAsia="Calibri" w:hAnsi="Calibri"/>
+                <w:color w:val="000000"/>
+                <w:sz w:val="19"/>
+                <w:szCs w:val="19"/>
+              </w:rPr>
+              <w:t xml:space="preserve">zuerst</w:t>
+            </w:r>
+            <w:r>
+              <w:rPr>
+                <w:rFonts w:ascii="Calibri" w:cs="Calibri" w:eastAsia="Calibri" w:hAnsi="Calibri"/>
+                <w:color w:val="000000"/>
+                <w:sz w:val="19"/>
+                <w:szCs w:val="19"/>
+              </w:rPr>
+              <w:t xml:space="preserve"> </w:t>
+            </w:r>
+            <w:r>
+              <w:rPr>
+                <w:rFonts w:ascii="Calibri" w:cs="Calibri" w:eastAsia="Calibri" w:hAnsi="Calibri"/>
+                <w:color w:val="000000"/>
+                <w:sz w:val="19"/>
+                <w:szCs w:val="19"/>
+              </w:rPr>
+              <w:t xml:space="preserve">dran</w:t>
+            </w:r>
+            <w:r>
+              <w:rPr>
+                <w:rFonts w:ascii="Calibri" w:cs="Calibri" w:eastAsia="Calibri" w:hAnsi="Calibri"/>
+                <w:color w:val="000000"/>
+                <w:sz w:val="19"/>
+                <w:szCs w:val="19"/>
+              </w:rPr>
+              <w:t xml:space="preserve"> </w:t>
+            </w:r>
+            <w:r>
+              <w:rPr>
+                <w:rFonts w:ascii="Calibri" w:cs="Calibri" w:eastAsia="Calibri" w:hAnsi="Calibri"/>
+                <w:color w:val="000000"/>
+                <w:sz w:val="19"/>
+                <w:szCs w:val="19"/>
+              </w:rPr>
+              <w:t xml:space="preserve">bin</w:t>
+            </w:r>
+            <w:r>
+              <w:rPr>
+                <w:rFonts w:ascii="Calibri" w:cs="Calibri" w:eastAsia="Calibri" w:hAnsi="Calibri"/>
+                <w:color w:val="000000"/>
+                <w:sz w:val="19"/>
+                <w:szCs w:val="19"/>
+              </w:rPr>
+              <w:t xml:space="preserve">.</w:t>
+            </w:r>
+            <w:r>
+              <w:rPr>
+                <w:rFonts w:ascii="Calibri" w:cs="Calibri" w:eastAsia="Calibri" w:hAnsi="Calibri"/>
+                <w:color w:val="000000"/>
+                <w:sz w:val="19"/>
+                <w:szCs w:val="19"/>
+              </w:rPr>
+              <w:t xml:space="preserve"/>
+            </w:r>
+          </w:p>
+        </w:tc>
+        <w:tc>
+          <w:tcPr>
+            <w:tcW w:type="dxa" w:w="7338"/>
+            <w:tcBorders>
+              <w:top w:val="single" w:color="B9C6E8" w:sz="6"/>
+              <w:left w:val="single" w:color="B9C6E8" w:sz="6"/>
+              <w:bottom w:val="single" w:color="B9C6E8" w:sz="6"/>
+              <w:right w:val="single" w:color="B9C6E8" w:sz="6"/>
+            </w:tcBorders>
+            <w:tcMar>
+              <w:top w:type="dxa" w:w="60"/>
+              <w:left w:type="dxa" w:w="120"/>
+              <w:bottom w:type="dxa" w:w="60"/>
+              <w:right w:type="dxa" w:w="120"/>
+            </w:tcMar>
+            <w:vAlign w:val="top"/>
+          </w:tcPr>
+          <w:p>
+            <w:pPr>
+              <w:spacing w:after="0" w:before="0"/>
+            </w:pPr>
+            <w:r>
+              <w:rPr>
+                <w:rFonts w:ascii="Calibri" w:cs="Calibri" w:eastAsia="Calibri" w:hAnsi="Calibri"/>
+                <w:color w:val="000000"/>
+                <w:sz w:val="17"/>
+                <w:szCs w:val="17"/>
+              </w:rPr>
+              <w:t xml:space="preserve">groß: Ahnung (Artikelprobe) · Komma vor dem Nebensatz (Verb am Ende)</w:t>
+            </w:r>
+          </w:p>
+        </w:tc>
+      </w:tr>
+    </w:tbl>
+    <w:p>
+      <w:pPr>
+        <w:spacing w:after="60" w:before="60"/>
+      </w:pPr>
+      <w:r>
+        <w:rPr>
+          <w:rFonts w:ascii="Calibri" w:cs="Calibri" w:eastAsia="Calibri" w:hAnsi="Calibri"/>
+          <w:i/>
+          <w:iCs/>
+          <w:color w:val="5B6B8C"/>
+          <w:sz w:val="17"/>
+          <w:szCs w:val="17"/>
+        </w:rPr>
+        <w:t xml:space="preserve">* Nachricht 1 machen Sie vor. Die Klasse korrigiert 2–6: 14 Fehler (9 × groß, 5 × Komma).</w:t>
+      </w:r>
+    </w:p>
     <w:p>
       <w:pPr>
         <w:pageBreakBefore/>
@@ -2497,26 +5662,6 @@
           <w:sz w:val="21"/>
           <w:szCs w:val="21"/>
         </w:rPr>
-        <w:t xml:space="preserve">Ein guter Blick hätte mir als Kind mehr geholfen als jede Drohung. </w:t>
-      </w:r>
-      <w:r>
-        <w:rPr>
-          <w:rFonts w:ascii="Calibri" w:cs="Calibri" w:eastAsia="Calibri" w:hAnsi="Calibri"/>
-          <w:b/>
-          <w:bCs/>
-          <w:color w:val="D9534F"/>
-          <w:sz w:val="16"/>
-          <w:szCs w:val="16"/>
-        </w:rPr>
-        <w:t xml:space="preserve">(4)  </w:t>
-      </w:r>
-      <w:r>
-        <w:rPr>
-          <w:rFonts w:ascii="Cambria" w:cs="Cambria" w:eastAsia="Cambria" w:hAnsi="Cambria"/>
-          <w:color w:val="000000"/>
-          <w:sz w:val="21"/>
-          <w:szCs w:val="21"/>
-        </w:rPr>
         <w:t xml:space="preserve">Ich wünsche mir, dass wir in Zukunft miteinander reden können, ohne dass einer von uns Angst haben muss. </w:t>
       </w:r>
       <w:r>
@@ -2581,16 +5726,16 @@
                 <w:sz w:val="18"/>
                 <w:szCs w:val="18"/>
               </w:rPr>
-              <w:t xml:space="preserve">Auftrag (Folie 7): </w:t>
-            </w:r>
-            <w:r>
-              <w:rPr>
-                <w:rFonts w:ascii="Calibri" w:cs="Calibri" w:eastAsia="Calibri" w:hAnsi="Calibri"/>
-                <w:color w:val="000000"/>
-                <w:sz w:val="18"/>
-                <w:szCs w:val="18"/>
-              </w:rPr>
-              <w:t xml:space="preserve">Max Brods Brief hat gewirkt: Hermann Kafka ist bereit, seinem Sohn zuzuhören. Schreibe die Rede, die Franz jetzt an seinen Vater hält.</w:t>
+              <w:t xml:space="preserve">Auftrag (Folie 15): </w:t>
+            </w:r>
+            <w:r>
+              <w:rPr>
+                <w:rFonts w:ascii="Calibri" w:cs="Calibri" w:eastAsia="Calibri" w:hAnsi="Calibri"/>
+                <w:color w:val="000000"/>
+                <w:sz w:val="18"/>
+                <w:szCs w:val="18"/>
+              </w:rPr>
+              <w:t xml:space="preserve">Max Brods Brief hat gewirkt: Der Vater hört zu. Schreibe die Rede, die Franz jetzt an ihn hält. (6–8 Sätze · allein · in den Hefter)</w:t>
             </w:r>
           </w:p>
           <w:p>

</xml_diff>

<commit_message>
Kafka-Appell: Änderungen der Lehrkraft an der Präsentation übernommen und gestalterisch angeglichen, Ablauf angepasst
Co-Authored-By: Claude Opus 5.5 <noreply@anthropic.com>
Claude-Session: https://claude.ai/code/session_01Kzh1oWiqhC6W8oSNq8mKnj
</commit_message>
<xml_diff>
--- a/Deutsch_11/Kafka_Appell/Tafelscript_Kafkas_Appell.docx
+++ b/Deutsch_11/Kafka_Appell/Tafelscript_Kafkas_Appell.docx
@@ -789,7 +789,7 @@
           <w:sz w:val="17"/>
           <w:szCs w:val="17"/>
         </w:rPr>
-        <w:t xml:space="preserve">TAFELSCRIPT · ABLAUF DER STUNDE (45 MIN.: 6 AUSWERTUNG + 39 KAFKA)</w:t>
+        <w:t xml:space="preserve">TAFELSCRIPT · ABLAUF DER STUNDE (45 MIN.: 5 AUSWERTUNG + 40 KAFKA)</w:t>
       </w:r>
     </w:p>
     <w:p>
@@ -821,7 +821,7 @@
           <w:sz w:val="18"/>
           <w:szCs w:val="18"/>
         </w:rPr>
-        <w:t xml:space="preserve">Teil 1: Auswertung des Briefs (Rechtschreibtraining entfällt, folgt in den nächsten Stunden). Teil 2 nach AVIVA, Arbeitsblatt nach dem Muster der Mentorin. Alle Folien in 27 pt.</w:t>
+        <w:t xml:space="preserve">Teil 1: Auswertung des Briefs. Teil 2 nach AVIVA, Aufgaben 1–3 Schritt für Schritt auf eigenen Folien. Alle Folien in 27 pt. Zeitlich eng: Die Rede wird begonnen und in der nächsten Stunde vorgetragen.</w:t>
       </w:r>
     </w:p>
     <w:tbl>
@@ -1230,7 +1230,7 @@
                 <w:sz w:val="18"/>
                 <w:szCs w:val="18"/>
               </w:rPr>
-              <w:t xml:space="preserve">2–6'</w:t>
+              <w:t xml:space="preserve">2–5'</w:t>
             </w:r>
           </w:p>
         </w:tc>
@@ -1297,7 +1297,7 @@
                 <w:sz w:val="18"/>
                 <w:szCs w:val="18"/>
               </w:rPr>
-              <w:t xml:space="preserve">Folie 3: Ø 14,5/20 Inhalt, 4,4/10 Sprache, 18,9/30 gesamt (Auswertung vom 08.10.; vorher mit Ihren endgültigen Punkten abgleichen). Lob zuerst (Beziehung, Metakommunikation), dann: Appell oft nur „Ich hoffe, ihr …“ → Teil 2. Folie 4: Rechtschreibung Ø 0,4/2, Zeichensetzung Ø 0,6/2 – Substantive groß, Komma vor dass (auch „Ich hoffe, ihr …“); Training folgt in den nächsten Stunden.</w:t>
+              <w:t xml:space="preserve">Folie 3: Ø 14,5/20 Inhalt, 4,4/10 Sprache, 18,9/30 gesamt (vorher mit Ihren endgültigen Punkten abgleichen). Lob zuerst, dann: Appell oft nur „Ich hoffe, ihr …“ → Teil 2. Folie 4: Rechtschreibung und Zeichensetzung, „Achtet schon heute beim Schreiben auf diese Fehlerquellen!“</w:t>
             </w:r>
           </w:p>
         </w:tc>
@@ -1401,7 +1401,7 @@
                 <w:sz w:val="18"/>
                 <w:szCs w:val="18"/>
               </w:rPr>
-              <w:t xml:space="preserve">6–8'</w:t>
+              <w:t xml:space="preserve">5–7'</w:t>
             </w:r>
           </w:p>
         </w:tc>
@@ -1468,7 +1468,7 @@
                 <w:sz w:val="18"/>
                 <w:szCs w:val="18"/>
               </w:rPr>
-              <w:t xml:space="preserve">Folie 5 (Verlauf, Teil 2), dann Folie 6: „Ich habe euch eben Rückmeldung gegeben. Was ist mein Appell an euch?“ – Rückfrage: offen oder versteckt? („Ich habe nur gesagt, was schlecht war.“)</w:t>
+              <w:t xml:space="preserve">Folie 5 (Verlauf, Teil 2), dann Folie 6: „Was ist mein Appell an euch?“ – offen oder versteckt?</w:t>
             </w:r>
           </w:p>
         </w:tc>
@@ -1572,7 +1572,7 @@
                 <w:sz w:val="18"/>
                 <w:szCs w:val="18"/>
               </w:rPr>
-              <w:t xml:space="preserve">8–13'</w:t>
+              <w:t xml:space="preserve">7–10'</w:t>
             </w:r>
           </w:p>
         </w:tc>
@@ -1639,7 +1639,7 @@
                 <w:sz w:val="18"/>
                 <w:szCs w:val="18"/>
               </w:rPr>
-              <w:t xml:space="preserve">Folie 7: verbal / paraverbal / nonverbal · vier Ohren · Inhalts- und Beziehungsebene. Folie 8: Beziehung Kafka–Vater gestört, Brods Brief → heute: Appell-Ebene.</w:t>
+              <w:t xml:space="preserve">Folie 7: drei Ebenen (verbal, paraverbal, nonverbal) · vier Ohren · Inhalts- und Beziehungsebene – Antworten an die Tafel.</w:t>
             </w:r>
           </w:p>
         </w:tc>
@@ -1703,7 +1703,7 @@
                 <w:sz w:val="17"/>
                 <w:szCs w:val="17"/>
               </w:rPr>
-              <w:t xml:space="preserve">Folie 7–8</w:t>
+              <w:t xml:space="preserve">Folie 7</w:t>
             </w:r>
           </w:p>
         </w:tc>
@@ -1743,7 +1743,7 @@
                 <w:sz w:val="18"/>
                 <w:szCs w:val="18"/>
               </w:rPr>
-              <w:t xml:space="preserve">13–16'</w:t>
+              <w:t xml:space="preserve">10–14'</w:t>
             </w:r>
           </w:p>
         </w:tc>
@@ -1778,7 +1778,7 @@
                 <w:sz w:val="18"/>
                 <w:szCs w:val="18"/>
               </w:rPr>
-              <w:t xml:space="preserve">I: Informieren</w:t>
+              <w:t xml:space="preserve">V: Kontextualisieren</w:t>
             </w:r>
           </w:p>
         </w:tc>
@@ -1810,7 +1810,7 @@
                 <w:sz w:val="18"/>
                 <w:szCs w:val="18"/>
               </w:rPr>
-              <w:t xml:space="preserve">Folie 9: Appell, offen, verdeckt (auch AB, Nr. 2). Kontext-Box vorlesen, dann den Auszug (Folie 10, AB).</w:t>
+              <w:t xml:space="preserve">Folie 8: „Mein Schreiben handelte von Dir …“ (S. 14) – kurz allein überlegen, dann im Gespräch. „Mein Schreiben“ meint Kafkas Bücher: Was er dem Vater nicht sagen kann, schreibt er. Folie 9: Beziehung gestört, Brods Brief → heute: Appell-Ebene.</w:t>
             </w:r>
           </w:p>
         </w:tc>
@@ -1842,7 +1842,7 @@
                 <w:sz w:val="18"/>
                 <w:szCs w:val="18"/>
               </w:rPr>
-              <w:t xml:space="preserve">–</w:t>
+              <w:t xml:space="preserve">① ergänzen</w:t>
             </w:r>
           </w:p>
         </w:tc>
@@ -1874,7 +1874,7 @@
                 <w:sz w:val="17"/>
                 <w:szCs w:val="17"/>
               </w:rPr>
-              <w:t xml:space="preserve">AB S. 1, Folie 9–10</w:t>
+              <w:t xml:space="preserve">Folie 8–9</w:t>
             </w:r>
           </w:p>
         </w:tc>
@@ -1914,7 +1914,7 @@
                 <w:sz w:val="18"/>
                 <w:szCs w:val="18"/>
               </w:rPr>
-              <w:t xml:space="preserve">16–25'</w:t>
+              <w:t xml:space="preserve">14–17'</w:t>
             </w:r>
           </w:p>
         </w:tc>
@@ -1949,7 +1949,7 @@
                 <w:sz w:val="18"/>
                 <w:szCs w:val="18"/>
               </w:rPr>
-              <w:t xml:space="preserve">V: Verarbeiten (allein)</w:t>
+              <w:t xml:space="preserve">I: Informieren</w:t>
             </w:r>
           </w:p>
         </w:tc>
@@ -1981,7 +1981,7 @@
                 <w:sz w:val="18"/>
                 <w:szCs w:val="18"/>
               </w:rPr>
-              <w:t xml:space="preserve">Aufgaben 1–3 (Folie 11), Timer 9 Min. Aufgaben 1–3 direkt auf dem AB (Schreiblinien). Hilfe zu Aufgabe 1: „Was soll der Vater nach diesem Satz anders machen?“</w:t>
+              <w:t xml:space="preserve">Folie 10: Appell, offen, verdeckt (auch AB, Nr. 2). Kontext-Box vorlesen, dann den Auszug (Folie 11, AB).</w:t>
             </w:r>
           </w:p>
         </w:tc>
@@ -2045,7 +2045,7 @@
                 <w:sz w:val="17"/>
                 <w:szCs w:val="17"/>
               </w:rPr>
-              <w:t xml:space="preserve">AB S. 1–2</w:t>
+              <w:t xml:space="preserve">AB S. 1, Folie 10–11</w:t>
             </w:r>
           </w:p>
         </w:tc>
@@ -2085,7 +2085,7 @@
                 <w:sz w:val="18"/>
                 <w:szCs w:val="18"/>
               </w:rPr>
-              <w:t xml:space="preserve">25–31'</w:t>
+              <w:t xml:space="preserve">17–20'</w:t>
             </w:r>
           </w:p>
         </w:tc>
@@ -2120,7 +2120,7 @@
                 <w:sz w:val="18"/>
                 <w:szCs w:val="18"/>
               </w:rPr>
-              <w:t xml:space="preserve">A: Auswerten</w:t>
+              <w:t xml:space="preserve">V: Aufgabe 1</w:t>
             </w:r>
           </w:p>
         </w:tc>
@@ -2152,7 +2152,7 @@
                 <w:sz w:val="18"/>
                 <w:szCs w:val="18"/>
               </w:rPr>
-              <w:t xml:space="preserve">Kernbotschaft anschreiben (②). Leitfragen der Reihe nach, Ergebnisse ins Quadrat, Appell zuletzt und groß (③). Formulierungshilfen (Folie 12): ganze Sätze. Reflexion (Folie 13) → Merksatz (④).</w:t>
+              <w:t xml:space="preserve">Folie 12: Kernbotschaft in einem Satz (3 Min.). Zwei Sätze vorlesen, den treffendsten anschreiben.</w:t>
             </w:r>
           </w:p>
         </w:tc>
@@ -2184,7 +2184,7 @@
                 <w:sz w:val="18"/>
                 <w:szCs w:val="18"/>
               </w:rPr>
-              <w:t xml:space="preserve">② ③ ④</w:t>
+              <w:t xml:space="preserve">② Kernbotschaft</w:t>
             </w:r>
           </w:p>
         </w:tc>
@@ -2216,7 +2216,7 @@
                 <w:sz w:val="17"/>
                 <w:szCs w:val="17"/>
               </w:rPr>
-              <w:t xml:space="preserve">Folie 12–13</w:t>
+              <w:t xml:space="preserve">Folie 12, AB</w:t>
             </w:r>
           </w:p>
         </w:tc>
@@ -2256,7 +2256,7 @@
                 <w:sz w:val="18"/>
                 <w:szCs w:val="18"/>
               </w:rPr>
-              <w:t xml:space="preserve">31–41'</w:t>
+              <w:t xml:space="preserve">20–26'</w:t>
             </w:r>
           </w:p>
         </w:tc>
@@ -2291,7 +2291,7 @@
                 <w:sz w:val="18"/>
                 <w:szCs w:val="18"/>
               </w:rPr>
-              <w:t xml:space="preserve">Transfer: Rede schreiben</w:t>
+              <w:t xml:space="preserve">V: Aufgabe 2</w:t>
             </w:r>
           </w:p>
         </w:tc>
@@ -2323,7 +2323,7 @@
                 <w:sz w:val="18"/>
                 <w:szCs w:val="18"/>
               </w:rPr>
-              <w:t xml:space="preserve">Folie 14 bzw. Whiteboard-PDF: Rede als Franz, Kriterien an die Tafel (⑤). Timer 10 Min. Hinweis: Substantive groß, Komma vor dass – auch bei „Ich hoffe, …“.</w:t>
+              <w:t xml:space="preserve">Folie 13: Leitfragen mit Zitat und Zeile, Formulierungshilfen auf der Folie (6 Min.). Kurz prüfen, bevor es weitergeht.</w:t>
             </w:r>
           </w:p>
         </w:tc>
@@ -2355,7 +2355,7 @@
                 <w:sz w:val="18"/>
                 <w:szCs w:val="18"/>
               </w:rPr>
-              <w:t xml:space="preserve">⑤ Kriterien</w:t>
+              <w:t xml:space="preserve">–</w:t>
             </w:r>
           </w:p>
         </w:tc>
@@ -2387,7 +2387,7 @@
                 <w:sz w:val="17"/>
                 <w:szCs w:val="17"/>
               </w:rPr>
-              <w:t xml:space="preserve">Folie 14 / Whiteboard</w:t>
+              <w:t xml:space="preserve">Folie 13, AB</w:t>
             </w:r>
           </w:p>
         </w:tc>
@@ -2427,7 +2427,7 @@
                 <w:sz w:val="18"/>
                 <w:szCs w:val="18"/>
               </w:rPr>
-              <w:t xml:space="preserve">41–45'</w:t>
+              <w:t xml:space="preserve">26–32'</w:t>
             </w:r>
           </w:p>
         </w:tc>
@@ -2462,7 +2462,7 @@
                 <w:sz w:val="18"/>
                 <w:szCs w:val="18"/>
               </w:rPr>
-              <w:t xml:space="preserve">Vortrag und Rückblick</w:t>
+              <w:t xml:space="preserve">V: Aufgabe 3</w:t>
             </w:r>
           </w:p>
         </w:tc>
@@ -2494,7 +2494,7 @@
                 <w:sz w:val="18"/>
                 <w:szCs w:val="18"/>
               </w:rPr>
-              <w:t xml:space="preserve">Ein bis zwei Reden ohne Unterbrechung, kurze Auswertung nach den Kriterien. Rückblick auf die Lernziele. Wer nicht fertig ist, schreibt nächste Stunde weiter – keine Hausaufgabe.</w:t>
+              <w:t xml:space="preserve">Folie 14: Kommunikationsquadrat, Fokus Appell (6 Min.).</w:t>
             </w:r>
           </w:p>
         </w:tc>
@@ -2558,7 +2558,349 @@
                 <w:sz w:val="17"/>
                 <w:szCs w:val="17"/>
               </w:rPr>
-              <w:t xml:space="preserve">Folie 14</w:t>
+              <w:t xml:space="preserve">Folie 14, AB</w:t>
+            </w:r>
+          </w:p>
+        </w:tc>
+      </w:tr>
+      <w:tr>
+        <w:trPr>
+          <w:cantSplit/>
+        </w:trPr>
+        <w:tc>
+          <w:tcPr>
+            <w:tcW w:type="dxa" w:w="950"/>
+            <w:tcBorders>
+              <w:top w:val="single" w:color="B9C6E8" w:sz="6"/>
+              <w:left w:val="single" w:color="B9C6E8" w:sz="6"/>
+              <w:bottom w:val="single" w:color="B9C6E8" w:sz="6"/>
+              <w:right w:val="single" w:color="B9C6E8" w:sz="6"/>
+            </w:tcBorders>
+            <w:shd w:fill="F4F7FD" w:color="auto" w:val="clear"/>
+            <w:tcMar>
+              <w:top w:type="dxa" w:w="60"/>
+              <w:left w:type="dxa" w:w="120"/>
+              <w:bottom w:type="dxa" w:w="60"/>
+              <w:right w:type="dxa" w:w="120"/>
+            </w:tcMar>
+            <w:vAlign w:val="top"/>
+          </w:tcPr>
+          <w:p>
+            <w:pPr>
+              <w:spacing w:after="0" w:before="0"/>
+            </w:pPr>
+            <w:r>
+              <w:rPr>
+                <w:rFonts w:ascii="Calibri" w:cs="Calibri" w:eastAsia="Calibri" w:hAnsi="Calibri"/>
+                <w:b/>
+                <w:bCs/>
+                <w:color w:val="1E2761"/>
+                <w:sz w:val="18"/>
+                <w:szCs w:val="18"/>
+              </w:rPr>
+              <w:t xml:space="preserve">32–38'</w:t>
+            </w:r>
+          </w:p>
+        </w:tc>
+        <w:tc>
+          <w:tcPr>
+            <w:tcW w:type="dxa" w:w="2350"/>
+            <w:tcBorders>
+              <w:top w:val="single" w:color="B9C6E8" w:sz="6"/>
+              <w:left w:val="single" w:color="B9C6E8" w:sz="6"/>
+              <w:bottom w:val="single" w:color="B9C6E8" w:sz="6"/>
+              <w:right w:val="single" w:color="B9C6E8" w:sz="6"/>
+            </w:tcBorders>
+            <w:shd w:fill="F4F7FD" w:color="auto" w:val="clear"/>
+            <w:tcMar>
+              <w:top w:type="dxa" w:w="60"/>
+              <w:left w:type="dxa" w:w="120"/>
+              <w:bottom w:type="dxa" w:w="60"/>
+              <w:right w:type="dxa" w:w="120"/>
+            </w:tcMar>
+            <w:vAlign w:val="top"/>
+          </w:tcPr>
+          <w:p>
+            <w:pPr>
+              <w:spacing w:after="0" w:before="0"/>
+            </w:pPr>
+            <w:r>
+              <w:rPr>
+                <w:rFonts w:ascii="Calibri" w:cs="Calibri" w:eastAsia="Calibri" w:hAnsi="Calibri"/>
+                <w:b/>
+                <w:bCs/>
+                <w:color w:val="1E2761"/>
+                <w:sz w:val="18"/>
+                <w:szCs w:val="18"/>
+              </w:rPr>
+              <w:t xml:space="preserve">A: Auswerten und Reflexion</w:t>
+            </w:r>
+          </w:p>
+        </w:tc>
+        <w:tc>
+          <w:tcPr>
+            <w:tcW w:type="dxa" w:w="6650"/>
+            <w:tcBorders>
+              <w:top w:val="single" w:color="B9C6E8" w:sz="6"/>
+              <w:left w:val="single" w:color="B9C6E8" w:sz="6"/>
+              <w:bottom w:val="single" w:color="B9C6E8" w:sz="6"/>
+              <w:right w:val="single" w:color="B9C6E8" w:sz="6"/>
+            </w:tcBorders>
+            <w:tcMar>
+              <w:top w:type="dxa" w:w="60"/>
+              <w:left w:type="dxa" w:w="120"/>
+              <w:bottom w:type="dxa" w:w="60"/>
+              <w:right w:type="dxa" w:w="120"/>
+            </w:tcMar>
+            <w:vAlign w:val="top"/>
+          </w:tcPr>
+          <w:p>
+            <w:pPr>
+              <w:spacing w:after="0" w:before="0"/>
+            </w:pPr>
+            <w:r>
+              <w:rPr>
+                <w:rFonts w:ascii="Calibri" w:cs="Calibri" w:eastAsia="Calibri" w:hAnsi="Calibri"/>
+                <w:color w:val="000000"/>
+                <w:sz w:val="18"/>
+                <w:szCs w:val="18"/>
+              </w:rPr>
+              <w:t xml:space="preserve">Leitfragen der Reihe nach, Ergebnisse ins Quadrat, Appell zuletzt und groß (③), ganze Sätze mit den Formulierungshilfen. Reflexion (Folie 15) → Merksatz (④). Rückblick auf die Lernziele.</w:t>
+            </w:r>
+          </w:p>
+        </w:tc>
+        <w:tc>
+          <w:tcPr>
+            <w:tcW w:type="dxa" w:w="2988"/>
+            <w:tcBorders>
+              <w:top w:val="single" w:color="B9C6E8" w:sz="6"/>
+              <w:left w:val="single" w:color="B9C6E8" w:sz="6"/>
+              <w:bottom w:val="single" w:color="B9C6E8" w:sz="6"/>
+              <w:right w:val="single" w:color="B9C6E8" w:sz="6"/>
+            </w:tcBorders>
+            <w:tcMar>
+              <w:top w:type="dxa" w:w="60"/>
+              <w:left w:type="dxa" w:w="120"/>
+              <w:bottom w:type="dxa" w:w="60"/>
+              <w:right w:type="dxa" w:w="120"/>
+            </w:tcMar>
+            <w:vAlign w:val="top"/>
+          </w:tcPr>
+          <w:p>
+            <w:pPr>
+              <w:spacing w:after="0" w:before="0"/>
+            </w:pPr>
+            <w:r>
+              <w:rPr>
+                <w:rFonts w:ascii="Calibri" w:cs="Calibri" w:eastAsia="Calibri" w:hAnsi="Calibri"/>
+                <w:color w:val="000000"/>
+                <w:sz w:val="18"/>
+                <w:szCs w:val="18"/>
+              </w:rPr>
+              <w:t xml:space="preserve">③ ④</w:t>
+            </w:r>
+          </w:p>
+        </w:tc>
+        <w:tc>
+          <w:tcPr>
+            <w:tcW w:type="dxa" w:w="2400"/>
+            <w:tcBorders>
+              <w:top w:val="single" w:color="B9C6E8" w:sz="6"/>
+              <w:left w:val="single" w:color="B9C6E8" w:sz="6"/>
+              <w:bottom w:val="single" w:color="B9C6E8" w:sz="6"/>
+              <w:right w:val="single" w:color="B9C6E8" w:sz="6"/>
+            </w:tcBorders>
+            <w:tcMar>
+              <w:top w:type="dxa" w:w="60"/>
+              <w:left w:type="dxa" w:w="120"/>
+              <w:bottom w:type="dxa" w:w="60"/>
+              <w:right w:type="dxa" w:w="120"/>
+            </w:tcMar>
+            <w:vAlign w:val="top"/>
+          </w:tcPr>
+          <w:p>
+            <w:pPr>
+              <w:spacing w:after="0" w:before="0"/>
+            </w:pPr>
+            <w:r>
+              <w:rPr>
+                <w:rFonts w:ascii="Calibri" w:cs="Calibri" w:eastAsia="Calibri" w:hAnsi="Calibri"/>
+                <w:color w:val="5B6B8C"/>
+                <w:sz w:val="17"/>
+                <w:szCs w:val="17"/>
+              </w:rPr>
+              <w:t xml:space="preserve">Folie 13–15</w:t>
+            </w:r>
+          </w:p>
+        </w:tc>
+      </w:tr>
+      <w:tr>
+        <w:trPr>
+          <w:cantSplit/>
+        </w:trPr>
+        <w:tc>
+          <w:tcPr>
+            <w:tcW w:type="dxa" w:w="950"/>
+            <w:tcBorders>
+              <w:top w:val="single" w:color="B9C6E8" w:sz="6"/>
+              <w:left w:val="single" w:color="B9C6E8" w:sz="6"/>
+              <w:bottom w:val="single" w:color="B9C6E8" w:sz="6"/>
+              <w:right w:val="single" w:color="B9C6E8" w:sz="6"/>
+            </w:tcBorders>
+            <w:shd w:fill="F4F7FD" w:color="auto" w:val="clear"/>
+            <w:tcMar>
+              <w:top w:type="dxa" w:w="60"/>
+              <w:left w:type="dxa" w:w="120"/>
+              <w:bottom w:type="dxa" w:w="60"/>
+              <w:right w:type="dxa" w:w="120"/>
+            </w:tcMar>
+            <w:vAlign w:val="top"/>
+          </w:tcPr>
+          <w:p>
+            <w:pPr>
+              <w:spacing w:after="0" w:before="0"/>
+            </w:pPr>
+            <w:r>
+              <w:rPr>
+                <w:rFonts w:ascii="Calibri" w:cs="Calibri" w:eastAsia="Calibri" w:hAnsi="Calibri"/>
+                <w:b/>
+                <w:bCs/>
+                <w:color w:val="1E2761"/>
+                <w:sz w:val="18"/>
+                <w:szCs w:val="18"/>
+              </w:rPr>
+              <w:t xml:space="preserve">38–45'</w:t>
+            </w:r>
+          </w:p>
+        </w:tc>
+        <w:tc>
+          <w:tcPr>
+            <w:tcW w:type="dxa" w:w="2350"/>
+            <w:tcBorders>
+              <w:top w:val="single" w:color="B9C6E8" w:sz="6"/>
+              <w:left w:val="single" w:color="B9C6E8" w:sz="6"/>
+              <w:bottom w:val="single" w:color="B9C6E8" w:sz="6"/>
+              <w:right w:val="single" w:color="B9C6E8" w:sz="6"/>
+            </w:tcBorders>
+            <w:shd w:fill="F4F7FD" w:color="auto" w:val="clear"/>
+            <w:tcMar>
+              <w:top w:type="dxa" w:w="60"/>
+              <w:left w:type="dxa" w:w="120"/>
+              <w:bottom w:type="dxa" w:w="60"/>
+              <w:right w:type="dxa" w:w="120"/>
+            </w:tcMar>
+            <w:vAlign w:val="top"/>
+          </w:tcPr>
+          <w:p>
+            <w:pPr>
+              <w:spacing w:after="0" w:before="0"/>
+            </w:pPr>
+            <w:r>
+              <w:rPr>
+                <w:rFonts w:ascii="Calibri" w:cs="Calibri" w:eastAsia="Calibri" w:hAnsi="Calibri"/>
+                <w:b/>
+                <w:bCs/>
+                <w:color w:val="1E2761"/>
+                <w:sz w:val="18"/>
+                <w:szCs w:val="18"/>
+              </w:rPr>
+              <w:t xml:space="preserve">Transfer: Rede beginnen</w:t>
+            </w:r>
+          </w:p>
+        </w:tc>
+        <w:tc>
+          <w:tcPr>
+            <w:tcW w:type="dxa" w:w="6650"/>
+            <w:tcBorders>
+              <w:top w:val="single" w:color="B9C6E8" w:sz="6"/>
+              <w:left w:val="single" w:color="B9C6E8" w:sz="6"/>
+              <w:bottom w:val="single" w:color="B9C6E8" w:sz="6"/>
+              <w:right w:val="single" w:color="B9C6E8" w:sz="6"/>
+            </w:tcBorders>
+            <w:tcMar>
+              <w:top w:type="dxa" w:w="60"/>
+              <w:left w:type="dxa" w:w="120"/>
+              <w:bottom w:type="dxa" w:w="60"/>
+              <w:right w:type="dxa" w:w="120"/>
+            </w:tcMar>
+            <w:vAlign w:val="top"/>
+          </w:tcPr>
+          <w:p>
+            <w:pPr>
+              <w:spacing w:after="0" w:before="0"/>
+            </w:pPr>
+            <w:r>
+              <w:rPr>
+                <w:rFonts w:ascii="Calibri" w:cs="Calibri" w:eastAsia="Calibri" w:hAnsi="Calibri"/>
+                <w:color w:val="000000"/>
+                <w:sz w:val="18"/>
+                <w:szCs w:val="18"/>
+              </w:rPr>
+              <w:t xml:space="preserve">Folie 16 bzw. Whiteboard-PDF: Rede als Franz, Kriterien an die Tafel (⑤). In der Stunde beginnen; Vortrag und Auswertung nach den Kriterien in der nächsten Stunde – keine Hausaufgabe.</w:t>
+            </w:r>
+          </w:p>
+        </w:tc>
+        <w:tc>
+          <w:tcPr>
+            <w:tcW w:type="dxa" w:w="2988"/>
+            <w:tcBorders>
+              <w:top w:val="single" w:color="B9C6E8" w:sz="6"/>
+              <w:left w:val="single" w:color="B9C6E8" w:sz="6"/>
+              <w:bottom w:val="single" w:color="B9C6E8" w:sz="6"/>
+              <w:right w:val="single" w:color="B9C6E8" w:sz="6"/>
+            </w:tcBorders>
+            <w:tcMar>
+              <w:top w:type="dxa" w:w="60"/>
+              <w:left w:type="dxa" w:w="120"/>
+              <w:bottom w:type="dxa" w:w="60"/>
+              <w:right w:type="dxa" w:w="120"/>
+            </w:tcMar>
+            <w:vAlign w:val="top"/>
+          </w:tcPr>
+          <w:p>
+            <w:pPr>
+              <w:spacing w:after="0" w:before="0"/>
+            </w:pPr>
+            <w:r>
+              <w:rPr>
+                <w:rFonts w:ascii="Calibri" w:cs="Calibri" w:eastAsia="Calibri" w:hAnsi="Calibri"/>
+                <w:color w:val="000000"/>
+                <w:sz w:val="18"/>
+                <w:szCs w:val="18"/>
+              </w:rPr>
+              <w:t xml:space="preserve">⑤ Kriterien</w:t>
+            </w:r>
+          </w:p>
+        </w:tc>
+        <w:tc>
+          <w:tcPr>
+            <w:tcW w:type="dxa" w:w="2400"/>
+            <w:tcBorders>
+              <w:top w:val="single" w:color="B9C6E8" w:sz="6"/>
+              <w:left w:val="single" w:color="B9C6E8" w:sz="6"/>
+              <w:bottom w:val="single" w:color="B9C6E8" w:sz="6"/>
+              <w:right w:val="single" w:color="B9C6E8" w:sz="6"/>
+            </w:tcBorders>
+            <w:tcMar>
+              <w:top w:type="dxa" w:w="60"/>
+              <w:left w:type="dxa" w:w="120"/>
+              <w:bottom w:type="dxa" w:w="60"/>
+              <w:right w:type="dxa" w:w="120"/>
+            </w:tcMar>
+            <w:vAlign w:val="top"/>
+          </w:tcPr>
+          <w:p>
+            <w:pPr>
+              <w:spacing w:after="0" w:before="0"/>
+            </w:pPr>
+            <w:r>
+              <w:rPr>
+                <w:rFonts w:ascii="Calibri" w:cs="Calibri" w:eastAsia="Calibri" w:hAnsi="Calibri"/>
+                <w:color w:val="5B6B8C"/>
+                <w:sz w:val="17"/>
+                <w:szCs w:val="17"/>
+              </w:rPr>
+              <w:t xml:space="preserve">Folie 16 / Whiteboard</w:t>
             </w:r>
           </w:p>
         </w:tc>
@@ -3186,7 +3528,7 @@
                 <w:sz w:val="18"/>
                 <w:szCs w:val="18"/>
               </w:rPr>
-              <w:t xml:space="preserve">Auftrag (AB Aufgabe 5, Folie 14): </w:t>
+              <w:t xml:space="preserve">Auftrag (AB Aufgabe 5, Folie 16): </w:t>
             </w:r>
             <w:r>
               <w:rPr>

</xml_diff>